<commit_message>
Moved camera over to using command server
- setup connection to NAS
- removed http endpoint code
</commit_message>
<xml_diff>
--- a/Docs/Rocha Innovation Brief.docx
+++ b/Docs/Rocha Innovation Brief.docx
@@ -29,6 +29,7 @@
           <w:szCs w:val="48"/>
         </w:rPr>
       </w:pPr>
+      <w:proofErr w:type="spellStart"/>
       <w:r>
         <w:rPr>
           <w:rFonts w:ascii="Times New Roman" w:eastAsia="Times New Roman" w:hAnsi="Times New Roman" w:cs="Times New Roman"/>
@@ -38,6 +39,7 @@
         </w:rPr>
         <w:t>SoilSpirit</w:t>
       </w:r>
+      <w:proofErr w:type="spellEnd"/>
     </w:p>
     <w:p>
       <w:pPr>
@@ -280,7 +282,7 @@
           <w:sz w:val="28"/>
           <w:szCs w:val="28"/>
         </w:rPr>
-        <w:t>1</w:t>
+        <w:t>3</w:t>
       </w:r>
       <w:r>
         <w:rPr>
@@ -442,7 +444,25 @@
           <w:sz w:val="24"/>
           <w:szCs w:val="24"/>
         </w:rPr>
-        <w:t>put into this layer of material. It leads to healthy plants and soil, reduces weeds, and allows for better water conditions for the plants (Dowding, 2024). SoilSpirit plans to reduce the physical strain on small farms and gardeners through the automation of compost and seed spreading. While also having a small enough footprint that it does not compact the soil or cause unwanted tilling/digging of the compost. It takes inspiration from simple autonomous vehicles for obstacle avoidance and the Mars rovers (Spirit, Curiosity, Perseverance) for its rocker-bogie suspension system.</w:t>
+        <w:t xml:space="preserve">put into this layer of material. It leads to healthy plants and soil, reduces weeds, and allows for better water conditions for the plants (Dowding, 2024). </w:t>
+      </w:r>
+      <w:proofErr w:type="spellStart"/>
+      <w:r>
+        <w:rPr>
+          <w:rFonts w:ascii="Times New Roman" w:eastAsia="Times New Roman" w:hAnsi="Times New Roman" w:cs="Times New Roman"/>
+          <w:sz w:val="24"/>
+          <w:szCs w:val="24"/>
+        </w:rPr>
+        <w:t>SoilSpirit</w:t>
+      </w:r>
+      <w:proofErr w:type="spellEnd"/>
+      <w:r>
+        <w:rPr>
+          <w:rFonts w:ascii="Times New Roman" w:eastAsia="Times New Roman" w:hAnsi="Times New Roman" w:cs="Times New Roman"/>
+          <w:sz w:val="24"/>
+          <w:szCs w:val="24"/>
+        </w:rPr>
+        <w:t xml:space="preserve"> plans to reduce the physical strain on small farms and gardeners through the automation of compost and seed spreading. While also having a small enough footprint that it does not compact the soil or cause unwanted tilling/digging of the compost. It takes inspiration from simple autonomous vehicles for obstacle avoidance and the Mars rovers (Spirit, Curiosity, Perseverance) for its rocker-bogie suspension system.</w:t>
       </w:r>
     </w:p>
     <w:p>
@@ -468,8 +488,27 @@
           <w:sz w:val="24"/>
           <w:szCs w:val="24"/>
         </w:rPr>
-        <w:t xml:space="preserve">The design of the product was heavily influenced by the Mars rovers and the 3d models of the initial prototype come from the Instructables tutorial in </w:t>
-      </w:r>
+        <w:t xml:space="preserve">The design of the product was heavily influenced by the Mars rovers and the 3d models of the initial prototype come from the </w:t>
+      </w:r>
+      <w:proofErr w:type="spellStart"/>
+      <w:r>
+        <w:rPr>
+          <w:rFonts w:ascii="Times New Roman" w:hAnsi="Times New Roman" w:cs="Times New Roman"/>
+          <w:sz w:val="24"/>
+          <w:szCs w:val="24"/>
+        </w:rPr>
+        <w:t>Instructables</w:t>
+      </w:r>
+      <w:proofErr w:type="spellEnd"/>
+      <w:r>
+        <w:rPr>
+          <w:rFonts w:ascii="Times New Roman" w:hAnsi="Times New Roman" w:cs="Times New Roman"/>
+          <w:sz w:val="24"/>
+          <w:szCs w:val="24"/>
+        </w:rPr>
+        <w:t xml:space="preserve"> tutorial in </w:t>
+      </w:r>
+      <w:proofErr w:type="spellStart"/>
       <w:r>
         <w:rPr>
           <w:rFonts w:ascii="Times New Roman" w:hAnsi="Times New Roman" w:cs="Times New Roman"/>
@@ -490,6 +529,7 @@
         </w:rPr>
         <w:t>C</w:t>
       </w:r>
+      <w:proofErr w:type="spellEnd"/>
       <w:r>
         <w:rPr>
           <w:rFonts w:ascii="Times New Roman" w:hAnsi="Times New Roman" w:cs="Times New Roman"/>
@@ -522,7 +562,25 @@
           <w:sz w:val="24"/>
           <w:szCs w:val="24"/>
         </w:rPr>
-        <w:t xml:space="preserve">direct iteration of the Rocker Bogie Mechanism popularized by the Mars rovers Curiosity and Perseverance. As for similar products, the closest to my idea is an autonomous spreader built by Raven Industries. It is an industrial vehicle that is autonomous. It is great for automation for large scale farms but would not benefit gardeners, homesteaders, and small-scale farms wanting to use no dig gardening. Another similar product that is of the same form factor/user is FarmBot. A CNC based garden bed that automates the process of growing food entirely. This company will be a direct competitor with the main difference being our modes of distribution. Their machine is directly attached to a garden bed whereas mine can drive around and be used for different types of gardens, farms, and homesteads. </w:t>
+        <w:t xml:space="preserve">direct iteration of the Rocker Bogie Mechanism popularized by the Mars rovers Curiosity and Perseverance. As for similar products, the closest to my idea is an autonomous spreader built by Raven Industries. It is an industrial vehicle that is autonomous. It is great for automation for large scale farms but would not benefit gardeners, homesteaders, and small-scale farms wanting to use no dig gardening. Another similar product that is of the same form factor/user is </w:t>
+      </w:r>
+      <w:proofErr w:type="spellStart"/>
+      <w:r>
+        <w:rPr>
+          <w:rFonts w:ascii="Times New Roman" w:hAnsi="Times New Roman" w:cs="Times New Roman"/>
+          <w:sz w:val="24"/>
+          <w:szCs w:val="24"/>
+        </w:rPr>
+        <w:t>FarmBot</w:t>
+      </w:r>
+      <w:proofErr w:type="spellEnd"/>
+      <w:r>
+        <w:rPr>
+          <w:rFonts w:ascii="Times New Roman" w:hAnsi="Times New Roman" w:cs="Times New Roman"/>
+          <w:sz w:val="24"/>
+          <w:szCs w:val="24"/>
+        </w:rPr>
+        <w:t xml:space="preserve">. A CNC based garden bed that automates the process of growing food entirely. This company will be a direct competitor with the main difference being our modes of distribution. Their machine is directly attached to a garden bed whereas mine can drive around and be used for different types of gardens, farms, and homesteads. </w:t>
       </w:r>
     </w:p>
     <w:p>
@@ -916,7 +974,27 @@
           <w:sz w:val="24"/>
           <w:szCs w:val="24"/>
         </w:rPr>
-        <w:t>Changed to 3 L298N(using 2 added complications to the circuit and power management)</w:t>
+        <w:t>Changed to 3 L298</w:t>
+      </w:r>
+      <w:proofErr w:type="gramStart"/>
+      <w:r>
+        <w:rPr>
+          <w:rFonts w:ascii="Times New Roman" w:eastAsia="Times New Roman" w:hAnsi="Times New Roman" w:cs="Times New Roman"/>
+          <w:color w:val="FF0000"/>
+          <w:sz w:val="24"/>
+          <w:szCs w:val="24"/>
+        </w:rPr>
+        <w:t>N(</w:t>
+      </w:r>
+      <w:proofErr w:type="gramEnd"/>
+      <w:r>
+        <w:rPr>
+          <w:rFonts w:ascii="Times New Roman" w:eastAsia="Times New Roman" w:hAnsi="Times New Roman" w:cs="Times New Roman"/>
+          <w:color w:val="FF0000"/>
+          <w:sz w:val="24"/>
+          <w:szCs w:val="24"/>
+        </w:rPr>
+        <w:t>using 2 added complications to the circuit and power management)</w:t>
       </w:r>
     </w:p>
     <w:p>
@@ -1205,6 +1283,7 @@
           <w:szCs w:val="24"/>
         </w:rPr>
       </w:pPr>
+      <w:proofErr w:type="spellStart"/>
       <w:r>
         <w:rPr>
           <w:rFonts w:ascii="Times New Roman" w:eastAsia="Times New Roman" w:hAnsi="Times New Roman" w:cs="Times New Roman"/>
@@ -1219,7 +1298,16 @@
           <w:sz w:val="24"/>
           <w:szCs w:val="24"/>
         </w:rPr>
-        <w:t>oilSpirit will be the first adaptation of Mars rover rocker-bogie suspension for agriculture and will make automation accessible to more people. On top of that it promotes a sustainable agricultural practice in making non-dig farming easier. Lastly, the incorporation of computer vision in a non-experimental realm will lead to this device being more robust and intelligent than most small-scale autonomous systems.</w:t>
+        <w:t>oilSpirit</w:t>
+      </w:r>
+      <w:proofErr w:type="spellEnd"/>
+      <w:r>
+        <w:rPr>
+          <w:rFonts w:ascii="Times New Roman" w:eastAsia="Times New Roman" w:hAnsi="Times New Roman" w:cs="Times New Roman"/>
+          <w:sz w:val="24"/>
+          <w:szCs w:val="24"/>
+        </w:rPr>
+        <w:t xml:space="preserve"> will be the first adaptation of Mars rover rocker-bogie suspension for agriculture and will make automation accessible to more people. On top of that it promotes a sustainable agricultural practice in making non-dig farming easier. Lastly, the incorporation of computer vision in a non-experimental realm will lead to this device being more robust and intelligent than most small-scale autonomous systems.</w:t>
       </w:r>
     </w:p>
     <w:p>
@@ -1288,7 +1376,25 @@
           <w:sz w:val="24"/>
           <w:szCs w:val="24"/>
         </w:rPr>
-        <w:t xml:space="preserve">gardeners, homesteaders, and small farm owners who are interested in no-dig farming or already practice it. However, this system could easily be extended including </w:t>
+        <w:t xml:space="preserve">gardeners, homesteaders, and small farm owners who are interested in </w:t>
+      </w:r>
+      <w:proofErr w:type="gramStart"/>
+      <w:r>
+        <w:rPr>
+          <w:rFonts w:ascii="Times New Roman" w:eastAsia="Times New Roman" w:hAnsi="Times New Roman" w:cs="Times New Roman"/>
+          <w:sz w:val="24"/>
+          <w:szCs w:val="24"/>
+        </w:rPr>
+        <w:t>no</w:t>
+      </w:r>
+      <w:proofErr w:type="gramEnd"/>
+      <w:r>
+        <w:rPr>
+          <w:rFonts w:ascii="Times New Roman" w:eastAsia="Times New Roman" w:hAnsi="Times New Roman" w:cs="Times New Roman"/>
+          <w:sz w:val="24"/>
+          <w:szCs w:val="24"/>
+        </w:rPr>
+        <w:t xml:space="preserve">-dig farming or already practice it. However, this system could easily be extended including </w:t>
       </w:r>
       <w:r>
         <w:rPr>
@@ -1336,7 +1442,45 @@
           <w:sz w:val="24"/>
           <w:szCs w:val="24"/>
         </w:rPr>
-        <w:t>this may very well become integrated with future iterations of rovers and space vehicles. Technology inspired by SoilSpirit could possibly be used for farming on other planets, if we ever get there, or as small-scale versions of the Mars rovers that are more accessible for smaller companies. SoilSpirit could also extend into disaster recovery and reconnaissance. A scaled-up version of this rover could be used for search and rescue, area mapping, and debris clearing.</w:t>
+        <w:t xml:space="preserve">this may very well become integrated with future iterations of rovers and space vehicles. Technology inspired by </w:t>
+      </w:r>
+      <w:proofErr w:type="spellStart"/>
+      <w:r>
+        <w:rPr>
+          <w:rFonts w:ascii="Times New Roman" w:eastAsia="Times New Roman" w:hAnsi="Times New Roman" w:cs="Times New Roman"/>
+          <w:sz w:val="24"/>
+          <w:szCs w:val="24"/>
+        </w:rPr>
+        <w:t>SoilSpirit</w:t>
+      </w:r>
+      <w:proofErr w:type="spellEnd"/>
+      <w:r>
+        <w:rPr>
+          <w:rFonts w:ascii="Times New Roman" w:eastAsia="Times New Roman" w:hAnsi="Times New Roman" w:cs="Times New Roman"/>
+          <w:sz w:val="24"/>
+          <w:szCs w:val="24"/>
+        </w:rPr>
+        <w:t xml:space="preserve"> could possibly be used for farming on other planets, if we ever get there, or as small-scale versions of the Mars rovers that are more accessible for smaller companies. </w:t>
+      </w:r>
+      <w:proofErr w:type="spellStart"/>
+      <w:proofErr w:type="gramStart"/>
+      <w:r>
+        <w:rPr>
+          <w:rFonts w:ascii="Times New Roman" w:eastAsia="Times New Roman" w:hAnsi="Times New Roman" w:cs="Times New Roman"/>
+          <w:sz w:val="24"/>
+          <w:szCs w:val="24"/>
+        </w:rPr>
+        <w:t>SoilSpirit</w:t>
+      </w:r>
+      <w:proofErr w:type="spellEnd"/>
+      <w:proofErr w:type="gramEnd"/>
+      <w:r>
+        <w:rPr>
+          <w:rFonts w:ascii="Times New Roman" w:eastAsia="Times New Roman" w:hAnsi="Times New Roman" w:cs="Times New Roman"/>
+          <w:sz w:val="24"/>
+          <w:szCs w:val="24"/>
+        </w:rPr>
+        <w:t xml:space="preserve"> could also extend into disaster recovery and reconnaissance. A scaled-up version of this rover could be used for search and rescue, area mapping, and debris clearing.</w:t>
       </w:r>
       <w:r>
         <w:rPr>
@@ -2346,16 +2490,36 @@
           <w:sz w:val="24"/>
           <w:szCs w:val="24"/>
         </w:rPr>
-        <w:t>(DONE 2/2</w:t>
-      </w:r>
-      <w:r>
-        <w:rPr>
-          <w:rFonts w:ascii="Times New Roman" w:eastAsia="Times New Roman" w:hAnsi="Times New Roman" w:cs="Times New Roman"/>
-          <w:color w:val="FF0000"/>
-          <w:sz w:val="24"/>
-          <w:szCs w:val="24"/>
-        </w:rPr>
-        <w:t>2-2/24</w:t>
+        <w:t>(DONE 2/</w:t>
+      </w:r>
+      <w:proofErr w:type="gramStart"/>
+      <w:r>
+        <w:rPr>
+          <w:rFonts w:ascii="Times New Roman" w:eastAsia="Times New Roman" w:hAnsi="Times New Roman" w:cs="Times New Roman"/>
+          <w:color w:val="FF0000"/>
+          <w:sz w:val="24"/>
+          <w:szCs w:val="24"/>
+        </w:rPr>
+        <w:t>2</w:t>
+      </w:r>
+      <w:r>
+        <w:rPr>
+          <w:rFonts w:ascii="Times New Roman" w:eastAsia="Times New Roman" w:hAnsi="Times New Roman" w:cs="Times New Roman"/>
+          <w:color w:val="FF0000"/>
+          <w:sz w:val="24"/>
+          <w:szCs w:val="24"/>
+        </w:rPr>
+        <w:t>2</w:t>
+      </w:r>
+      <w:proofErr w:type="gramEnd"/>
+      <w:r>
+        <w:rPr>
+          <w:rFonts w:ascii="Times New Roman" w:eastAsia="Times New Roman" w:hAnsi="Times New Roman" w:cs="Times New Roman"/>
+          <w:color w:val="FF0000"/>
+          <w:sz w:val="24"/>
+          <w:szCs w:val="24"/>
+        </w:rPr>
+        <w:t>-2/24</w:t>
       </w:r>
       <w:r>
         <w:rPr>
@@ -2626,7 +2790,27 @@
           <w:sz w:val="24"/>
           <w:szCs w:val="24"/>
         </w:rPr>
-        <w:t>, Changed from USART to wireless due to camera already calling LLM API(2/26/25)</w:t>
+        <w:t xml:space="preserve">, Changed from USART to wireless due to camera already calling LLM </w:t>
+      </w:r>
+      <w:proofErr w:type="gramStart"/>
+      <w:r>
+        <w:rPr>
+          <w:rFonts w:ascii="Times New Roman" w:eastAsia="Times New Roman" w:hAnsi="Times New Roman" w:cs="Times New Roman"/>
+          <w:color w:val="FF0000"/>
+          <w:sz w:val="24"/>
+          <w:szCs w:val="24"/>
+        </w:rPr>
+        <w:t>API(</w:t>
+      </w:r>
+      <w:proofErr w:type="gramEnd"/>
+      <w:r>
+        <w:rPr>
+          <w:rFonts w:ascii="Times New Roman" w:eastAsia="Times New Roman" w:hAnsi="Times New Roman" w:cs="Times New Roman"/>
+          <w:color w:val="FF0000"/>
+          <w:sz w:val="24"/>
+          <w:szCs w:val="24"/>
+        </w:rPr>
+        <w:t>2/26/25)</w:t>
       </w:r>
     </w:p>
     <w:p>
@@ -2649,7 +2833,16 @@
           <w:sz w:val="24"/>
           <w:szCs w:val="24"/>
         </w:rPr>
-        <w:t xml:space="preserve">Test detection of different objects, conditions, and distances </w:t>
+        <w:t xml:space="preserve">Test detection of different objects, conditions, and </w:t>
+      </w:r>
+      <w:proofErr w:type="gramStart"/>
+      <w:r>
+        <w:rPr>
+          <w:rFonts w:ascii="Times New Roman" w:eastAsia="Times New Roman" w:hAnsi="Times New Roman" w:cs="Times New Roman"/>
+          <w:sz w:val="24"/>
+          <w:szCs w:val="24"/>
+        </w:rPr>
+        <w:t xml:space="preserve">distances </w:t>
       </w:r>
       <w:r>
         <w:rPr>
@@ -2666,7 +2859,17 @@
           <w:sz w:val="24"/>
           <w:szCs w:val="24"/>
         </w:rPr>
-        <w:t>(DONE 2/2</w:t>
+        <w:t>(</w:t>
+      </w:r>
+      <w:proofErr w:type="gramEnd"/>
+      <w:r>
+        <w:rPr>
+          <w:rFonts w:ascii="Times New Roman" w:eastAsia="Times New Roman" w:hAnsi="Times New Roman" w:cs="Times New Roman"/>
+          <w:color w:val="FF0000"/>
+          <w:sz w:val="24"/>
+          <w:szCs w:val="24"/>
+        </w:rPr>
+        <w:t>DONE 2/2</w:t>
       </w:r>
       <w:r>
         <w:rPr>
@@ -2753,16 +2956,35 @@
           <w:sz w:val="24"/>
           <w:szCs w:val="24"/>
         </w:rPr>
-        <w:t>ON/OFF/start/stop/left/right commands from motor control system interface</w:t>
-      </w:r>
-      <w:r>
-        <w:rPr>
-          <w:rFonts w:ascii="Times New Roman" w:eastAsia="Times New Roman" w:hAnsi="Times New Roman" w:cs="Times New Roman"/>
-          <w:color w:val="FF0000"/>
-          <w:sz w:val="24"/>
-          <w:szCs w:val="24"/>
-        </w:rPr>
-        <w:t>(DONE 2/28)</w:t>
+        <w:t xml:space="preserve">ON/OFF/start/stop/left/right commands from motor control system </w:t>
+      </w:r>
+      <w:proofErr w:type="gramStart"/>
+      <w:r>
+        <w:rPr>
+          <w:rFonts w:ascii="Times New Roman" w:eastAsia="Times New Roman" w:hAnsi="Times New Roman" w:cs="Times New Roman"/>
+          <w:sz w:val="24"/>
+          <w:szCs w:val="24"/>
+        </w:rPr>
+        <w:t>interface</w:t>
+      </w:r>
+      <w:r>
+        <w:rPr>
+          <w:rFonts w:ascii="Times New Roman" w:eastAsia="Times New Roman" w:hAnsi="Times New Roman" w:cs="Times New Roman"/>
+          <w:color w:val="FF0000"/>
+          <w:sz w:val="24"/>
+          <w:szCs w:val="24"/>
+        </w:rPr>
+        <w:t>(</w:t>
+      </w:r>
+      <w:proofErr w:type="gramEnd"/>
+      <w:r>
+        <w:rPr>
+          <w:rFonts w:ascii="Times New Roman" w:eastAsia="Times New Roman" w:hAnsi="Times New Roman" w:cs="Times New Roman"/>
+          <w:color w:val="FF0000"/>
+          <w:sz w:val="24"/>
+          <w:szCs w:val="24"/>
+        </w:rPr>
+        <w:t>DONE 2/28)</w:t>
       </w:r>
     </w:p>
     <w:p>
@@ -2785,16 +3007,35 @@
           <w:sz w:val="24"/>
           <w:szCs w:val="24"/>
         </w:rPr>
-        <w:t>Setup start/stop commands from ESP32 camera that a user can send to start autonomous control</w:t>
-      </w:r>
-      <w:r>
-        <w:rPr>
-          <w:rFonts w:ascii="Times New Roman" w:eastAsia="Times New Roman" w:hAnsi="Times New Roman" w:cs="Times New Roman"/>
-          <w:color w:val="FF0000"/>
-          <w:sz w:val="24"/>
-          <w:szCs w:val="24"/>
-        </w:rPr>
-        <w:t>(DONE 2/28)</w:t>
+        <w:t xml:space="preserve">Setup start/stop commands from ESP32 camera that a user can send to start autonomous </w:t>
+      </w:r>
+      <w:proofErr w:type="gramStart"/>
+      <w:r>
+        <w:rPr>
+          <w:rFonts w:ascii="Times New Roman" w:eastAsia="Times New Roman" w:hAnsi="Times New Roman" w:cs="Times New Roman"/>
+          <w:sz w:val="24"/>
+          <w:szCs w:val="24"/>
+        </w:rPr>
+        <w:t>control</w:t>
+      </w:r>
+      <w:r>
+        <w:rPr>
+          <w:rFonts w:ascii="Times New Roman" w:eastAsia="Times New Roman" w:hAnsi="Times New Roman" w:cs="Times New Roman"/>
+          <w:color w:val="FF0000"/>
+          <w:sz w:val="24"/>
+          <w:szCs w:val="24"/>
+        </w:rPr>
+        <w:t>(</w:t>
+      </w:r>
+      <w:proofErr w:type="gramEnd"/>
+      <w:r>
+        <w:rPr>
+          <w:rFonts w:ascii="Times New Roman" w:eastAsia="Times New Roman" w:hAnsi="Times New Roman" w:cs="Times New Roman"/>
+          <w:color w:val="FF0000"/>
+          <w:sz w:val="24"/>
+          <w:szCs w:val="24"/>
+        </w:rPr>
+        <w:t>DONE 2/28)</w:t>
       </w:r>
     </w:p>
     <w:p>
@@ -2811,13 +3052,23 @@
           <w:szCs w:val="24"/>
         </w:rPr>
       </w:pPr>
-      <w:r>
-        <w:rPr>
-          <w:rFonts w:ascii="Times New Roman" w:eastAsia="Times New Roman" w:hAnsi="Times New Roman" w:cs="Times New Roman"/>
-          <w:sz w:val="24"/>
-          <w:szCs w:val="24"/>
-        </w:rPr>
-        <w:t>Setup ultrasonic sensors as an emergency stop</w:t>
+      <w:proofErr w:type="gramStart"/>
+      <w:r>
+        <w:rPr>
+          <w:rFonts w:ascii="Times New Roman" w:eastAsia="Times New Roman" w:hAnsi="Times New Roman" w:cs="Times New Roman"/>
+          <w:sz w:val="24"/>
+          <w:szCs w:val="24"/>
+        </w:rPr>
+        <w:t>Setup</w:t>
+      </w:r>
+      <w:proofErr w:type="gramEnd"/>
+      <w:r>
+        <w:rPr>
+          <w:rFonts w:ascii="Times New Roman" w:eastAsia="Times New Roman" w:hAnsi="Times New Roman" w:cs="Times New Roman"/>
+          <w:sz w:val="24"/>
+          <w:szCs w:val="24"/>
+        </w:rPr>
+        <w:t xml:space="preserve"> ultrasonic sensors as an emergency stop</w:t>
       </w:r>
     </w:p>
     <w:p>
@@ -3087,7 +3338,43 @@
           <w:sz w:val="24"/>
           <w:szCs w:val="24"/>
         </w:rPr>
-        <w:t xml:space="preserve">of the XIAOS3 Cam by connecting it to an LLM and feeding the image captured to the LLM by sending the base64 encoded version to an API. I plan on starting with Claude, and then moving over to a local open-source LLM I want to setup on my local router network, if time permits. </w:t>
+        <w:t xml:space="preserve">of the XIAOS3 Cam by connecting it to an LLM and feeding the image captured to the LLM by sending the base64 encoded version to an API. I plan on starting with </w:t>
+      </w:r>
+      <w:proofErr w:type="gramStart"/>
+      <w:r>
+        <w:rPr>
+          <w:rFonts w:ascii="Times New Roman" w:eastAsia="Times New Roman" w:hAnsi="Times New Roman" w:cs="Times New Roman"/>
+          <w:sz w:val="24"/>
+          <w:szCs w:val="24"/>
+        </w:rPr>
+        <w:t>Claude, and</w:t>
+      </w:r>
+      <w:proofErr w:type="gramEnd"/>
+      <w:r>
+        <w:rPr>
+          <w:rFonts w:ascii="Times New Roman" w:eastAsia="Times New Roman" w:hAnsi="Times New Roman" w:cs="Times New Roman"/>
+          <w:sz w:val="24"/>
+          <w:szCs w:val="24"/>
+        </w:rPr>
+        <w:t xml:space="preserve"> then moving over to a local open-source LLM</w:t>
+      </w:r>
+      <w:proofErr w:type="gramStart"/>
+      <w:r>
+        <w:rPr>
+          <w:rFonts w:ascii="Times New Roman" w:eastAsia="Times New Roman" w:hAnsi="Times New Roman" w:cs="Times New Roman"/>
+          <w:sz w:val="24"/>
+          <w:szCs w:val="24"/>
+        </w:rPr>
+        <w:t xml:space="preserve"> I want</w:t>
+      </w:r>
+      <w:proofErr w:type="gramEnd"/>
+      <w:r>
+        <w:rPr>
+          <w:rFonts w:ascii="Times New Roman" w:eastAsia="Times New Roman" w:hAnsi="Times New Roman" w:cs="Times New Roman"/>
+          <w:sz w:val="24"/>
+          <w:szCs w:val="24"/>
+        </w:rPr>
+        <w:t xml:space="preserve"> to setup on my local router network, if time permits. </w:t>
       </w:r>
       <w:r>
         <w:rPr>
@@ -3097,8 +3384,9 @@
           <w:sz w:val="24"/>
           <w:szCs w:val="24"/>
         </w:rPr>
-        <w:t xml:space="preserve">ESP32 cam </w:t>
-      </w:r>
+        <w:t xml:space="preserve">ESP32 </w:t>
+      </w:r>
+      <w:proofErr w:type="gramStart"/>
       <w:r>
         <w:rPr>
           <w:rFonts w:ascii="Times New Roman" w:eastAsia="Times New Roman" w:hAnsi="Times New Roman" w:cs="Times New Roman"/>
@@ -3107,11 +3395,14 @@
           <w:sz w:val="24"/>
           <w:szCs w:val="24"/>
         </w:rPr>
-        <w:t>using the FOMO(Faster Objects, More Objects) Object detection from Edge Impulse. If I run into issue with the AI model or run into walls with performance I will revert to classic computer vision algorithms and do some feature extractions for less precise but still working object detection.</w:t>
-      </w:r>
-      <w:r>
-        <w:rPr>
-          <w:rFonts w:ascii="Times New Roman" w:eastAsia="Times New Roman" w:hAnsi="Times New Roman" w:cs="Times New Roman"/>
+        <w:t>cam</w:t>
+      </w:r>
+      <w:proofErr w:type="gramEnd"/>
+      <w:r>
+        <w:rPr>
+          <w:rFonts w:ascii="Times New Roman" w:eastAsia="Times New Roman" w:hAnsi="Times New Roman" w:cs="Times New Roman"/>
+          <w:strike/>
+          <w:color w:val="FF0000"/>
           <w:sz w:val="24"/>
           <w:szCs w:val="24"/>
         </w:rPr>
@@ -3120,6 +3411,90 @@
       <w:r>
         <w:rPr>
           <w:rFonts w:ascii="Times New Roman" w:eastAsia="Times New Roman" w:hAnsi="Times New Roman" w:cs="Times New Roman"/>
+          <w:strike/>
+          <w:color w:val="FF0000"/>
+          <w:sz w:val="24"/>
+          <w:szCs w:val="24"/>
+        </w:rPr>
+        <w:t xml:space="preserve">using the </w:t>
+      </w:r>
+      <w:proofErr w:type="gramStart"/>
+      <w:r>
+        <w:rPr>
+          <w:rFonts w:ascii="Times New Roman" w:eastAsia="Times New Roman" w:hAnsi="Times New Roman" w:cs="Times New Roman"/>
+          <w:strike/>
+          <w:color w:val="FF0000"/>
+          <w:sz w:val="24"/>
+          <w:szCs w:val="24"/>
+        </w:rPr>
+        <w:t>FOMO(</w:t>
+      </w:r>
+      <w:proofErr w:type="gramEnd"/>
+      <w:r>
+        <w:rPr>
+          <w:rFonts w:ascii="Times New Roman" w:eastAsia="Times New Roman" w:hAnsi="Times New Roman" w:cs="Times New Roman"/>
+          <w:strike/>
+          <w:color w:val="FF0000"/>
+          <w:sz w:val="24"/>
+          <w:szCs w:val="24"/>
+        </w:rPr>
+        <w:t xml:space="preserve">Faster Objects, More Objects) Object detection from Edge Impulse. If I run into </w:t>
+      </w:r>
+      <w:proofErr w:type="gramStart"/>
+      <w:r>
+        <w:rPr>
+          <w:rFonts w:ascii="Times New Roman" w:eastAsia="Times New Roman" w:hAnsi="Times New Roman" w:cs="Times New Roman"/>
+          <w:strike/>
+          <w:color w:val="FF0000"/>
+          <w:sz w:val="24"/>
+          <w:szCs w:val="24"/>
+        </w:rPr>
+        <w:t>issue</w:t>
+      </w:r>
+      <w:proofErr w:type="gramEnd"/>
+      <w:r>
+        <w:rPr>
+          <w:rFonts w:ascii="Times New Roman" w:eastAsia="Times New Roman" w:hAnsi="Times New Roman" w:cs="Times New Roman"/>
+          <w:strike/>
+          <w:color w:val="FF0000"/>
+          <w:sz w:val="24"/>
+          <w:szCs w:val="24"/>
+        </w:rPr>
+        <w:t xml:space="preserve"> with the AI model or run into walls with </w:t>
+      </w:r>
+      <w:proofErr w:type="gramStart"/>
+      <w:r>
+        <w:rPr>
+          <w:rFonts w:ascii="Times New Roman" w:eastAsia="Times New Roman" w:hAnsi="Times New Roman" w:cs="Times New Roman"/>
+          <w:strike/>
+          <w:color w:val="FF0000"/>
+          <w:sz w:val="24"/>
+          <w:szCs w:val="24"/>
+        </w:rPr>
+        <w:t>performance</w:t>
+      </w:r>
+      <w:proofErr w:type="gramEnd"/>
+      <w:r>
+        <w:rPr>
+          <w:rFonts w:ascii="Times New Roman" w:eastAsia="Times New Roman" w:hAnsi="Times New Roman" w:cs="Times New Roman"/>
+          <w:strike/>
+          <w:color w:val="FF0000"/>
+          <w:sz w:val="24"/>
+          <w:szCs w:val="24"/>
+        </w:rPr>
+        <w:t xml:space="preserve"> I will revert to classic computer vision algorithms and do some feature extractions for less precise but still working object detection.</w:t>
+      </w:r>
+      <w:r>
+        <w:rPr>
+          <w:rFonts w:ascii="Times New Roman" w:eastAsia="Times New Roman" w:hAnsi="Times New Roman" w:cs="Times New Roman"/>
+          <w:sz w:val="24"/>
+          <w:szCs w:val="24"/>
+        </w:rPr>
+        <w:t xml:space="preserve"> </w:t>
+      </w:r>
+      <w:r>
+        <w:rPr>
+          <w:rFonts w:ascii="Times New Roman" w:eastAsia="Times New Roman" w:hAnsi="Times New Roman" w:cs="Times New Roman"/>
           <w:color w:val="FF0000"/>
           <w:sz w:val="24"/>
           <w:szCs w:val="24"/>
@@ -3148,7 +3523,16 @@
           <w:sz w:val="24"/>
           <w:szCs w:val="24"/>
         </w:rPr>
-        <w:t>-S</w:t>
+        <w:t>-</w:t>
+      </w:r>
+      <w:proofErr w:type="gramStart"/>
+      <w:r>
+        <w:rPr>
+          <w:rFonts w:ascii="Times New Roman" w:eastAsia="Times New Roman" w:hAnsi="Times New Roman" w:cs="Times New Roman"/>
+          <w:sz w:val="24"/>
+          <w:szCs w:val="24"/>
+        </w:rPr>
+        <w:t>S</w:t>
       </w:r>
       <w:r>
         <w:rPr>
@@ -3159,6 +3543,7 @@
         </w:rPr>
         <w:t>(</w:t>
       </w:r>
+      <w:proofErr w:type="gramEnd"/>
       <w:r>
         <w:rPr>
           <w:rFonts w:ascii="Times New Roman" w:eastAsia="Times New Roman" w:hAnsi="Times New Roman" w:cs="Times New Roman"/>
@@ -3407,16 +3792,37 @@
           <w:sz w:val="24"/>
           <w:szCs w:val="24"/>
         </w:rPr>
-        <w:t>connected through USART</w:t>
-      </w:r>
-      <w:r>
-        <w:rPr>
-          <w:rFonts w:ascii="Times New Roman" w:eastAsia="Times New Roman" w:hAnsi="Times New Roman" w:cs="Times New Roman"/>
-          <w:color w:val="FF0000"/>
-          <w:sz w:val="24"/>
-          <w:szCs w:val="24"/>
-        </w:rPr>
-        <w:t>(Changed on 2/26/2025)</w:t>
+        <w:t xml:space="preserve">connected through </w:t>
+      </w:r>
+      <w:proofErr w:type="gramStart"/>
+      <w:r>
+        <w:rPr>
+          <w:rFonts w:ascii="Times New Roman" w:eastAsia="Times New Roman" w:hAnsi="Times New Roman" w:cs="Times New Roman"/>
+          <w:strike/>
+          <w:color w:val="FF0000"/>
+          <w:sz w:val="24"/>
+          <w:szCs w:val="24"/>
+        </w:rPr>
+        <w:t>USART</w:t>
+      </w:r>
+      <w:r>
+        <w:rPr>
+          <w:rFonts w:ascii="Times New Roman" w:eastAsia="Times New Roman" w:hAnsi="Times New Roman" w:cs="Times New Roman"/>
+          <w:color w:val="FF0000"/>
+          <w:sz w:val="24"/>
+          <w:szCs w:val="24"/>
+        </w:rPr>
+        <w:t>(</w:t>
+      </w:r>
+      <w:proofErr w:type="gramEnd"/>
+      <w:r>
+        <w:rPr>
+          <w:rFonts w:ascii="Times New Roman" w:eastAsia="Times New Roman" w:hAnsi="Times New Roman" w:cs="Times New Roman"/>
+          <w:color w:val="FF0000"/>
+          <w:sz w:val="24"/>
+          <w:szCs w:val="24"/>
+        </w:rPr>
+        <w:t>Changed on 2/26/2025)</w:t>
       </w:r>
       <w:r>
         <w:rPr>
@@ -3545,7 +3951,43 @@
           <w:sz w:val="24"/>
           <w:szCs w:val="24"/>
         </w:rPr>
-        <w:t xml:space="preserve">powered using pulse width modulation on Left/Right commands. The DC motors will be powered ON/OFF/Forward/Backwards depending on commands from the ESP32 Camera. As a backup object detection system there will also be an ultrasonic sensor used for emergency object detection in case that the camera goes offline or misses something. As stated earlier the mechanical design of the rovers rocker-bogie suspension system was predesigned but I only plan on using the suspension and will be using a custom chassis and slightly different electronics. </w:t>
+        <w:t xml:space="preserve">powered using pulse width modulation on Left/Right commands. The DC motors will be powered ON/OFF/Forward/Backwards depending on commands from the ESP32 Camera. As a backup object detection system there will also be an ultrasonic sensor used for emergency object detection in case that the camera goes offline or misses something. As stated </w:t>
+      </w:r>
+      <w:proofErr w:type="gramStart"/>
+      <w:r>
+        <w:rPr>
+          <w:rFonts w:ascii="Times New Roman" w:eastAsia="Times New Roman" w:hAnsi="Times New Roman" w:cs="Times New Roman"/>
+          <w:sz w:val="24"/>
+          <w:szCs w:val="24"/>
+        </w:rPr>
+        <w:t>earlier</w:t>
+      </w:r>
+      <w:proofErr w:type="gramEnd"/>
+      <w:r>
+        <w:rPr>
+          <w:rFonts w:ascii="Times New Roman" w:eastAsia="Times New Roman" w:hAnsi="Times New Roman" w:cs="Times New Roman"/>
+          <w:sz w:val="24"/>
+          <w:szCs w:val="24"/>
+        </w:rPr>
+        <w:t xml:space="preserve"> the mechanical design of the </w:t>
+      </w:r>
+      <w:proofErr w:type="gramStart"/>
+      <w:r>
+        <w:rPr>
+          <w:rFonts w:ascii="Times New Roman" w:eastAsia="Times New Roman" w:hAnsi="Times New Roman" w:cs="Times New Roman"/>
+          <w:sz w:val="24"/>
+          <w:szCs w:val="24"/>
+        </w:rPr>
+        <w:t>rovers</w:t>
+      </w:r>
+      <w:proofErr w:type="gramEnd"/>
+      <w:r>
+        <w:rPr>
+          <w:rFonts w:ascii="Times New Roman" w:eastAsia="Times New Roman" w:hAnsi="Times New Roman" w:cs="Times New Roman"/>
+          <w:sz w:val="24"/>
+          <w:szCs w:val="24"/>
+        </w:rPr>
+        <w:t xml:space="preserve"> rocker-bogie suspension system was predesigned but I only plan on using the suspension and will be using a custom chassis and slightly different electronics. </w:t>
       </w:r>
       <w:r>
         <w:rPr>
@@ -3554,7 +3996,25 @@
           <w:szCs w:val="24"/>
         </w:rPr>
         <w:br/>
-        <w:t>As for the Hopper trailer, this will be 3D printed and contain no electronics. It will consist of a hopper module that feeds the fertilizer/seed to a trap door which is opened/closed based on a spring which will be connected to the rover so that upon it moving the trap door will open/close.</w:t>
+        <w:t xml:space="preserve">As for the Hopper trailer, this will be </w:t>
+      </w:r>
+      <w:proofErr w:type="gramStart"/>
+      <w:r>
+        <w:rPr>
+          <w:rFonts w:ascii="Times New Roman" w:eastAsia="Times New Roman" w:hAnsi="Times New Roman" w:cs="Times New Roman"/>
+          <w:sz w:val="24"/>
+          <w:szCs w:val="24"/>
+        </w:rPr>
+        <w:t>3D printed</w:t>
+      </w:r>
+      <w:proofErr w:type="gramEnd"/>
+      <w:r>
+        <w:rPr>
+          <w:rFonts w:ascii="Times New Roman" w:eastAsia="Times New Roman" w:hAnsi="Times New Roman" w:cs="Times New Roman"/>
+          <w:sz w:val="24"/>
+          <w:szCs w:val="24"/>
+        </w:rPr>
+        <w:t xml:space="preserve"> and contain no electronics. It will consist of a hopper module that feeds the fertilizer/seed to a trap door which is opened/closed based on a spring which will be connected to the rover so that upon it moving the trap door will open/close.</w:t>
       </w:r>
       <w:r>
         <w:rPr>
@@ -3666,7 +4126,47 @@
         <w:spacing w:before="120"/>
       </w:pPr>
       <w:r>
-        <w:t xml:space="preserve">I started the circuit design with the schematic below. However, I soon found that the 6V supply was not enough to get my rover moving on carpet let alone grass. I did not however have a 12V supply initially so I powered my initial prototype by wiring 2 6V packs in series and using a 9V battery to power the servos/microcontroller. As for the XIAO Camera I have a </w:t>
+        <w:t xml:space="preserve">I started the circuit design with the schematic below. However, I soon found that the 6V supply was not enough to get my rover moving on carpet let alone grass. I did </w:t>
+      </w:r>
+      <w:r>
+        <w:t>not, however,</w:t>
+      </w:r>
+      <w:r>
+        <w:t xml:space="preserve"> have a 12V supply initially so I powered my initial prototype by wiring 2 6V packs in series and using a 9V battery to power the servos/microcontroller. As for the XIAO Camera I have a </w:t>
+      </w:r>
+      <w:r>
+        <w:t xml:space="preserve">small rechargeable LiPo battery that I plan on plugging into some leads I soldered to the XIAO Camera. </w:t>
+      </w:r>
+      <w:r>
+        <w:rPr>
+          <w:color w:val="FF0000"/>
+        </w:rPr>
+        <w:t>(Added 3/3/2025)</w:t>
+      </w:r>
+    </w:p>
+    <w:p>
+      <w:pPr>
+        <w:spacing w:before="120"/>
+      </w:pPr>
+      <w:r>
+        <w:t xml:space="preserve">The command queue server is </w:t>
+      </w:r>
+      <w:proofErr w:type="spellStart"/>
+      <w:r>
+        <w:t>Zimaboard</w:t>
+      </w:r>
+      <w:proofErr w:type="spellEnd"/>
+      <w:r>
+        <w:t xml:space="preserve"> NAS that hosts the server using a docker image. This allows the rover and camera to easily communicate through the NAS which was much more stable than the communications between the devices themselves. </w:t>
+      </w:r>
+      <w:r>
+        <w:rPr>
+          <w:color w:val="FF0000"/>
+        </w:rPr>
+        <w:t>(Added 3/3/2025)</w:t>
+      </w:r>
+      <w:r>
+        <w:t xml:space="preserve"> </w:t>
       </w:r>
     </w:p>
     <w:p>
@@ -4033,7 +4533,25 @@
           <w:sz w:val="24"/>
           <w:szCs w:val="24"/>
         </w:rPr>
-        <w:t xml:space="preserve">I have also made some design modifications to the original rover design I got from the instructables in the Appendix C. The frame initially did not work well with a soft rover body. I tested this with cardboard and found that the suspension bowed and would not allow the wheels to turn. </w:t>
+        <w:t xml:space="preserve">I have also made some design modifications to the original rover design I got from the </w:t>
+      </w:r>
+      <w:proofErr w:type="spellStart"/>
+      <w:r>
+        <w:rPr>
+          <w:rFonts w:ascii="Times New Roman" w:eastAsia="Times New Roman" w:hAnsi="Times New Roman" w:cs="Times New Roman"/>
+          <w:sz w:val="24"/>
+          <w:szCs w:val="24"/>
+        </w:rPr>
+        <w:t>instructables</w:t>
+      </w:r>
+      <w:proofErr w:type="spellEnd"/>
+      <w:r>
+        <w:rPr>
+          <w:rFonts w:ascii="Times New Roman" w:eastAsia="Times New Roman" w:hAnsi="Times New Roman" w:cs="Times New Roman"/>
+          <w:sz w:val="24"/>
+          <w:szCs w:val="24"/>
+        </w:rPr>
+        <w:t xml:space="preserve"> in the Appendix C. The frame initially did not work well with a soft rover body. I tested this with cardboard and found that the suspension bowed and would not allow the wheels to turn. </w:t>
       </w:r>
     </w:p>
     <w:p>
@@ -4045,23 +4563,117 @@
           <w:szCs w:val="24"/>
         </w:rPr>
       </w:pPr>
-    </w:p>
-    <w:p>
-      <w:pPr>
-        <w:spacing w:before="120"/>
-        <w:rPr>
-          <w:rFonts w:ascii="Times New Roman" w:eastAsia="Times New Roman" w:hAnsi="Times New Roman" w:cs="Times New Roman"/>
-          <w:sz w:val="24"/>
-          <w:szCs w:val="24"/>
-        </w:rPr>
-      </w:pPr>
-      <w:r>
-        <w:rPr>
-          <w:rFonts w:ascii="Times New Roman" w:eastAsia="Times New Roman" w:hAnsi="Times New Roman" w:cs="Times New Roman"/>
-          <w:sz w:val="24"/>
-          <w:szCs w:val="24"/>
-        </w:rPr>
-        <w:t xml:space="preserve">I started with a single support that went from body connector to body connector on the interior and then had a whole bunch of other ideas. I want to try and build a smaller frame that is more ergonomic and easier to replace, but that is a major stretch goal abit outside of the scope of the innovation on this project. If I get to this point I plan on using some of the 3d printed NASA hexagon fabric to cover the chassis and allow it to have a soft body which is easy to replace while still being really strong. </w:t>
+      <w:r>
+        <w:rPr>
+          <w:rFonts w:ascii="Times New Roman" w:eastAsia="Times New Roman" w:hAnsi="Times New Roman" w:cs="Times New Roman"/>
+          <w:sz w:val="24"/>
+          <w:szCs w:val="24"/>
+        </w:rPr>
+        <w:t xml:space="preserve">I started with a single support that went from body connector to body connector on the interior and then had a whole bunch of other ideas. I </w:t>
+      </w:r>
+      <w:r>
+        <w:rPr>
+          <w:rFonts w:ascii="Times New Roman" w:eastAsia="Times New Roman" w:hAnsi="Times New Roman" w:cs="Times New Roman"/>
+          <w:sz w:val="24"/>
+          <w:szCs w:val="24"/>
+        </w:rPr>
+        <w:t xml:space="preserve">then </w:t>
+      </w:r>
+      <w:r>
+        <w:rPr>
+          <w:rFonts w:ascii="Times New Roman" w:eastAsia="Times New Roman" w:hAnsi="Times New Roman" w:cs="Times New Roman"/>
+          <w:sz w:val="24"/>
+          <w:szCs w:val="24"/>
+        </w:rPr>
+        <w:t>want</w:t>
+      </w:r>
+      <w:r>
+        <w:rPr>
+          <w:rFonts w:ascii="Times New Roman" w:eastAsia="Times New Roman" w:hAnsi="Times New Roman" w:cs="Times New Roman"/>
+          <w:sz w:val="24"/>
+          <w:szCs w:val="24"/>
+        </w:rPr>
+        <w:t>ed</w:t>
+      </w:r>
+      <w:r>
+        <w:rPr>
+          <w:rFonts w:ascii="Times New Roman" w:eastAsia="Times New Roman" w:hAnsi="Times New Roman" w:cs="Times New Roman"/>
+          <w:sz w:val="24"/>
+          <w:szCs w:val="24"/>
+        </w:rPr>
+        <w:t xml:space="preserve"> to try and build a smaller frame that is more ergonomic and easier to replace, but that is a major stretch goal </w:t>
+      </w:r>
+      <w:proofErr w:type="spellStart"/>
+      <w:proofErr w:type="gramStart"/>
+      <w:r>
+        <w:rPr>
+          <w:rFonts w:ascii="Times New Roman" w:eastAsia="Times New Roman" w:hAnsi="Times New Roman" w:cs="Times New Roman"/>
+          <w:sz w:val="24"/>
+          <w:szCs w:val="24"/>
+        </w:rPr>
+        <w:t>abit</w:t>
+      </w:r>
+      <w:proofErr w:type="spellEnd"/>
+      <w:proofErr w:type="gramEnd"/>
+      <w:r>
+        <w:rPr>
+          <w:rFonts w:ascii="Times New Roman" w:eastAsia="Times New Roman" w:hAnsi="Times New Roman" w:cs="Times New Roman"/>
+          <w:sz w:val="24"/>
+          <w:szCs w:val="24"/>
+        </w:rPr>
+        <w:t xml:space="preserve"> outside of the scope of the innovation on this project. If I get to this </w:t>
+      </w:r>
+      <w:r>
+        <w:rPr>
+          <w:rFonts w:ascii="Times New Roman" w:eastAsia="Times New Roman" w:hAnsi="Times New Roman" w:cs="Times New Roman"/>
+          <w:sz w:val="24"/>
+          <w:szCs w:val="24"/>
+        </w:rPr>
+        <w:t>point,</w:t>
+      </w:r>
+      <w:r>
+        <w:rPr>
+          <w:rFonts w:ascii="Times New Roman" w:eastAsia="Times New Roman" w:hAnsi="Times New Roman" w:cs="Times New Roman"/>
+          <w:sz w:val="24"/>
+          <w:szCs w:val="24"/>
+        </w:rPr>
+        <w:t xml:space="preserve"> I plan on using some of the </w:t>
+      </w:r>
+      <w:proofErr w:type="gramStart"/>
+      <w:r>
+        <w:rPr>
+          <w:rFonts w:ascii="Times New Roman" w:eastAsia="Times New Roman" w:hAnsi="Times New Roman" w:cs="Times New Roman"/>
+          <w:sz w:val="24"/>
+          <w:szCs w:val="24"/>
+        </w:rPr>
+        <w:t>3d</w:t>
+      </w:r>
+      <w:proofErr w:type="gramEnd"/>
+      <w:r>
+        <w:rPr>
+          <w:rFonts w:ascii="Times New Roman" w:eastAsia="Times New Roman" w:hAnsi="Times New Roman" w:cs="Times New Roman"/>
+          <w:sz w:val="24"/>
+          <w:szCs w:val="24"/>
+        </w:rPr>
+        <w:t xml:space="preserve"> printed NASA hexagon fabric to cover the chassis and allow it to have a soft body which is easy to replace while still being </w:t>
+      </w:r>
+      <w:proofErr w:type="gramStart"/>
+      <w:r>
+        <w:rPr>
+          <w:rFonts w:ascii="Times New Roman" w:eastAsia="Times New Roman" w:hAnsi="Times New Roman" w:cs="Times New Roman"/>
+          <w:sz w:val="24"/>
+          <w:szCs w:val="24"/>
+        </w:rPr>
+        <w:t>really strong</w:t>
+      </w:r>
+      <w:proofErr w:type="gramEnd"/>
+      <w:r>
+        <w:rPr>
+          <w:rFonts w:ascii="Times New Roman" w:eastAsia="Times New Roman" w:hAnsi="Times New Roman" w:cs="Times New Roman"/>
+          <w:sz w:val="24"/>
+          <w:szCs w:val="24"/>
+        </w:rPr>
+        <w:t xml:space="preserve">. </w:t>
       </w:r>
       <w:r>
         <w:rPr>
@@ -4285,7 +4897,25 @@
           <w:sz w:val="24"/>
           <w:szCs w:val="24"/>
         </w:rPr>
-        <w:t xml:space="preserve">This project will go through testing and evaluation across many different levels. Each system will be broken up into modular parts and tested independently (unit tests) and in junction with other systems (integration tests). Each section of the evaluation criteria represents one system and will be tested as such. </w:t>
+        <w:t xml:space="preserve">This project will go through testing and evaluation across many different levels. Each system will be </w:t>
+      </w:r>
+      <w:proofErr w:type="gramStart"/>
+      <w:r>
+        <w:rPr>
+          <w:rFonts w:ascii="Times New Roman" w:eastAsia="Times New Roman" w:hAnsi="Times New Roman" w:cs="Times New Roman"/>
+          <w:sz w:val="24"/>
+          <w:szCs w:val="24"/>
+        </w:rPr>
+        <w:t>broken up</w:t>
+      </w:r>
+      <w:proofErr w:type="gramEnd"/>
+      <w:r>
+        <w:rPr>
+          <w:rFonts w:ascii="Times New Roman" w:eastAsia="Times New Roman" w:hAnsi="Times New Roman" w:cs="Times New Roman"/>
+          <w:sz w:val="24"/>
+          <w:szCs w:val="24"/>
+        </w:rPr>
+        <w:t xml:space="preserve"> into modular parts and tested independently (unit tests) and in junction with other systems (integration tests). Each section of the evaluation criteria represents one system and will be tested as such. </w:t>
       </w:r>
       <w:r>
         <w:rPr>
@@ -4301,7 +4931,25 @@
           <w:sz w:val="24"/>
           <w:szCs w:val="24"/>
         </w:rPr>
-        <w:t xml:space="preserve"> for example, the motor control of each wheel module will be tested independently and then together, then as a whole for the rover, then also integrated as part of the full autonomous system. On top of this the requirements I stated at the beginning of this brief either need to be met or show areas that need improvement. For clarity</w:t>
+        <w:t xml:space="preserve"> for example, the motor control of each wheel module will be tested independently and then together, then </w:t>
+      </w:r>
+      <w:proofErr w:type="gramStart"/>
+      <w:r>
+        <w:rPr>
+          <w:rFonts w:ascii="Times New Roman" w:eastAsia="Times New Roman" w:hAnsi="Times New Roman" w:cs="Times New Roman"/>
+          <w:sz w:val="24"/>
+          <w:szCs w:val="24"/>
+        </w:rPr>
+        <w:t>as a whole for</w:t>
+      </w:r>
+      <w:proofErr w:type="gramEnd"/>
+      <w:r>
+        <w:rPr>
+          <w:rFonts w:ascii="Times New Roman" w:eastAsia="Times New Roman" w:hAnsi="Times New Roman" w:cs="Times New Roman"/>
+          <w:sz w:val="24"/>
+          <w:szCs w:val="24"/>
+        </w:rPr>
+        <w:t xml:space="preserve"> the rover, then also integrated as part of the full autonomous system. On top of this the requirements I stated at the beginning of this brief either need to be met or show areas that need improvement. For clarity</w:t>
       </w:r>
       <w:r>
         <w:rPr>
@@ -4649,7 +5297,27 @@
           <w:i/>
           <w:u w:val="single"/>
         </w:rPr>
-        <w:t>Note: This section must completed prior to SIP403/409.</w:t>
+        <w:t xml:space="preserve">Note: This section must </w:t>
+      </w:r>
+      <w:proofErr w:type="gramStart"/>
+      <w:r>
+        <w:rPr>
+          <w:rFonts w:ascii="Times New Roman" w:eastAsia="Times New Roman" w:hAnsi="Times New Roman" w:cs="Times New Roman"/>
+          <w:b/>
+          <w:i/>
+          <w:u w:val="single"/>
+        </w:rPr>
+        <w:t>completed</w:t>
+      </w:r>
+      <w:proofErr w:type="gramEnd"/>
+      <w:r>
+        <w:rPr>
+          <w:rFonts w:ascii="Times New Roman" w:eastAsia="Times New Roman" w:hAnsi="Times New Roman" w:cs="Times New Roman"/>
+          <w:b/>
+          <w:i/>
+          <w:u w:val="single"/>
+        </w:rPr>
+        <w:t xml:space="preserve"> prior to SIP403/409.</w:t>
       </w:r>
     </w:p>
     <w:p>
@@ -4667,7 +5335,43 @@
           <w:sz w:val="24"/>
           <w:szCs w:val="24"/>
         </w:rPr>
-        <w:t>Provide an in-depth description of the completion assessment of your project. Describe how well the completed components function and highlight the innovative facets of your design.  This is sometimes known as a “Post-Mortem” or “Lessons-Learned Report”.  A good approach for this section is to answer the following 4 questions:  “What went right?  What went wrong? What was learned throughout the process? What would be done differently if you had to do it again?</w:t>
+        <w:t xml:space="preserve">Provide an in-depth description of the completion assessment of your project. Describe how well the </w:t>
+      </w:r>
+      <w:proofErr w:type="gramStart"/>
+      <w:r>
+        <w:rPr>
+          <w:rFonts w:ascii="Times New Roman" w:eastAsia="Times New Roman" w:hAnsi="Times New Roman" w:cs="Times New Roman"/>
+          <w:sz w:val="24"/>
+          <w:szCs w:val="24"/>
+        </w:rPr>
+        <w:t>completed</w:t>
+      </w:r>
+      <w:proofErr w:type="gramEnd"/>
+      <w:r>
+        <w:rPr>
+          <w:rFonts w:ascii="Times New Roman" w:eastAsia="Times New Roman" w:hAnsi="Times New Roman" w:cs="Times New Roman"/>
+          <w:sz w:val="24"/>
+          <w:szCs w:val="24"/>
+        </w:rPr>
+        <w:t xml:space="preserve"> components function and highlight the innovative facets of your design.  This is sometimes known as a “Post-Mortem” or “Lessons-Learned Report”.  A good approach for this section is to answer the following 4 questions</w:t>
+      </w:r>
+      <w:proofErr w:type="gramStart"/>
+      <w:r>
+        <w:rPr>
+          <w:rFonts w:ascii="Times New Roman" w:eastAsia="Times New Roman" w:hAnsi="Times New Roman" w:cs="Times New Roman"/>
+          <w:sz w:val="24"/>
+          <w:szCs w:val="24"/>
+        </w:rPr>
+        <w:t>:  “</w:t>
+      </w:r>
+      <w:proofErr w:type="gramEnd"/>
+      <w:r>
+        <w:rPr>
+          <w:rFonts w:ascii="Times New Roman" w:eastAsia="Times New Roman" w:hAnsi="Times New Roman" w:cs="Times New Roman"/>
+          <w:sz w:val="24"/>
+          <w:szCs w:val="24"/>
+        </w:rPr>
+        <w:t>What went right?  What went wrong? What was learned throughout the process? What would be done differently if you had to do it again?</w:t>
       </w:r>
     </w:p>
     <w:p>
@@ -4955,13 +5659,41 @@
           <w:szCs w:val="24"/>
         </w:rPr>
       </w:pPr>
+      <w:proofErr w:type="spellStart"/>
       <w:r>
         <w:rPr>
           <w:rFonts w:ascii="Times New Roman" w:hAnsi="Times New Roman" w:cs="Times New Roman"/>
           <w:sz w:val="24"/>
           <w:szCs w:val="24"/>
         </w:rPr>
-        <w:t xml:space="preserve">FarmBot. (n.d.). FarmBot: Open-source CNC farming. Retrieved February 18, 2025, from </w:t>
+        <w:t>FarmBot</w:t>
+      </w:r>
+      <w:proofErr w:type="spellEnd"/>
+      <w:r>
+        <w:rPr>
+          <w:rFonts w:ascii="Times New Roman" w:hAnsi="Times New Roman" w:cs="Times New Roman"/>
+          <w:sz w:val="24"/>
+          <w:szCs w:val="24"/>
+        </w:rPr>
+        <w:t xml:space="preserve">. (n.d.). </w:t>
+      </w:r>
+      <w:proofErr w:type="spellStart"/>
+      <w:r>
+        <w:rPr>
+          <w:rFonts w:ascii="Times New Roman" w:hAnsi="Times New Roman" w:cs="Times New Roman"/>
+          <w:sz w:val="24"/>
+          <w:szCs w:val="24"/>
+        </w:rPr>
+        <w:t>FarmBot</w:t>
+      </w:r>
+      <w:proofErr w:type="spellEnd"/>
+      <w:r>
+        <w:rPr>
+          <w:rFonts w:ascii="Times New Roman" w:hAnsi="Times New Roman" w:cs="Times New Roman"/>
+          <w:sz w:val="24"/>
+          <w:szCs w:val="24"/>
+        </w:rPr>
+        <w:t xml:space="preserve">: Open-source CNC farming. Retrieved February 18, 2025, from </w:t>
       </w:r>
       <w:hyperlink r:id="rId13" w:history="1">
         <w:r>
@@ -4984,13 +5716,23 @@
           <w:szCs w:val="24"/>
         </w:rPr>
       </w:pPr>
+      <w:proofErr w:type="spellStart"/>
       <w:r>
         <w:rPr>
           <w:rFonts w:ascii="Times New Roman" w:hAnsi="Times New Roman" w:cs="Times New Roman"/>
           <w:sz w:val="24"/>
           <w:szCs w:val="24"/>
         </w:rPr>
-        <w:t xml:space="preserve">Instructables. (n.d.). </w:t>
+        <w:t>Instructables</w:t>
+      </w:r>
+      <w:proofErr w:type="spellEnd"/>
+      <w:r>
+        <w:rPr>
+          <w:rFonts w:ascii="Times New Roman" w:hAnsi="Times New Roman" w:cs="Times New Roman"/>
+          <w:sz w:val="24"/>
+          <w:szCs w:val="24"/>
+        </w:rPr>
+        <w:t xml:space="preserve">. (n.d.). </w:t>
       </w:r>
       <w:r>
         <w:rPr>
@@ -5008,7 +5750,25 @@
           <w:sz w:val="24"/>
           <w:szCs w:val="24"/>
         </w:rPr>
-        <w:t xml:space="preserve">. Instructables. Retrieved [date], from </w:t>
+        <w:t xml:space="preserve">. </w:t>
+      </w:r>
+      <w:proofErr w:type="spellStart"/>
+      <w:r>
+        <w:rPr>
+          <w:rFonts w:ascii="Times New Roman" w:hAnsi="Times New Roman" w:cs="Times New Roman"/>
+          <w:sz w:val="24"/>
+          <w:szCs w:val="24"/>
+        </w:rPr>
+        <w:t>Instructables</w:t>
+      </w:r>
+      <w:proofErr w:type="spellEnd"/>
+      <w:r>
+        <w:rPr>
+          <w:rFonts w:ascii="Times New Roman" w:hAnsi="Times New Roman" w:cs="Times New Roman"/>
+          <w:sz w:val="24"/>
+          <w:szCs w:val="24"/>
+        </w:rPr>
+        <w:t xml:space="preserve">. Retrieved [date], from </w:t>
       </w:r>
       <w:hyperlink r:id="rId14" w:tgtFrame="_new" w:history="1">
         <w:r>
@@ -5090,13 +5850,23 @@
           <w:szCs w:val="24"/>
         </w:rPr>
       </w:pPr>
+      <w:proofErr w:type="spellStart"/>
       <w:r>
         <w:rPr>
           <w:rFonts w:ascii="Times New Roman" w:hAnsi="Times New Roman" w:cs="Times New Roman"/>
           <w:sz w:val="24"/>
           <w:szCs w:val="24"/>
         </w:rPr>
-        <w:t>techiesms. (2025, January 20). AI vision project using ESP32Cam &amp; GPT-4o [Video]. YouTube. https://youtu.be/gZp9B_IiKCo</w:t>
+        <w:t>techiesms</w:t>
+      </w:r>
+      <w:proofErr w:type="spellEnd"/>
+      <w:r>
+        <w:rPr>
+          <w:rFonts w:ascii="Times New Roman" w:hAnsi="Times New Roman" w:cs="Times New Roman"/>
+          <w:sz w:val="24"/>
+          <w:szCs w:val="24"/>
+        </w:rPr>
+        <w:t>. (2025, January 20). AI vision project using ESP32Cam &amp; GPT-4o [Video]. YouTube. https://youtu.be/gZp9B_IiKCo</w:t>
       </w:r>
     </w:p>
     <w:sectPr>

</xml_diff>

<commit_message>
CAD, brief update, and circuit update
- Trailer CAD final
- Camera Holder CAD
- Brief update
- Circuit schematic update
- Fixed turning
- Log reasoning for full_stop from camera
</commit_message>
<xml_diff>
--- a/Docs/Rocha Innovation Brief.docx
+++ b/Docs/Rocha Innovation Brief.docx
@@ -974,27 +974,7 @@
           <w:sz w:val="24"/>
           <w:szCs w:val="24"/>
         </w:rPr>
-        <w:t>Changed to 3 L298</w:t>
-      </w:r>
-      <w:proofErr w:type="gramStart"/>
-      <w:r>
-        <w:rPr>
-          <w:rFonts w:ascii="Times New Roman" w:eastAsia="Times New Roman" w:hAnsi="Times New Roman" w:cs="Times New Roman"/>
-          <w:color w:val="FF0000"/>
-          <w:sz w:val="24"/>
-          <w:szCs w:val="24"/>
-        </w:rPr>
-        <w:t>N(</w:t>
-      </w:r>
-      <w:proofErr w:type="gramEnd"/>
-      <w:r>
-        <w:rPr>
-          <w:rFonts w:ascii="Times New Roman" w:eastAsia="Times New Roman" w:hAnsi="Times New Roman" w:cs="Times New Roman"/>
-          <w:color w:val="FF0000"/>
-          <w:sz w:val="24"/>
-          <w:szCs w:val="24"/>
-        </w:rPr>
-        <w:t>using 2 added complications to the circuit and power management)</w:t>
+        <w:t>Changed to 3 L298N(using 2 added complications to the circuit and power management)</w:t>
       </w:r>
     </w:p>
     <w:p>
@@ -1376,25 +1356,7 @@
           <w:sz w:val="24"/>
           <w:szCs w:val="24"/>
         </w:rPr>
-        <w:t xml:space="preserve">gardeners, homesteaders, and small farm owners who are interested in </w:t>
-      </w:r>
-      <w:proofErr w:type="gramStart"/>
-      <w:r>
-        <w:rPr>
-          <w:rFonts w:ascii="Times New Roman" w:eastAsia="Times New Roman" w:hAnsi="Times New Roman" w:cs="Times New Roman"/>
-          <w:sz w:val="24"/>
-          <w:szCs w:val="24"/>
-        </w:rPr>
-        <w:t>no</w:t>
-      </w:r>
-      <w:proofErr w:type="gramEnd"/>
-      <w:r>
-        <w:rPr>
-          <w:rFonts w:ascii="Times New Roman" w:eastAsia="Times New Roman" w:hAnsi="Times New Roman" w:cs="Times New Roman"/>
-          <w:sz w:val="24"/>
-          <w:szCs w:val="24"/>
-        </w:rPr>
-        <w:t xml:space="preserve">-dig farming or already practice it. However, this system could easily be extended including </w:t>
+        <w:t xml:space="preserve">gardeners, homesteaders, and small farm owners who are interested in no-dig farming or already practice it. However, this system could easily be extended including </w:t>
       </w:r>
       <w:r>
         <w:rPr>
@@ -1463,7 +1425,6 @@
         <w:t xml:space="preserve"> could possibly be used for farming on other planets, if we ever get there, or as small-scale versions of the Mars rovers that are more accessible for smaller companies. </w:t>
       </w:r>
       <w:proofErr w:type="spellStart"/>
-      <w:proofErr w:type="gramStart"/>
       <w:r>
         <w:rPr>
           <w:rFonts w:ascii="Times New Roman" w:eastAsia="Times New Roman" w:hAnsi="Times New Roman" w:cs="Times New Roman"/>
@@ -1473,7 +1434,6 @@
         <w:t>SoilSpirit</w:t>
       </w:r>
       <w:proofErr w:type="spellEnd"/>
-      <w:proofErr w:type="gramEnd"/>
       <w:r>
         <w:rPr>
           <w:rFonts w:ascii="Times New Roman" w:eastAsia="Times New Roman" w:hAnsi="Times New Roman" w:cs="Times New Roman"/>
@@ -2490,9 +2450,8 @@
           <w:sz w:val="24"/>
           <w:szCs w:val="24"/>
         </w:rPr>
-        <w:t>(DONE 2/</w:t>
-      </w:r>
-      <w:proofErr w:type="gramStart"/>
+        <w:t>(DONE 2/2</w:t>
+      </w:r>
       <w:r>
         <w:rPr>
           <w:rFonts w:ascii="Times New Roman" w:eastAsia="Times New Roman" w:hAnsi="Times New Roman" w:cs="Times New Roman"/>
@@ -2500,26 +2459,7 @@
           <w:sz w:val="24"/>
           <w:szCs w:val="24"/>
         </w:rPr>
-        <w:t>2</w:t>
-      </w:r>
-      <w:r>
-        <w:rPr>
-          <w:rFonts w:ascii="Times New Roman" w:eastAsia="Times New Roman" w:hAnsi="Times New Roman" w:cs="Times New Roman"/>
-          <w:color w:val="FF0000"/>
-          <w:sz w:val="24"/>
-          <w:szCs w:val="24"/>
-        </w:rPr>
-        <w:t>2</w:t>
-      </w:r>
-      <w:proofErr w:type="gramEnd"/>
-      <w:r>
-        <w:rPr>
-          <w:rFonts w:ascii="Times New Roman" w:eastAsia="Times New Roman" w:hAnsi="Times New Roman" w:cs="Times New Roman"/>
-          <w:color w:val="FF0000"/>
-          <w:sz w:val="24"/>
-          <w:szCs w:val="24"/>
-        </w:rPr>
-        <w:t>-2/24</w:t>
+        <w:t>2-2/24</w:t>
       </w:r>
       <w:r>
         <w:rPr>
@@ -2790,27 +2730,7 @@
           <w:sz w:val="24"/>
           <w:szCs w:val="24"/>
         </w:rPr>
-        <w:t xml:space="preserve">, Changed from USART to wireless due to camera already calling LLM </w:t>
-      </w:r>
-      <w:proofErr w:type="gramStart"/>
-      <w:r>
-        <w:rPr>
-          <w:rFonts w:ascii="Times New Roman" w:eastAsia="Times New Roman" w:hAnsi="Times New Roman" w:cs="Times New Roman"/>
-          <w:color w:val="FF0000"/>
-          <w:sz w:val="24"/>
-          <w:szCs w:val="24"/>
-        </w:rPr>
-        <w:t>API(</w:t>
-      </w:r>
-      <w:proofErr w:type="gramEnd"/>
-      <w:r>
-        <w:rPr>
-          <w:rFonts w:ascii="Times New Roman" w:eastAsia="Times New Roman" w:hAnsi="Times New Roman" w:cs="Times New Roman"/>
-          <w:color w:val="FF0000"/>
-          <w:sz w:val="24"/>
-          <w:szCs w:val="24"/>
-        </w:rPr>
-        <w:t>2/26/25)</w:t>
+        <w:t>, Changed from USART to wireless due to camera already calling LLM API(2/26/25)</w:t>
       </w:r>
     </w:p>
     <w:p>
@@ -2833,16 +2753,7 @@
           <w:sz w:val="24"/>
           <w:szCs w:val="24"/>
         </w:rPr>
-        <w:t xml:space="preserve">Test detection of different objects, conditions, and </w:t>
-      </w:r>
-      <w:proofErr w:type="gramStart"/>
-      <w:r>
-        <w:rPr>
-          <w:rFonts w:ascii="Times New Roman" w:eastAsia="Times New Roman" w:hAnsi="Times New Roman" w:cs="Times New Roman"/>
-          <w:sz w:val="24"/>
-          <w:szCs w:val="24"/>
-        </w:rPr>
-        <w:t xml:space="preserve">distances </w:t>
+        <w:t xml:space="preserve">Test detection of different objects, conditions, and distances </w:t>
       </w:r>
       <w:r>
         <w:rPr>
@@ -2859,17 +2770,7 @@
           <w:sz w:val="24"/>
           <w:szCs w:val="24"/>
         </w:rPr>
-        <w:t>(</w:t>
-      </w:r>
-      <w:proofErr w:type="gramEnd"/>
-      <w:r>
-        <w:rPr>
-          <w:rFonts w:ascii="Times New Roman" w:eastAsia="Times New Roman" w:hAnsi="Times New Roman" w:cs="Times New Roman"/>
-          <w:color w:val="FF0000"/>
-          <w:sz w:val="24"/>
-          <w:szCs w:val="24"/>
-        </w:rPr>
-        <w:t>DONE 2/2</w:t>
+        <w:t>(DONE 2/2</w:t>
       </w:r>
       <w:r>
         <w:rPr>
@@ -2956,16 +2857,7 @@
           <w:sz w:val="24"/>
           <w:szCs w:val="24"/>
         </w:rPr>
-        <w:t xml:space="preserve">ON/OFF/start/stop/left/right commands from motor control system </w:t>
-      </w:r>
-      <w:proofErr w:type="gramStart"/>
-      <w:r>
-        <w:rPr>
-          <w:rFonts w:ascii="Times New Roman" w:eastAsia="Times New Roman" w:hAnsi="Times New Roman" w:cs="Times New Roman"/>
-          <w:sz w:val="24"/>
-          <w:szCs w:val="24"/>
-        </w:rPr>
-        <w:t>interface</w:t>
+        <w:t>ON/OFF/start/stop/left/right commands from motor control system interface</w:t>
       </w:r>
       <w:r>
         <w:rPr>
@@ -2974,17 +2866,7 @@
           <w:sz w:val="24"/>
           <w:szCs w:val="24"/>
         </w:rPr>
-        <w:t>(</w:t>
-      </w:r>
-      <w:proofErr w:type="gramEnd"/>
-      <w:r>
-        <w:rPr>
-          <w:rFonts w:ascii="Times New Roman" w:eastAsia="Times New Roman" w:hAnsi="Times New Roman" w:cs="Times New Roman"/>
-          <w:color w:val="FF0000"/>
-          <w:sz w:val="24"/>
-          <w:szCs w:val="24"/>
-        </w:rPr>
-        <w:t>DONE 2/28)</w:t>
+        <w:t>(DONE 2/28)</w:t>
       </w:r>
     </w:p>
     <w:p>
@@ -3007,16 +2889,7 @@
           <w:sz w:val="24"/>
           <w:szCs w:val="24"/>
         </w:rPr>
-        <w:t xml:space="preserve">Setup start/stop commands from ESP32 camera that a user can send to start autonomous </w:t>
-      </w:r>
-      <w:proofErr w:type="gramStart"/>
-      <w:r>
-        <w:rPr>
-          <w:rFonts w:ascii="Times New Roman" w:eastAsia="Times New Roman" w:hAnsi="Times New Roman" w:cs="Times New Roman"/>
-          <w:sz w:val="24"/>
-          <w:szCs w:val="24"/>
-        </w:rPr>
-        <w:t>control</w:t>
+        <w:t>Setup start/stop commands from ESP32 camera that a user can send to start autonomous control</w:t>
       </w:r>
       <w:r>
         <w:rPr>
@@ -3025,17 +2898,7 @@
           <w:sz w:val="24"/>
           <w:szCs w:val="24"/>
         </w:rPr>
-        <w:t>(</w:t>
-      </w:r>
-      <w:proofErr w:type="gramEnd"/>
-      <w:r>
-        <w:rPr>
-          <w:rFonts w:ascii="Times New Roman" w:eastAsia="Times New Roman" w:hAnsi="Times New Roman" w:cs="Times New Roman"/>
-          <w:color w:val="FF0000"/>
-          <w:sz w:val="24"/>
-          <w:szCs w:val="24"/>
-        </w:rPr>
-        <w:t>DONE 2/28)</w:t>
+        <w:t>(DONE 2/28)</w:t>
       </w:r>
     </w:p>
     <w:p>
@@ -3052,23 +2915,13 @@
           <w:szCs w:val="24"/>
         </w:rPr>
       </w:pPr>
-      <w:proofErr w:type="gramStart"/>
-      <w:r>
-        <w:rPr>
-          <w:rFonts w:ascii="Times New Roman" w:eastAsia="Times New Roman" w:hAnsi="Times New Roman" w:cs="Times New Roman"/>
-          <w:sz w:val="24"/>
-          <w:szCs w:val="24"/>
-        </w:rPr>
-        <w:t>Setup</w:t>
-      </w:r>
-      <w:proofErr w:type="gramEnd"/>
-      <w:r>
-        <w:rPr>
-          <w:rFonts w:ascii="Times New Roman" w:eastAsia="Times New Roman" w:hAnsi="Times New Roman" w:cs="Times New Roman"/>
-          <w:sz w:val="24"/>
-          <w:szCs w:val="24"/>
-        </w:rPr>
-        <w:t xml:space="preserve"> ultrasonic sensors as an emergency stop</w:t>
+      <w:r>
+        <w:rPr>
+          <w:rFonts w:ascii="Times New Roman" w:eastAsia="Times New Roman" w:hAnsi="Times New Roman" w:cs="Times New Roman"/>
+          <w:sz w:val="24"/>
+          <w:szCs w:val="24"/>
+        </w:rPr>
+        <w:t>Setup ultrasonic sensors as an emergency stop</w:t>
       </w:r>
     </w:p>
     <w:p>
@@ -3338,43 +3191,7 @@
           <w:sz w:val="24"/>
           <w:szCs w:val="24"/>
         </w:rPr>
-        <w:t xml:space="preserve">of the XIAOS3 Cam by connecting it to an LLM and feeding the image captured to the LLM by sending the base64 encoded version to an API. I plan on starting with </w:t>
-      </w:r>
-      <w:proofErr w:type="gramStart"/>
-      <w:r>
-        <w:rPr>
-          <w:rFonts w:ascii="Times New Roman" w:eastAsia="Times New Roman" w:hAnsi="Times New Roman" w:cs="Times New Roman"/>
-          <w:sz w:val="24"/>
-          <w:szCs w:val="24"/>
-        </w:rPr>
-        <w:t>Claude, and</w:t>
-      </w:r>
-      <w:proofErr w:type="gramEnd"/>
-      <w:r>
-        <w:rPr>
-          <w:rFonts w:ascii="Times New Roman" w:eastAsia="Times New Roman" w:hAnsi="Times New Roman" w:cs="Times New Roman"/>
-          <w:sz w:val="24"/>
-          <w:szCs w:val="24"/>
-        </w:rPr>
-        <w:t xml:space="preserve"> then moving over to a local open-source LLM</w:t>
-      </w:r>
-      <w:proofErr w:type="gramStart"/>
-      <w:r>
-        <w:rPr>
-          <w:rFonts w:ascii="Times New Roman" w:eastAsia="Times New Roman" w:hAnsi="Times New Roman" w:cs="Times New Roman"/>
-          <w:sz w:val="24"/>
-          <w:szCs w:val="24"/>
-        </w:rPr>
-        <w:t xml:space="preserve"> I want</w:t>
-      </w:r>
-      <w:proofErr w:type="gramEnd"/>
-      <w:r>
-        <w:rPr>
-          <w:rFonts w:ascii="Times New Roman" w:eastAsia="Times New Roman" w:hAnsi="Times New Roman" w:cs="Times New Roman"/>
-          <w:sz w:val="24"/>
-          <w:szCs w:val="24"/>
-        </w:rPr>
-        <w:t xml:space="preserve"> to setup on my local router network, if time permits. </w:t>
+        <w:t xml:space="preserve">of the XIAOS3 Cam by connecting it to an LLM and feeding the image captured to the LLM by sending the base64 encoded version to an API. I plan on starting with Claude, and then moving over to a local open-source LLM I want to setup on my local router network, if time permits. </w:t>
       </w:r>
       <w:r>
         <w:rPr>
@@ -3384,9 +3201,8 @@
           <w:sz w:val="24"/>
           <w:szCs w:val="24"/>
         </w:rPr>
-        <w:t xml:space="preserve">ESP32 </w:t>
-      </w:r>
-      <w:proofErr w:type="gramStart"/>
+        <w:t xml:space="preserve">ESP32 cam </w:t>
+      </w:r>
       <w:r>
         <w:rPr>
           <w:rFonts w:ascii="Times New Roman" w:eastAsia="Times New Roman" w:hAnsi="Times New Roman" w:cs="Times New Roman"/>
@@ -3395,155 +3211,58 @@
           <w:sz w:val="24"/>
           <w:szCs w:val="24"/>
         </w:rPr>
-        <w:t>cam</w:t>
-      </w:r>
-      <w:proofErr w:type="gramEnd"/>
-      <w:r>
-        <w:rPr>
-          <w:rFonts w:ascii="Times New Roman" w:eastAsia="Times New Roman" w:hAnsi="Times New Roman" w:cs="Times New Roman"/>
-          <w:strike/>
+        <w:t>using the FOMO(Faster Objects, More Objects) Object detection from Edge Impulse. If I run into issue with the AI model or run into walls with performance I will revert to classic computer vision algorithms and do some feature extractions for less precise but still working object detection.</w:t>
+      </w:r>
+      <w:r>
+        <w:rPr>
+          <w:rFonts w:ascii="Times New Roman" w:eastAsia="Times New Roman" w:hAnsi="Times New Roman" w:cs="Times New Roman"/>
+          <w:sz w:val="24"/>
+          <w:szCs w:val="24"/>
+        </w:rPr>
+        <w:t xml:space="preserve"> </w:t>
+      </w:r>
+      <w:r>
+        <w:rPr>
+          <w:rFonts w:ascii="Times New Roman" w:eastAsia="Times New Roman" w:hAnsi="Times New Roman" w:cs="Times New Roman"/>
           <w:color w:val="FF0000"/>
           <w:sz w:val="24"/>
           <w:szCs w:val="24"/>
         </w:rPr>
-        <w:t xml:space="preserve"> </w:t>
-      </w:r>
-      <w:r>
-        <w:rPr>
-          <w:rFonts w:ascii="Times New Roman" w:eastAsia="Times New Roman" w:hAnsi="Times New Roman" w:cs="Times New Roman"/>
-          <w:strike/>
+        <w:t>(Changed 2/26/2025)</w:t>
+      </w:r>
+      <w:r>
+        <w:rPr>
+          <w:rFonts w:ascii="Times New Roman" w:eastAsia="Times New Roman" w:hAnsi="Times New Roman" w:cs="Times New Roman"/>
+          <w:sz w:val="24"/>
+          <w:szCs w:val="24"/>
+        </w:rPr>
+        <w:t xml:space="preserve"> I want to first test these systems by themselves and integrate them together with the </w:t>
+      </w:r>
+      <w:r>
+        <w:rPr>
+          <w:rFonts w:ascii="Times New Roman" w:eastAsia="Times New Roman" w:hAnsi="Times New Roman" w:cs="Times New Roman"/>
+          <w:sz w:val="24"/>
+          <w:szCs w:val="24"/>
+        </w:rPr>
+        <w:t>ESP32 ESP</w:t>
+      </w:r>
+      <w:r>
+        <w:rPr>
+          <w:rFonts w:ascii="Times New Roman" w:eastAsia="Times New Roman" w:hAnsi="Times New Roman" w:cs="Times New Roman"/>
+          <w:sz w:val="24"/>
+          <w:szCs w:val="24"/>
+        </w:rPr>
+        <w:t>-S</w:t>
+      </w:r>
+      <w:r>
+        <w:rPr>
+          <w:rFonts w:ascii="Times New Roman" w:eastAsia="Times New Roman" w:hAnsi="Times New Roman" w:cs="Times New Roman"/>
           <w:color w:val="FF0000"/>
           <w:sz w:val="24"/>
           <w:szCs w:val="24"/>
         </w:rPr>
-        <w:t xml:space="preserve">using the </w:t>
-      </w:r>
-      <w:proofErr w:type="gramStart"/>
-      <w:r>
-        <w:rPr>
-          <w:rFonts w:ascii="Times New Roman" w:eastAsia="Times New Roman" w:hAnsi="Times New Roman" w:cs="Times New Roman"/>
-          <w:strike/>
-          <w:color w:val="FF0000"/>
-          <w:sz w:val="24"/>
-          <w:szCs w:val="24"/>
-        </w:rPr>
-        <w:t>FOMO(</w:t>
-      </w:r>
-      <w:proofErr w:type="gramEnd"/>
-      <w:r>
-        <w:rPr>
-          <w:rFonts w:ascii="Times New Roman" w:eastAsia="Times New Roman" w:hAnsi="Times New Roman" w:cs="Times New Roman"/>
-          <w:strike/>
-          <w:color w:val="FF0000"/>
-          <w:sz w:val="24"/>
-          <w:szCs w:val="24"/>
-        </w:rPr>
-        <w:t xml:space="preserve">Faster Objects, More Objects) Object detection from Edge Impulse. If I run into </w:t>
-      </w:r>
-      <w:proofErr w:type="gramStart"/>
-      <w:r>
-        <w:rPr>
-          <w:rFonts w:ascii="Times New Roman" w:eastAsia="Times New Roman" w:hAnsi="Times New Roman" w:cs="Times New Roman"/>
-          <w:strike/>
-          <w:color w:val="FF0000"/>
-          <w:sz w:val="24"/>
-          <w:szCs w:val="24"/>
-        </w:rPr>
-        <w:t>issue</w:t>
-      </w:r>
-      <w:proofErr w:type="gramEnd"/>
-      <w:r>
-        <w:rPr>
-          <w:rFonts w:ascii="Times New Roman" w:eastAsia="Times New Roman" w:hAnsi="Times New Roman" w:cs="Times New Roman"/>
-          <w:strike/>
-          <w:color w:val="FF0000"/>
-          <w:sz w:val="24"/>
-          <w:szCs w:val="24"/>
-        </w:rPr>
-        <w:t xml:space="preserve"> with the AI model or run into walls with </w:t>
-      </w:r>
-      <w:proofErr w:type="gramStart"/>
-      <w:r>
-        <w:rPr>
-          <w:rFonts w:ascii="Times New Roman" w:eastAsia="Times New Roman" w:hAnsi="Times New Roman" w:cs="Times New Roman"/>
-          <w:strike/>
-          <w:color w:val="FF0000"/>
-          <w:sz w:val="24"/>
-          <w:szCs w:val="24"/>
-        </w:rPr>
-        <w:t>performance</w:t>
-      </w:r>
-      <w:proofErr w:type="gramEnd"/>
-      <w:r>
-        <w:rPr>
-          <w:rFonts w:ascii="Times New Roman" w:eastAsia="Times New Roman" w:hAnsi="Times New Roman" w:cs="Times New Roman"/>
-          <w:strike/>
-          <w:color w:val="FF0000"/>
-          <w:sz w:val="24"/>
-          <w:szCs w:val="24"/>
-        </w:rPr>
-        <w:t xml:space="preserve"> I will revert to classic computer vision algorithms and do some feature extractions for less precise but still working object detection.</w:t>
-      </w:r>
-      <w:r>
-        <w:rPr>
-          <w:rFonts w:ascii="Times New Roman" w:eastAsia="Times New Roman" w:hAnsi="Times New Roman" w:cs="Times New Roman"/>
-          <w:sz w:val="24"/>
-          <w:szCs w:val="24"/>
-        </w:rPr>
-        <w:t xml:space="preserve"> </w:t>
-      </w:r>
-      <w:r>
-        <w:rPr>
-          <w:rFonts w:ascii="Times New Roman" w:eastAsia="Times New Roman" w:hAnsi="Times New Roman" w:cs="Times New Roman"/>
-          <w:color w:val="FF0000"/>
-          <w:sz w:val="24"/>
-          <w:szCs w:val="24"/>
-        </w:rPr>
-        <w:t>(Changed 2/26/2025)</w:t>
-      </w:r>
-      <w:r>
-        <w:rPr>
-          <w:rFonts w:ascii="Times New Roman" w:eastAsia="Times New Roman" w:hAnsi="Times New Roman" w:cs="Times New Roman"/>
-          <w:sz w:val="24"/>
-          <w:szCs w:val="24"/>
-        </w:rPr>
-        <w:t xml:space="preserve"> I want to first test these systems by themselves and integrate them together with the </w:t>
-      </w:r>
-      <w:r>
-        <w:rPr>
-          <w:rFonts w:ascii="Times New Roman" w:eastAsia="Times New Roman" w:hAnsi="Times New Roman" w:cs="Times New Roman"/>
-          <w:sz w:val="24"/>
-          <w:szCs w:val="24"/>
-        </w:rPr>
-        <w:t>ESP32 ESP</w:t>
-      </w:r>
-      <w:r>
-        <w:rPr>
-          <w:rFonts w:ascii="Times New Roman" w:eastAsia="Times New Roman" w:hAnsi="Times New Roman" w:cs="Times New Roman"/>
-          <w:sz w:val="24"/>
-          <w:szCs w:val="24"/>
-        </w:rPr>
-        <w:t>-</w:t>
-      </w:r>
-      <w:proofErr w:type="gramStart"/>
-      <w:r>
-        <w:rPr>
-          <w:rFonts w:ascii="Times New Roman" w:eastAsia="Times New Roman" w:hAnsi="Times New Roman" w:cs="Times New Roman"/>
-          <w:sz w:val="24"/>
-          <w:szCs w:val="24"/>
-        </w:rPr>
-        <w:t>S</w:t>
-      </w:r>
-      <w:r>
-        <w:rPr>
-          <w:rFonts w:ascii="Times New Roman" w:eastAsia="Times New Roman" w:hAnsi="Times New Roman" w:cs="Times New Roman"/>
-          <w:color w:val="FF0000"/>
-          <w:sz w:val="24"/>
-          <w:szCs w:val="24"/>
-        </w:rPr>
         <w:t>(</w:t>
       </w:r>
-      <w:proofErr w:type="gramEnd"/>
       <w:r>
         <w:rPr>
           <w:rFonts w:ascii="Times New Roman" w:eastAsia="Times New Roman" w:hAnsi="Times New Roman" w:cs="Times New Roman"/>
@@ -3792,18 +3511,16 @@
           <w:sz w:val="24"/>
           <w:szCs w:val="24"/>
         </w:rPr>
-        <w:t xml:space="preserve">connected through </w:t>
-      </w:r>
-      <w:proofErr w:type="gramStart"/>
-      <w:r>
-        <w:rPr>
-          <w:rFonts w:ascii="Times New Roman" w:eastAsia="Times New Roman" w:hAnsi="Times New Roman" w:cs="Times New Roman"/>
-          <w:strike/>
+        <w:t>connected through USART</w:t>
+      </w:r>
+      <w:r>
+        <w:rPr>
+          <w:rFonts w:ascii="Times New Roman" w:eastAsia="Times New Roman" w:hAnsi="Times New Roman" w:cs="Times New Roman"/>
           <w:color w:val="FF0000"/>
           <w:sz w:val="24"/>
           <w:szCs w:val="24"/>
         </w:rPr>
-        <w:t>USART</w:t>
+        <w:t>(Changed on 2/26/2025)</w:t>
       </w:r>
       <w:r>
         <w:rPr>
@@ -3812,25 +3529,6 @@
           <w:sz w:val="24"/>
           <w:szCs w:val="24"/>
         </w:rPr>
-        <w:t>(</w:t>
-      </w:r>
-      <w:proofErr w:type="gramEnd"/>
-      <w:r>
-        <w:rPr>
-          <w:rFonts w:ascii="Times New Roman" w:eastAsia="Times New Roman" w:hAnsi="Times New Roman" w:cs="Times New Roman"/>
-          <w:color w:val="FF0000"/>
-          <w:sz w:val="24"/>
-          <w:szCs w:val="24"/>
-        </w:rPr>
-        <w:t>Changed on 2/26/2025)</w:t>
-      </w:r>
-      <w:r>
-        <w:rPr>
-          <w:rFonts w:ascii="Times New Roman" w:eastAsia="Times New Roman" w:hAnsi="Times New Roman" w:cs="Times New Roman"/>
-          <w:color w:val="FF0000"/>
-          <w:sz w:val="24"/>
-          <w:szCs w:val="24"/>
-        </w:rPr>
         <w:t xml:space="preserve"> </w:t>
       </w:r>
       <w:r>
@@ -3951,43 +3649,7 @@
           <w:sz w:val="24"/>
           <w:szCs w:val="24"/>
         </w:rPr>
-        <w:t xml:space="preserve">powered using pulse width modulation on Left/Right commands. The DC motors will be powered ON/OFF/Forward/Backwards depending on commands from the ESP32 Camera. As a backup object detection system there will also be an ultrasonic sensor used for emergency object detection in case that the camera goes offline or misses something. As stated </w:t>
-      </w:r>
-      <w:proofErr w:type="gramStart"/>
-      <w:r>
-        <w:rPr>
-          <w:rFonts w:ascii="Times New Roman" w:eastAsia="Times New Roman" w:hAnsi="Times New Roman" w:cs="Times New Roman"/>
-          <w:sz w:val="24"/>
-          <w:szCs w:val="24"/>
-        </w:rPr>
-        <w:t>earlier</w:t>
-      </w:r>
-      <w:proofErr w:type="gramEnd"/>
-      <w:r>
-        <w:rPr>
-          <w:rFonts w:ascii="Times New Roman" w:eastAsia="Times New Roman" w:hAnsi="Times New Roman" w:cs="Times New Roman"/>
-          <w:sz w:val="24"/>
-          <w:szCs w:val="24"/>
-        </w:rPr>
-        <w:t xml:space="preserve"> the mechanical design of the </w:t>
-      </w:r>
-      <w:proofErr w:type="gramStart"/>
-      <w:r>
-        <w:rPr>
-          <w:rFonts w:ascii="Times New Roman" w:eastAsia="Times New Roman" w:hAnsi="Times New Roman" w:cs="Times New Roman"/>
-          <w:sz w:val="24"/>
-          <w:szCs w:val="24"/>
-        </w:rPr>
-        <w:t>rovers</w:t>
-      </w:r>
-      <w:proofErr w:type="gramEnd"/>
-      <w:r>
-        <w:rPr>
-          <w:rFonts w:ascii="Times New Roman" w:eastAsia="Times New Roman" w:hAnsi="Times New Roman" w:cs="Times New Roman"/>
-          <w:sz w:val="24"/>
-          <w:szCs w:val="24"/>
-        </w:rPr>
-        <w:t xml:space="preserve"> rocker-bogie suspension system was predesigned but I only plan on using the suspension and will be using a custom chassis and slightly different electronics. </w:t>
+        <w:t xml:space="preserve">powered using pulse width modulation on Left/Right commands. The DC motors will be powered ON/OFF/Forward/Backwards depending on commands from the ESP32 Camera. As a backup object detection system there will also be an ultrasonic sensor used for emergency object detection in case that the camera goes offline or misses something. As stated earlier the mechanical design of the rovers rocker-bogie suspension system was predesigned but I only plan on using the suspension and will be using a custom chassis and slightly different electronics. </w:t>
       </w:r>
       <w:r>
         <w:rPr>
@@ -3996,25 +3658,7 @@
           <w:szCs w:val="24"/>
         </w:rPr>
         <w:br/>
-        <w:t xml:space="preserve">As for the Hopper trailer, this will be </w:t>
-      </w:r>
-      <w:proofErr w:type="gramStart"/>
-      <w:r>
-        <w:rPr>
-          <w:rFonts w:ascii="Times New Roman" w:eastAsia="Times New Roman" w:hAnsi="Times New Roman" w:cs="Times New Roman"/>
-          <w:sz w:val="24"/>
-          <w:szCs w:val="24"/>
-        </w:rPr>
-        <w:t>3D printed</w:t>
-      </w:r>
-      <w:proofErr w:type="gramEnd"/>
-      <w:r>
-        <w:rPr>
-          <w:rFonts w:ascii="Times New Roman" w:eastAsia="Times New Roman" w:hAnsi="Times New Roman" w:cs="Times New Roman"/>
-          <w:sz w:val="24"/>
-          <w:szCs w:val="24"/>
-        </w:rPr>
-        <w:t xml:space="preserve"> and contain no electronics. It will consist of a hopper module that feeds the fertilizer/seed to a trap door which is opened/closed based on a spring which will be connected to the rover so that upon it moving the trap door will open/close.</w:t>
+        <w:t>As for the Hopper trailer, this will be 3D printed and contain no electronics. It will consist of a hopper module that feeds the fertilizer/seed to a trap door which is opened/closed based on a spring which will be connected to the rover so that upon it moving the trap door will open/close.</w:t>
       </w:r>
       <w:r>
         <w:rPr>
@@ -4604,7 +4248,6 @@
         <w:t xml:space="preserve"> to try and build a smaller frame that is more ergonomic and easier to replace, but that is a major stretch goal </w:t>
       </w:r>
       <w:proofErr w:type="spellStart"/>
-      <w:proofErr w:type="gramStart"/>
       <w:r>
         <w:rPr>
           <w:rFonts w:ascii="Times New Roman" w:eastAsia="Times New Roman" w:hAnsi="Times New Roman" w:cs="Times New Roman"/>
@@ -4614,7 +4257,6 @@
         <w:t>abit</w:t>
       </w:r>
       <w:proofErr w:type="spellEnd"/>
-      <w:proofErr w:type="gramEnd"/>
       <w:r>
         <w:rPr>
           <w:rFonts w:ascii="Times New Roman" w:eastAsia="Times New Roman" w:hAnsi="Times New Roman" w:cs="Times New Roman"/>
@@ -4637,43 +4279,7 @@
           <w:sz w:val="24"/>
           <w:szCs w:val="24"/>
         </w:rPr>
-        <w:t xml:space="preserve"> I plan on using some of the </w:t>
-      </w:r>
-      <w:proofErr w:type="gramStart"/>
-      <w:r>
-        <w:rPr>
-          <w:rFonts w:ascii="Times New Roman" w:eastAsia="Times New Roman" w:hAnsi="Times New Roman" w:cs="Times New Roman"/>
-          <w:sz w:val="24"/>
-          <w:szCs w:val="24"/>
-        </w:rPr>
-        <w:t>3d</w:t>
-      </w:r>
-      <w:proofErr w:type="gramEnd"/>
-      <w:r>
-        <w:rPr>
-          <w:rFonts w:ascii="Times New Roman" w:eastAsia="Times New Roman" w:hAnsi="Times New Roman" w:cs="Times New Roman"/>
-          <w:sz w:val="24"/>
-          <w:szCs w:val="24"/>
-        </w:rPr>
-        <w:t xml:space="preserve"> printed NASA hexagon fabric to cover the chassis and allow it to have a soft body which is easy to replace while still being </w:t>
-      </w:r>
-      <w:proofErr w:type="gramStart"/>
-      <w:r>
-        <w:rPr>
-          <w:rFonts w:ascii="Times New Roman" w:eastAsia="Times New Roman" w:hAnsi="Times New Roman" w:cs="Times New Roman"/>
-          <w:sz w:val="24"/>
-          <w:szCs w:val="24"/>
-        </w:rPr>
-        <w:t>really strong</w:t>
-      </w:r>
-      <w:proofErr w:type="gramEnd"/>
-      <w:r>
-        <w:rPr>
-          <w:rFonts w:ascii="Times New Roman" w:eastAsia="Times New Roman" w:hAnsi="Times New Roman" w:cs="Times New Roman"/>
-          <w:sz w:val="24"/>
-          <w:szCs w:val="24"/>
-        </w:rPr>
-        <w:t xml:space="preserve">. </w:t>
+        <w:t xml:space="preserve"> I plan on using some of the 3d printed NASA hexagon fabric to cover the chassis and allow it to have a soft body which is easy to replace while still being really strong. </w:t>
       </w:r>
       <w:r>
         <w:rPr>
@@ -4897,25 +4503,7 @@
           <w:sz w:val="24"/>
           <w:szCs w:val="24"/>
         </w:rPr>
-        <w:t xml:space="preserve">This project will go through testing and evaluation across many different levels. Each system will be </w:t>
-      </w:r>
-      <w:proofErr w:type="gramStart"/>
-      <w:r>
-        <w:rPr>
-          <w:rFonts w:ascii="Times New Roman" w:eastAsia="Times New Roman" w:hAnsi="Times New Roman" w:cs="Times New Roman"/>
-          <w:sz w:val="24"/>
-          <w:szCs w:val="24"/>
-        </w:rPr>
-        <w:t>broken up</w:t>
-      </w:r>
-      <w:proofErr w:type="gramEnd"/>
-      <w:r>
-        <w:rPr>
-          <w:rFonts w:ascii="Times New Roman" w:eastAsia="Times New Roman" w:hAnsi="Times New Roman" w:cs="Times New Roman"/>
-          <w:sz w:val="24"/>
-          <w:szCs w:val="24"/>
-        </w:rPr>
-        <w:t xml:space="preserve"> into modular parts and tested independently (unit tests) and in junction with other systems (integration tests). Each section of the evaluation criteria represents one system and will be tested as such. </w:t>
+        <w:t xml:space="preserve">This project will go through testing and evaluation across many different levels. Each system will be broken up into modular parts and tested independently (unit tests) and in junction with other systems (integration tests). Each section of the evaluation criteria represents one system and will be tested as such. </w:t>
       </w:r>
       <w:r>
         <w:rPr>
@@ -4931,25 +4519,7 @@
           <w:sz w:val="24"/>
           <w:szCs w:val="24"/>
         </w:rPr>
-        <w:t xml:space="preserve"> for example, the motor control of each wheel module will be tested independently and then together, then </w:t>
-      </w:r>
-      <w:proofErr w:type="gramStart"/>
-      <w:r>
-        <w:rPr>
-          <w:rFonts w:ascii="Times New Roman" w:eastAsia="Times New Roman" w:hAnsi="Times New Roman" w:cs="Times New Roman"/>
-          <w:sz w:val="24"/>
-          <w:szCs w:val="24"/>
-        </w:rPr>
-        <w:t>as a whole for</w:t>
-      </w:r>
-      <w:proofErr w:type="gramEnd"/>
-      <w:r>
-        <w:rPr>
-          <w:rFonts w:ascii="Times New Roman" w:eastAsia="Times New Roman" w:hAnsi="Times New Roman" w:cs="Times New Roman"/>
-          <w:sz w:val="24"/>
-          <w:szCs w:val="24"/>
-        </w:rPr>
-        <w:t xml:space="preserve"> the rover, then also integrated as part of the full autonomous system. On top of this the requirements I stated at the beginning of this brief either need to be met or show areas that need improvement. For clarity</w:t>
+        <w:t xml:space="preserve"> for example, the motor control of each wheel module will be tested independently and then together, then as a whole for the rover, then also integrated as part of the full autonomous system. On top of this the requirements I stated at the beginning of this brief either need to be met or show areas that need improvement. For clarity</w:t>
       </w:r>
       <w:r>
         <w:rPr>
@@ -5297,27 +4867,7 @@
           <w:i/>
           <w:u w:val="single"/>
         </w:rPr>
-        <w:t xml:space="preserve">Note: This section must </w:t>
-      </w:r>
-      <w:proofErr w:type="gramStart"/>
-      <w:r>
-        <w:rPr>
-          <w:rFonts w:ascii="Times New Roman" w:eastAsia="Times New Roman" w:hAnsi="Times New Roman" w:cs="Times New Roman"/>
-          <w:b/>
-          <w:i/>
-          <w:u w:val="single"/>
-        </w:rPr>
-        <w:t>completed</w:t>
-      </w:r>
-      <w:proofErr w:type="gramEnd"/>
-      <w:r>
-        <w:rPr>
-          <w:rFonts w:ascii="Times New Roman" w:eastAsia="Times New Roman" w:hAnsi="Times New Roman" w:cs="Times New Roman"/>
-          <w:b/>
-          <w:i/>
-          <w:u w:val="single"/>
-        </w:rPr>
-        <w:t xml:space="preserve"> prior to SIP403/409.</w:t>
+        <w:t>Note: This section must completed prior to SIP403/409.</w:t>
       </w:r>
     </w:p>
     <w:p>
@@ -5335,43 +4885,7 @@
           <w:sz w:val="24"/>
           <w:szCs w:val="24"/>
         </w:rPr>
-        <w:t xml:space="preserve">Provide an in-depth description of the completion assessment of your project. Describe how well the </w:t>
-      </w:r>
-      <w:proofErr w:type="gramStart"/>
-      <w:r>
-        <w:rPr>
-          <w:rFonts w:ascii="Times New Roman" w:eastAsia="Times New Roman" w:hAnsi="Times New Roman" w:cs="Times New Roman"/>
-          <w:sz w:val="24"/>
-          <w:szCs w:val="24"/>
-        </w:rPr>
-        <w:t>completed</w:t>
-      </w:r>
-      <w:proofErr w:type="gramEnd"/>
-      <w:r>
-        <w:rPr>
-          <w:rFonts w:ascii="Times New Roman" w:eastAsia="Times New Roman" w:hAnsi="Times New Roman" w:cs="Times New Roman"/>
-          <w:sz w:val="24"/>
-          <w:szCs w:val="24"/>
-        </w:rPr>
-        <w:t xml:space="preserve"> components function and highlight the innovative facets of your design.  This is sometimes known as a “Post-Mortem” or “Lessons-Learned Report”.  A good approach for this section is to answer the following 4 questions</w:t>
-      </w:r>
-      <w:proofErr w:type="gramStart"/>
-      <w:r>
-        <w:rPr>
-          <w:rFonts w:ascii="Times New Roman" w:eastAsia="Times New Roman" w:hAnsi="Times New Roman" w:cs="Times New Roman"/>
-          <w:sz w:val="24"/>
-          <w:szCs w:val="24"/>
-        </w:rPr>
-        <w:t>:  “</w:t>
-      </w:r>
-      <w:proofErr w:type="gramEnd"/>
-      <w:r>
-        <w:rPr>
-          <w:rFonts w:ascii="Times New Roman" w:eastAsia="Times New Roman" w:hAnsi="Times New Roman" w:cs="Times New Roman"/>
-          <w:sz w:val="24"/>
-          <w:szCs w:val="24"/>
-        </w:rPr>
-        <w:t>What went right?  What went wrong? What was learned throughout the process? What would be done differently if you had to do it again?</w:t>
+        <w:t>Provide an in-depth description of the completion assessment of your project. Describe how well the completed components function and highlight the innovative facets of your design.  This is sometimes known as a “Post-Mortem” or “Lessons-Learned Report”.  A good approach for this section is to answer the following 4 questions:  “What went right?  What went wrong? What was learned throughout the process? What would be done differently if you had to do it again?</w:t>
       </w:r>
     </w:p>
     <w:p>
@@ -5710,11 +5224,6 @@
     <w:p>
       <w:pPr>
         <w:ind w:left="720" w:hanging="720"/>
-        <w:rPr>
-          <w:rFonts w:ascii="Times New Roman" w:hAnsi="Times New Roman" w:cs="Times New Roman"/>
-          <w:sz w:val="24"/>
-          <w:szCs w:val="24"/>
-        </w:rPr>
       </w:pPr>
       <w:proofErr w:type="spellStart"/>
       <w:r>
@@ -5797,9 +5306,65 @@
           <w:sz w:val="24"/>
           <w:szCs w:val="24"/>
         </w:rPr>
+        <w:t xml:space="preserve">Printables. (n.d.). XIAO Sense Case - </w:t>
+      </w:r>
+      <w:proofErr w:type="spellStart"/>
+      <w:r>
+        <w:rPr>
+          <w:rFonts w:ascii="Times New Roman" w:hAnsi="Times New Roman" w:cs="Times New Roman"/>
+          <w:sz w:val="24"/>
+          <w:szCs w:val="24"/>
+        </w:rPr>
+        <w:t>Seeed</w:t>
+      </w:r>
+      <w:proofErr w:type="spellEnd"/>
+      <w:r>
+        <w:rPr>
+          <w:rFonts w:ascii="Times New Roman" w:hAnsi="Times New Roman" w:cs="Times New Roman"/>
+          <w:sz w:val="24"/>
+          <w:szCs w:val="24"/>
+        </w:rPr>
+        <w:t xml:space="preserve"> Studio XIAO ESP32S3 Sense Case. Retrieved March 4, 2025, from </w:t>
+      </w:r>
+      <w:hyperlink r:id="rId15" w:history="1">
+        <w:r>
+          <w:rPr>
+            <w:rStyle w:val="Hyperlink"/>
+            <w:rFonts w:ascii="Times New Roman" w:hAnsi="Times New Roman" w:cs="Times New Roman"/>
+            <w:sz w:val="24"/>
+            <w:szCs w:val="24"/>
+          </w:rPr>
+          <w:t>https://www.printables.com/model/681623-xiao-sense-case-seeed-studio-xiao-esp32s3-sense-ca/files</w:t>
+        </w:r>
+      </w:hyperlink>
+      <w:r>
+        <w:rPr>
+          <w:rFonts w:ascii="Times New Roman" w:hAnsi="Times New Roman" w:cs="Times New Roman"/>
+          <w:sz w:val="24"/>
+          <w:szCs w:val="24"/>
+        </w:rPr>
+        <w:t xml:space="preserve"> </w:t>
+      </w:r>
+    </w:p>
+    <w:p>
+      <w:pPr>
+        <w:ind w:left="720" w:hanging="720"/>
+        <w:rPr>
+          <w:rFonts w:ascii="Times New Roman" w:hAnsi="Times New Roman" w:cs="Times New Roman"/>
+          <w:sz w:val="24"/>
+          <w:szCs w:val="24"/>
+        </w:rPr>
+      </w:pPr>
+      <w:r>
+        <w:rPr>
+          <w:rFonts w:ascii="Times New Roman" w:hAnsi="Times New Roman" w:cs="Times New Roman"/>
+          <w:sz w:val="24"/>
+          <w:szCs w:val="24"/>
+        </w:rPr>
+        <w:lastRenderedPageBreak/>
         <w:t xml:space="preserve">Raven Industries. (n.d.). Case IH Trident 5550 applicator with Raven autonomy. Retrieved February 18, 2025, from </w:t>
       </w:r>
-      <w:hyperlink r:id="rId15" w:history="1">
+      <w:hyperlink r:id="rId16" w:history="1">
         <w:r>
           <w:rPr>
             <w:rStyle w:val="Hyperlink"/>
@@ -5826,10 +5391,9 @@
           <w:sz w:val="24"/>
           <w:szCs w:val="24"/>
         </w:rPr>
-        <w:lastRenderedPageBreak/>
         <w:t xml:space="preserve">Shekhar, C., &amp; Singh, S. (2017). Design of rocker-bogie mechanism. International Journal of Innovative Science and Research Technology. Retrieved from </w:t>
       </w:r>
-      <w:hyperlink r:id="rId16" w:history="1">
+      <w:hyperlink r:id="rId17" w:history="1">
         <w:r>
           <w:rPr>
             <w:rStyle w:val="Hyperlink"/>
@@ -8314,7 +7878,6 @@
   <w:style w:type="character" w:default="1" w:styleId="DefaultParagraphFont">
     <w:name w:val="Default Paragraph Font"/>
     <w:uiPriority w:val="1"/>
-    <w:semiHidden/>
     <w:unhideWhenUsed/>
   </w:style>
   <w:style w:type="table" w:default="1" w:styleId="TableNormal">

</xml_diff>

<commit_message>
Updated brief and finalized prototype GANNT
</commit_message>
<xml_diff>
--- a/Docs/Rocha Innovation Brief.docx
+++ b/Docs/Rocha Innovation Brief.docx
@@ -8,6 +8,8 @@
           <w:rFonts w:ascii="Times New Roman" w:eastAsia="Times New Roman" w:hAnsi="Times New Roman" w:cs="Times New Roman"/>
         </w:rPr>
       </w:pPr>
+      <w:bookmarkStart w:id="0" w:name="_Hlk192984099"/>
+      <w:bookmarkEnd w:id="0"/>
       <w:r>
         <w:rPr>
           <w:rFonts w:ascii="Times New Roman" w:eastAsia="Times New Roman" w:hAnsi="Times New Roman" w:cs="Times New Roman"/>
@@ -29,7 +31,6 @@
           <w:szCs w:val="48"/>
         </w:rPr>
       </w:pPr>
-      <w:proofErr w:type="spellStart"/>
       <w:r>
         <w:rPr>
           <w:rFonts w:ascii="Times New Roman" w:eastAsia="Times New Roman" w:hAnsi="Times New Roman" w:cs="Times New Roman"/>
@@ -39,7 +40,6 @@
         </w:rPr>
         <w:t>SoilSpirit</w:t>
       </w:r>
-      <w:proofErr w:type="spellEnd"/>
     </w:p>
     <w:p>
       <w:pPr>
@@ -282,7 +282,7 @@
           <w:sz w:val="28"/>
           <w:szCs w:val="28"/>
         </w:rPr>
-        <w:t>3</w:t>
+        <w:t>15</w:t>
       </w:r>
       <w:r>
         <w:rPr>
@@ -346,8 +346,8 @@
         <w:pStyle w:val="Heading2"/>
         <w:spacing w:before="60" w:after="60"/>
       </w:pPr>
-      <w:bookmarkStart w:id="0" w:name="_odebh5hn1avy" w:colFirst="0" w:colLast="0"/>
-      <w:bookmarkEnd w:id="0"/>
+      <w:bookmarkStart w:id="1" w:name="_odebh5hn1avy" w:colFirst="0" w:colLast="0"/>
+      <w:bookmarkEnd w:id="1"/>
       <w:r>
         <w:t>Technical Field</w:t>
       </w:r>
@@ -383,8 +383,8 @@
         <w:pStyle w:val="Heading2"/>
         <w:spacing w:before="60" w:after="60"/>
       </w:pPr>
-      <w:bookmarkStart w:id="1" w:name="_9tkz0kg61k12" w:colFirst="0" w:colLast="0"/>
-      <w:bookmarkEnd w:id="1"/>
+      <w:bookmarkStart w:id="2" w:name="_9tkz0kg61k12" w:colFirst="0" w:colLast="0"/>
+      <w:bookmarkEnd w:id="2"/>
       <w:r>
         <w:t>Background Information</w:t>
       </w:r>
@@ -444,25 +444,7 @@
           <w:sz w:val="24"/>
           <w:szCs w:val="24"/>
         </w:rPr>
-        <w:t xml:space="preserve">put into this layer of material. It leads to healthy plants and soil, reduces weeds, and allows for better water conditions for the plants (Dowding, 2024). </w:t>
-      </w:r>
-      <w:proofErr w:type="spellStart"/>
-      <w:r>
-        <w:rPr>
-          <w:rFonts w:ascii="Times New Roman" w:eastAsia="Times New Roman" w:hAnsi="Times New Roman" w:cs="Times New Roman"/>
-          <w:sz w:val="24"/>
-          <w:szCs w:val="24"/>
-        </w:rPr>
-        <w:t>SoilSpirit</w:t>
-      </w:r>
-      <w:proofErr w:type="spellEnd"/>
-      <w:r>
-        <w:rPr>
-          <w:rFonts w:ascii="Times New Roman" w:eastAsia="Times New Roman" w:hAnsi="Times New Roman" w:cs="Times New Roman"/>
-          <w:sz w:val="24"/>
-          <w:szCs w:val="24"/>
-        </w:rPr>
-        <w:t xml:space="preserve"> plans to reduce the physical strain on small farms and gardeners through the automation of compost and seed spreading. While also having a small enough footprint that it does not compact the soil or cause unwanted tilling/digging of the compost. It takes inspiration from simple autonomous vehicles for obstacle avoidance and the Mars rovers (Spirit, Curiosity, Perseverance) for its rocker-bogie suspension system.</w:t>
+        <w:t>put into this layer of material. It leads to healthy plants and soil, reduces weeds, and allows for better water conditions for the plants (Dowding, 2024). SoilSpirit plans to reduce the physical strain on small farms and gardeners through the automation of compost and seed spreading. While also having a small enough footprint that it does not compact the soil or cause unwanted tilling/digging of the compost. It takes inspiration from simple autonomous vehicles for obstacle avoidance and the Mars rovers (Spirit, Curiosity, Perseverance) for its rocker-bogie suspension system.</w:t>
       </w:r>
     </w:p>
     <w:p>
@@ -488,99 +470,61 @@
           <w:sz w:val="24"/>
           <w:szCs w:val="24"/>
         </w:rPr>
-        <w:t xml:space="preserve">The design of the product was heavily influenced by the Mars rovers and the 3d models of the initial prototype come from the </w:t>
-      </w:r>
-      <w:proofErr w:type="spellStart"/>
+        <w:t xml:space="preserve">The design of the product was heavily influenced by the Mars rovers and the 3d models of the initial prototype come from the Instructables tutorial in </w:t>
+      </w:r>
       <w:r>
         <w:rPr>
           <w:rFonts w:ascii="Times New Roman" w:hAnsi="Times New Roman" w:cs="Times New Roman"/>
-          <w:sz w:val="24"/>
-          <w:szCs w:val="24"/>
-        </w:rPr>
-        <w:t>Instructables</w:t>
-      </w:r>
-      <w:proofErr w:type="spellEnd"/>
+          <w:b/>
+          <w:bCs/>
+          <w:sz w:val="24"/>
+          <w:szCs w:val="24"/>
+        </w:rPr>
+        <w:t>Appendix</w:t>
+      </w:r>
       <w:r>
         <w:rPr>
           <w:rFonts w:ascii="Times New Roman" w:hAnsi="Times New Roman" w:cs="Times New Roman"/>
-          <w:sz w:val="24"/>
-          <w:szCs w:val="24"/>
-        </w:rPr>
-        <w:t xml:space="preserve"> tutorial in </w:t>
-      </w:r>
-      <w:proofErr w:type="spellStart"/>
+          <w:b/>
+          <w:bCs/>
+          <w:sz w:val="24"/>
+          <w:szCs w:val="24"/>
+        </w:rPr>
+        <w:t>C</w:t>
+      </w:r>
       <w:r>
         <w:rPr>
           <w:rFonts w:ascii="Times New Roman" w:hAnsi="Times New Roman" w:cs="Times New Roman"/>
+          <w:sz w:val="24"/>
+          <w:szCs w:val="24"/>
+        </w:rPr>
+        <w:t>.</w:t>
+      </w:r>
+      <w:r>
+        <w:rPr>
+          <w:rFonts w:ascii="Times New Roman" w:hAnsi="Times New Roman" w:cs="Times New Roman"/>
           <w:b/>
           <w:bCs/>
           <w:sz w:val="24"/>
           <w:szCs w:val="24"/>
         </w:rPr>
-        <w:t>Appendix</w:t>
+        <w:t xml:space="preserve"> </w:t>
       </w:r>
       <w:r>
         <w:rPr>
           <w:rFonts w:ascii="Times New Roman" w:hAnsi="Times New Roman" w:cs="Times New Roman"/>
-          <w:b/>
-          <w:bCs/>
-          <w:sz w:val="24"/>
-          <w:szCs w:val="24"/>
-        </w:rPr>
-        <w:t>C</w:t>
-      </w:r>
-      <w:proofErr w:type="spellEnd"/>
+          <w:sz w:val="24"/>
+          <w:szCs w:val="24"/>
+        </w:rPr>
+        <w:t xml:space="preserve">The suspension system of this rover comes from a </w:t>
+      </w:r>
       <w:r>
         <w:rPr>
           <w:rFonts w:ascii="Times New Roman" w:hAnsi="Times New Roman" w:cs="Times New Roman"/>
           <w:sz w:val="24"/>
           <w:szCs w:val="24"/>
         </w:rPr>
-        <w:t>.</w:t>
-      </w:r>
-      <w:r>
-        <w:rPr>
-          <w:rFonts w:ascii="Times New Roman" w:hAnsi="Times New Roman" w:cs="Times New Roman"/>
-          <w:b/>
-          <w:bCs/>
-          <w:sz w:val="24"/>
-          <w:szCs w:val="24"/>
-        </w:rPr>
-        <w:t xml:space="preserve"> </w:t>
-      </w:r>
-      <w:r>
-        <w:rPr>
-          <w:rFonts w:ascii="Times New Roman" w:hAnsi="Times New Roman" w:cs="Times New Roman"/>
-          <w:sz w:val="24"/>
-          <w:szCs w:val="24"/>
-        </w:rPr>
-        <w:t xml:space="preserve">The suspension system of this rover comes from a </w:t>
-      </w:r>
-      <w:r>
-        <w:rPr>
-          <w:rFonts w:ascii="Times New Roman" w:hAnsi="Times New Roman" w:cs="Times New Roman"/>
-          <w:sz w:val="24"/>
-          <w:szCs w:val="24"/>
-        </w:rPr>
-        <w:t xml:space="preserve">direct iteration of the Rocker Bogie Mechanism popularized by the Mars rovers Curiosity and Perseverance. As for similar products, the closest to my idea is an autonomous spreader built by Raven Industries. It is an industrial vehicle that is autonomous. It is great for automation for large scale farms but would not benefit gardeners, homesteaders, and small-scale farms wanting to use no dig gardening. Another similar product that is of the same form factor/user is </w:t>
-      </w:r>
-      <w:proofErr w:type="spellStart"/>
-      <w:r>
-        <w:rPr>
-          <w:rFonts w:ascii="Times New Roman" w:hAnsi="Times New Roman" w:cs="Times New Roman"/>
-          <w:sz w:val="24"/>
-          <w:szCs w:val="24"/>
-        </w:rPr>
-        <w:t>FarmBot</w:t>
-      </w:r>
-      <w:proofErr w:type="spellEnd"/>
-      <w:r>
-        <w:rPr>
-          <w:rFonts w:ascii="Times New Roman" w:hAnsi="Times New Roman" w:cs="Times New Roman"/>
-          <w:sz w:val="24"/>
-          <w:szCs w:val="24"/>
-        </w:rPr>
-        <w:t xml:space="preserve">. A CNC based garden bed that automates the process of growing food entirely. This company will be a direct competitor with the main difference being our modes of distribution. Their machine is directly attached to a garden bed whereas mine can drive around and be used for different types of gardens, farms, and homesteads. </w:t>
+        <w:t xml:space="preserve">direct iteration of the Rocker Bogie Mechanism popularized by the Mars rovers Curiosity and Perseverance. As for similar products, the closest to my idea is an autonomous spreader built by Raven Industries. It is an industrial vehicle that is autonomous. It is great for automation for large scale farms but would not benefit gardeners, homesteaders, and small-scale farms wanting to use no dig gardening. Another similar product that is of the same form factor/user is FarmBot. A CNC based garden bed that automates the process of growing food entirely. This company will be a direct competitor with the main difference being our modes of distribution. Their machine is directly attached to a garden bed whereas mine can drive around and be used for different types of gardens, farms, and homesteads. </w:t>
       </w:r>
     </w:p>
     <w:p>
@@ -588,10 +532,10 @@
         <w:pStyle w:val="Heading2"/>
         <w:spacing w:before="60" w:after="60"/>
       </w:pPr>
-      <w:bookmarkStart w:id="2" w:name="_5doonvg6yq9q" w:colFirst="0" w:colLast="0"/>
-      <w:bookmarkStart w:id="3" w:name="_f74af7ukg7lw" w:colFirst="0" w:colLast="0"/>
-      <w:bookmarkEnd w:id="2"/>
+      <w:bookmarkStart w:id="3" w:name="_5doonvg6yq9q" w:colFirst="0" w:colLast="0"/>
+      <w:bookmarkStart w:id="4" w:name="_f74af7ukg7lw" w:colFirst="0" w:colLast="0"/>
       <w:bookmarkEnd w:id="3"/>
+      <w:bookmarkEnd w:id="4"/>
       <w:r>
         <w:t>Project Description</w:t>
       </w:r>
@@ -843,17 +787,56 @@
         <w:spacing w:before="60" w:after="60"/>
         <w:rPr>
           <w:rFonts w:ascii="Times New Roman" w:eastAsia="Times New Roman" w:hAnsi="Times New Roman" w:cs="Times New Roman"/>
-          <w:sz w:val="24"/>
-          <w:szCs w:val="24"/>
-        </w:rPr>
-      </w:pPr>
-      <w:r>
-        <w:rPr>
-          <w:rFonts w:ascii="Times New Roman" w:eastAsia="Times New Roman" w:hAnsi="Times New Roman" w:cs="Times New Roman"/>
-          <w:sz w:val="24"/>
-          <w:szCs w:val="24"/>
-        </w:rPr>
-        <w:t>Autonomously avoid obstacles using camera and ultrasonic sensor</w:t>
+          <w:b/>
+          <w:bCs/>
+          <w:color w:val="4BACC6" w:themeColor="accent5"/>
+          <w:sz w:val="24"/>
+          <w:szCs w:val="24"/>
+        </w:rPr>
+      </w:pPr>
+      <w:r>
+        <w:rPr>
+          <w:rFonts w:ascii="Times New Roman" w:eastAsia="Times New Roman" w:hAnsi="Times New Roman" w:cs="Times New Roman"/>
+          <w:sz w:val="24"/>
+          <w:szCs w:val="24"/>
+        </w:rPr>
+        <w:lastRenderedPageBreak/>
+        <w:t xml:space="preserve">Autonomously </w:t>
+      </w:r>
+      <w:r>
+        <w:rPr>
+          <w:rFonts w:ascii="Times New Roman" w:eastAsia="Times New Roman" w:hAnsi="Times New Roman" w:cs="Times New Roman"/>
+          <w:sz w:val="24"/>
+          <w:szCs w:val="24"/>
+        </w:rPr>
+        <w:t xml:space="preserve">stop rover when detecting obstacles using </w:t>
+      </w:r>
+      <w:r>
+        <w:rPr>
+          <w:rFonts w:ascii="Times New Roman" w:eastAsia="Times New Roman" w:hAnsi="Times New Roman" w:cs="Times New Roman"/>
+          <w:sz w:val="24"/>
+          <w:szCs w:val="24"/>
+        </w:rPr>
+        <w:t>ultrasonic sensor</w:t>
+      </w:r>
+      <w:r>
+        <w:rPr>
+          <w:rFonts w:ascii="Times New Roman" w:eastAsia="Times New Roman" w:hAnsi="Times New Roman" w:cs="Times New Roman"/>
+          <w:sz w:val="24"/>
+          <w:szCs w:val="24"/>
+        </w:rPr>
+        <w:t xml:space="preserve"> </w:t>
+      </w:r>
+      <w:r>
+        <w:rPr>
+          <w:rFonts w:ascii="Times New Roman" w:eastAsia="Times New Roman" w:hAnsi="Times New Roman" w:cs="Times New Roman"/>
+          <w:b/>
+          <w:bCs/>
+          <w:color w:val="4BACC6" w:themeColor="accent5"/>
+          <w:sz w:val="24"/>
+          <w:szCs w:val="24"/>
+        </w:rPr>
+        <w:t>Changed 3/15/2025</w:t>
       </w:r>
     </w:p>
     <w:p>
@@ -876,7 +859,62 @@
           <w:sz w:val="24"/>
           <w:szCs w:val="24"/>
         </w:rPr>
-        <w:lastRenderedPageBreak/>
+        <w:t xml:space="preserve">Try to maneuver around obstacles using TOF sensor </w:t>
+      </w:r>
+      <w:r>
+        <w:rPr>
+          <w:rFonts w:ascii="Times New Roman" w:eastAsia="Times New Roman" w:hAnsi="Times New Roman" w:cs="Times New Roman"/>
+          <w:b/>
+          <w:bCs/>
+          <w:color w:val="4BACC6" w:themeColor="accent5"/>
+          <w:sz w:val="24"/>
+          <w:szCs w:val="24"/>
+        </w:rPr>
+        <w:t>ADDED</w:t>
+      </w:r>
+      <w:r>
+        <w:rPr>
+          <w:rFonts w:ascii="Times New Roman" w:eastAsia="Times New Roman" w:hAnsi="Times New Roman" w:cs="Times New Roman"/>
+          <w:b/>
+          <w:bCs/>
+          <w:color w:val="4BACC6" w:themeColor="accent5"/>
+          <w:sz w:val="24"/>
+          <w:szCs w:val="24"/>
+        </w:rPr>
+        <w:t xml:space="preserve"> </w:t>
+      </w:r>
+      <w:r>
+        <w:rPr>
+          <w:rFonts w:ascii="Times New Roman" w:eastAsia="Times New Roman" w:hAnsi="Times New Roman" w:cs="Times New Roman"/>
+          <w:b/>
+          <w:bCs/>
+          <w:color w:val="4BACC6" w:themeColor="accent5"/>
+          <w:sz w:val="24"/>
+          <w:szCs w:val="24"/>
+        </w:rPr>
+        <w:t>3/15/2025</w:t>
+      </w:r>
+    </w:p>
+    <w:p>
+      <w:pPr>
+        <w:pStyle w:val="ListParagraph"/>
+        <w:numPr>
+          <w:ilvl w:val="0"/>
+          <w:numId w:val="17"/>
+        </w:numPr>
+        <w:spacing w:before="60" w:after="60"/>
+        <w:rPr>
+          <w:rFonts w:ascii="Times New Roman" w:eastAsia="Times New Roman" w:hAnsi="Times New Roman" w:cs="Times New Roman"/>
+          <w:sz w:val="24"/>
+          <w:szCs w:val="24"/>
+        </w:rPr>
+      </w:pPr>
+      <w:r>
+        <w:rPr>
+          <w:rFonts w:ascii="Times New Roman" w:eastAsia="Times New Roman" w:hAnsi="Times New Roman" w:cs="Times New Roman"/>
+          <w:sz w:val="24"/>
+          <w:szCs w:val="24"/>
+        </w:rPr>
         <w:t>Move ~ 2mph while not hauling spreader</w:t>
       </w:r>
     </w:p>
@@ -931,6 +969,9 @@
         <w:spacing w:before="60" w:after="60"/>
         <w:rPr>
           <w:rFonts w:ascii="Times New Roman" w:eastAsia="Times New Roman" w:hAnsi="Times New Roman" w:cs="Times New Roman"/>
+          <w:b/>
+          <w:bCs/>
+          <w:color w:val="4BACC6" w:themeColor="accent5"/>
           <w:sz w:val="24"/>
           <w:szCs w:val="24"/>
         </w:rPr>
@@ -970,7 +1011,9 @@
       <w:r>
         <w:rPr>
           <w:rFonts w:ascii="Times New Roman" w:eastAsia="Times New Roman" w:hAnsi="Times New Roman" w:cs="Times New Roman"/>
-          <w:color w:val="FF0000"/>
+          <w:b/>
+          <w:bCs/>
+          <w:color w:val="4BACC6" w:themeColor="accent5"/>
           <w:sz w:val="24"/>
           <w:szCs w:val="24"/>
         </w:rPr>
@@ -999,6 +1042,17 @@
         </w:rPr>
         <w:t xml:space="preserve">4 SG90 Servo Motors </w:t>
       </w:r>
+      <w:r>
+        <w:rPr>
+          <w:rFonts w:ascii="Times New Roman" w:eastAsia="Times New Roman" w:hAnsi="Times New Roman" w:cs="Times New Roman"/>
+          <w:b/>
+          <w:bCs/>
+          <w:color w:val="4BACC6" w:themeColor="accent5"/>
+          <w:sz w:val="24"/>
+          <w:szCs w:val="24"/>
+        </w:rPr>
+        <w:t>Might be moving to 2 servos but depending on final wheel design</w:t>
+      </w:r>
     </w:p>
     <w:p>
       <w:pPr>
@@ -1033,6 +1087,9 @@
         <w:spacing w:before="60" w:after="60"/>
         <w:rPr>
           <w:rFonts w:ascii="Times New Roman" w:eastAsia="Times New Roman" w:hAnsi="Times New Roman" w:cs="Times New Roman"/>
+          <w:b/>
+          <w:bCs/>
+          <w:color w:val="4BACC6" w:themeColor="accent5"/>
           <w:sz w:val="24"/>
           <w:szCs w:val="24"/>
         </w:rPr>
@@ -1064,7 +1121,9 @@
       <w:r>
         <w:rPr>
           <w:rFonts w:ascii="Times New Roman" w:eastAsia="Times New Roman" w:hAnsi="Times New Roman" w:cs="Times New Roman"/>
-          <w:color w:val="FF0000"/>
+          <w:b/>
+          <w:bCs/>
+          <w:color w:val="4BACC6" w:themeColor="accent5"/>
           <w:sz w:val="24"/>
           <w:szCs w:val="24"/>
         </w:rPr>
@@ -1073,7 +1132,9 @@
       <w:r>
         <w:rPr>
           <w:rFonts w:ascii="Times New Roman" w:eastAsia="Times New Roman" w:hAnsi="Times New Roman" w:cs="Times New Roman"/>
-          <w:color w:val="FF0000"/>
+          <w:b/>
+          <w:bCs/>
+          <w:color w:val="4BACC6" w:themeColor="accent5"/>
           <w:sz w:val="24"/>
           <w:szCs w:val="24"/>
         </w:rPr>
@@ -1082,7 +1143,9 @@
       <w:r>
         <w:rPr>
           <w:rFonts w:ascii="Times New Roman" w:eastAsia="Times New Roman" w:hAnsi="Times New Roman" w:cs="Times New Roman"/>
-          <w:color w:val="FF0000"/>
+          <w:b/>
+          <w:bCs/>
+          <w:color w:val="4BACC6" w:themeColor="accent5"/>
           <w:sz w:val="24"/>
           <w:szCs w:val="24"/>
         </w:rPr>
@@ -1099,17 +1162,30 @@
         <w:spacing w:before="60" w:after="60"/>
         <w:rPr>
           <w:rFonts w:ascii="Times New Roman" w:eastAsia="Times New Roman" w:hAnsi="Times New Roman" w:cs="Times New Roman"/>
-          <w:sz w:val="24"/>
-          <w:szCs w:val="24"/>
-        </w:rPr>
-      </w:pPr>
-      <w:r>
-        <w:rPr>
-          <w:rFonts w:ascii="Times New Roman" w:eastAsia="Times New Roman" w:hAnsi="Times New Roman" w:cs="Times New Roman"/>
+          <w:strike/>
+          <w:color w:val="FF0000"/>
+          <w:sz w:val="24"/>
+          <w:szCs w:val="24"/>
+        </w:rPr>
+      </w:pPr>
+      <w:r>
+        <w:rPr>
+          <w:rFonts w:ascii="Times New Roman" w:eastAsia="Times New Roman" w:hAnsi="Times New Roman" w:cs="Times New Roman"/>
+          <w:strike/>
+          <w:color w:val="FF0000"/>
           <w:sz w:val="24"/>
           <w:szCs w:val="24"/>
         </w:rPr>
         <w:t>ESP32 XAIO S3 camera</w:t>
+      </w:r>
+      <w:r>
+        <w:rPr>
+          <w:rFonts w:ascii="Times New Roman" w:eastAsia="Times New Roman" w:hAnsi="Times New Roman" w:cs="Times New Roman"/>
+          <w:color w:val="FF0000"/>
+          <w:sz w:val="24"/>
+          <w:szCs w:val="24"/>
+        </w:rPr>
+        <w:t xml:space="preserve"> Removed due to pivot on 3/15/2025</w:t>
       </w:r>
     </w:p>
     <w:p>
@@ -1145,21 +1221,39 @@
         <w:spacing w:before="60" w:after="60"/>
         <w:rPr>
           <w:rFonts w:ascii="Times New Roman" w:eastAsia="Times New Roman" w:hAnsi="Times New Roman" w:cs="Times New Roman"/>
-          <w:strike/>
-          <w:color w:val="FF0000"/>
-          <w:sz w:val="24"/>
-          <w:szCs w:val="24"/>
-        </w:rPr>
-      </w:pPr>
-      <w:r>
-        <w:rPr>
-          <w:rFonts w:ascii="Times New Roman" w:eastAsia="Times New Roman" w:hAnsi="Times New Roman" w:cs="Times New Roman"/>
-          <w:strike/>
-          <w:color w:val="FF0000"/>
-          <w:sz w:val="24"/>
-          <w:szCs w:val="24"/>
-        </w:rPr>
-        <w:t>Object detection model</w:t>
+          <w:sz w:val="24"/>
+          <w:szCs w:val="24"/>
+        </w:rPr>
+      </w:pPr>
+      <w:r>
+        <w:rPr>
+          <w:rFonts w:ascii="Times New Roman" w:eastAsia="Times New Roman" w:hAnsi="Times New Roman" w:cs="Times New Roman"/>
+          <w:sz w:val="24"/>
+          <w:szCs w:val="24"/>
+        </w:rPr>
+        <w:t xml:space="preserve">Power bus with fuses </w:t>
+      </w:r>
+      <w:r>
+        <w:rPr>
+          <w:rFonts w:ascii="Times New Roman" w:eastAsia="Times New Roman" w:hAnsi="Times New Roman" w:cs="Times New Roman"/>
+          <w:b/>
+          <w:bCs/>
+          <w:color w:val="4BACC6" w:themeColor="accent5"/>
+          <w:sz w:val="24"/>
+          <w:szCs w:val="24"/>
+        </w:rPr>
+        <w:t>ADDED</w:t>
+      </w:r>
+      <w:r>
+        <w:rPr>
+          <w:rFonts w:ascii="Times New Roman" w:eastAsia="Times New Roman" w:hAnsi="Times New Roman" w:cs="Times New Roman"/>
+          <w:b/>
+          <w:bCs/>
+          <w:color w:val="4BACC6" w:themeColor="accent5"/>
+          <w:sz w:val="24"/>
+          <w:szCs w:val="24"/>
+        </w:rPr>
+        <w:t xml:space="preserve"> 3/15/2025</w:t>
       </w:r>
     </w:p>
     <w:p>
@@ -1182,7 +1276,40 @@
           <w:sz w:val="24"/>
           <w:szCs w:val="24"/>
         </w:rPr>
-        <w:t>LLM for object detection</w:t>
+        <w:t>VL53L5CX TOF sensor</w:t>
+      </w:r>
+      <w:r>
+        <w:rPr>
+          <w:rFonts w:ascii="Times New Roman" w:eastAsia="Times New Roman" w:hAnsi="Times New Roman" w:cs="Times New Roman"/>
+          <w:b/>
+          <w:bCs/>
+          <w:color w:val="4BACC6" w:themeColor="accent5"/>
+          <w:sz w:val="24"/>
+          <w:szCs w:val="24"/>
+        </w:rPr>
+        <w:t xml:space="preserve"> </w:t>
+      </w:r>
+      <w:r>
+        <w:rPr>
+          <w:rFonts w:ascii="Times New Roman" w:eastAsia="Times New Roman" w:hAnsi="Times New Roman" w:cs="Times New Roman"/>
+          <w:b/>
+          <w:bCs/>
+          <w:color w:val="4BACC6" w:themeColor="accent5"/>
+          <w:sz w:val="24"/>
+          <w:szCs w:val="24"/>
+        </w:rPr>
+        <w:t xml:space="preserve">ADDED </w:t>
+      </w:r>
+      <w:r>
+        <w:rPr>
+          <w:rFonts w:ascii="Times New Roman" w:eastAsia="Times New Roman" w:hAnsi="Times New Roman" w:cs="Times New Roman"/>
+          <w:b/>
+          <w:bCs/>
+          <w:color w:val="4BACC6" w:themeColor="accent5"/>
+          <w:sz w:val="24"/>
+          <w:szCs w:val="24"/>
+        </w:rPr>
+        <w:t>3/15/2025</w:t>
       </w:r>
     </w:p>
     <w:p>
@@ -1205,6 +1332,105 @@
           <w:sz w:val="24"/>
           <w:szCs w:val="24"/>
         </w:rPr>
+        <w:t xml:space="preserve">Ultrasonic sensor </w:t>
+      </w:r>
+      <w:r>
+        <w:rPr>
+          <w:rFonts w:ascii="Times New Roman" w:eastAsia="Times New Roman" w:hAnsi="Times New Roman" w:cs="Times New Roman"/>
+          <w:b/>
+          <w:bCs/>
+          <w:color w:val="4BACC6" w:themeColor="accent5"/>
+          <w:sz w:val="24"/>
+          <w:szCs w:val="24"/>
+        </w:rPr>
+        <w:t>ADDED</w:t>
+      </w:r>
+      <w:r>
+        <w:rPr>
+          <w:rFonts w:ascii="Times New Roman" w:eastAsia="Times New Roman" w:hAnsi="Times New Roman" w:cs="Times New Roman"/>
+          <w:b/>
+          <w:bCs/>
+          <w:color w:val="4BACC6" w:themeColor="accent5"/>
+          <w:sz w:val="24"/>
+          <w:szCs w:val="24"/>
+        </w:rPr>
+        <w:t xml:space="preserve"> 3/10/2025</w:t>
+      </w:r>
+    </w:p>
+    <w:p>
+      <w:pPr>
+        <w:pStyle w:val="ListParagraph"/>
+        <w:numPr>
+          <w:ilvl w:val="0"/>
+          <w:numId w:val="2"/>
+        </w:numPr>
+        <w:spacing w:before="60" w:after="60"/>
+        <w:rPr>
+          <w:rFonts w:ascii="Times New Roman" w:eastAsia="Times New Roman" w:hAnsi="Times New Roman" w:cs="Times New Roman"/>
+          <w:strike/>
+          <w:color w:val="FF0000"/>
+          <w:sz w:val="24"/>
+          <w:szCs w:val="24"/>
+        </w:rPr>
+      </w:pPr>
+      <w:r>
+        <w:rPr>
+          <w:rFonts w:ascii="Times New Roman" w:eastAsia="Times New Roman" w:hAnsi="Times New Roman" w:cs="Times New Roman"/>
+          <w:strike/>
+          <w:color w:val="FF0000"/>
+          <w:sz w:val="24"/>
+          <w:szCs w:val="24"/>
+        </w:rPr>
+        <w:t>Object detection model</w:t>
+      </w:r>
+    </w:p>
+    <w:p>
+      <w:pPr>
+        <w:pStyle w:val="ListParagraph"/>
+        <w:numPr>
+          <w:ilvl w:val="0"/>
+          <w:numId w:val="2"/>
+        </w:numPr>
+        <w:spacing w:before="60" w:after="60"/>
+        <w:rPr>
+          <w:rFonts w:ascii="Times New Roman" w:eastAsia="Times New Roman" w:hAnsi="Times New Roman" w:cs="Times New Roman"/>
+          <w:strike/>
+          <w:color w:val="FF0000"/>
+          <w:sz w:val="24"/>
+          <w:szCs w:val="24"/>
+        </w:rPr>
+      </w:pPr>
+      <w:r>
+        <w:rPr>
+          <w:rFonts w:ascii="Times New Roman" w:eastAsia="Times New Roman" w:hAnsi="Times New Roman" w:cs="Times New Roman"/>
+          <w:strike/>
+          <w:color w:val="FF0000"/>
+          <w:sz w:val="24"/>
+          <w:szCs w:val="24"/>
+        </w:rPr>
+        <w:t>LLM for object detection</w:t>
+      </w:r>
+    </w:p>
+    <w:p>
+      <w:pPr>
+        <w:pStyle w:val="ListParagraph"/>
+        <w:numPr>
+          <w:ilvl w:val="0"/>
+          <w:numId w:val="2"/>
+        </w:numPr>
+        <w:spacing w:before="60" w:after="60"/>
+        <w:rPr>
+          <w:rFonts w:ascii="Times New Roman" w:eastAsia="Times New Roman" w:hAnsi="Times New Roman" w:cs="Times New Roman"/>
+          <w:sz w:val="24"/>
+          <w:szCs w:val="24"/>
+        </w:rPr>
+      </w:pPr>
+      <w:r>
+        <w:rPr>
+          <w:rFonts w:ascii="Times New Roman" w:eastAsia="Times New Roman" w:hAnsi="Times New Roman" w:cs="Times New Roman"/>
+          <w:sz w:val="24"/>
+          <w:szCs w:val="24"/>
+        </w:rPr>
         <w:t>Hopper trailer with spring-based trap door to spread fertilizer/seeds</w:t>
       </w:r>
     </w:p>
@@ -1249,8 +1475,8 @@
         <w:pStyle w:val="Heading2"/>
         <w:spacing w:before="60" w:after="60"/>
       </w:pPr>
-      <w:bookmarkStart w:id="4" w:name="_fs7vbfhjkf4y" w:colFirst="0" w:colLast="0"/>
-      <w:bookmarkEnd w:id="4"/>
+      <w:bookmarkStart w:id="5" w:name="_fs7vbfhjkf4y" w:colFirst="0" w:colLast="0"/>
+      <w:bookmarkEnd w:id="5"/>
       <w:r>
         <w:t>Innovation Claim</w:t>
       </w:r>
@@ -1263,7 +1489,6 @@
           <w:szCs w:val="24"/>
         </w:rPr>
       </w:pPr>
-      <w:proofErr w:type="spellStart"/>
       <w:r>
         <w:rPr>
           <w:rFonts w:ascii="Times New Roman" w:eastAsia="Times New Roman" w:hAnsi="Times New Roman" w:cs="Times New Roman"/>
@@ -1278,16 +1503,53 @@
           <w:sz w:val="24"/>
           <w:szCs w:val="24"/>
         </w:rPr>
-        <w:t>oilSpirit</w:t>
-      </w:r>
-      <w:proofErr w:type="spellEnd"/>
-      <w:r>
-        <w:rPr>
-          <w:rFonts w:ascii="Times New Roman" w:eastAsia="Times New Roman" w:hAnsi="Times New Roman" w:cs="Times New Roman"/>
-          <w:sz w:val="24"/>
-          <w:szCs w:val="24"/>
-        </w:rPr>
-        <w:t xml:space="preserve"> will be the first adaptation of Mars rover rocker-bogie suspension for agriculture and will make automation accessible to more people. On top of that it promotes a sustainable agricultural practice in making non-dig farming easier. Lastly, the incorporation of computer vision in a non-experimental realm will lead to this device being more robust and intelligent than most small-scale autonomous systems.</w:t>
+        <w:t>oilSpirit will be the first adaptation of Mars rover rocker-bogie suspension for agriculture and will make automation accessible to more people. On top of that it promotes a sustainable agricultural practice in making non-dig farming easier.</w:t>
+      </w:r>
+      <w:r>
+        <w:rPr>
+          <w:rFonts w:ascii="Times New Roman" w:eastAsia="Times New Roman" w:hAnsi="Times New Roman" w:cs="Times New Roman"/>
+          <w:sz w:val="24"/>
+          <w:szCs w:val="24"/>
+        </w:rPr>
+        <w:t xml:space="preserve"> </w:t>
+      </w:r>
+      <w:r>
+        <w:rPr>
+          <w:rFonts w:ascii="Times New Roman" w:eastAsia="Times New Roman" w:hAnsi="Times New Roman" w:cs="Times New Roman"/>
+          <w:strike/>
+          <w:color w:val="FF0000"/>
+          <w:sz w:val="24"/>
+          <w:szCs w:val="24"/>
+        </w:rPr>
+        <w:t>Lastly,</w:t>
+      </w:r>
+      <w:r>
+        <w:rPr>
+          <w:rFonts w:ascii="Times New Roman" w:eastAsia="Times New Roman" w:hAnsi="Times New Roman" w:cs="Times New Roman"/>
+          <w:color w:val="FF0000"/>
+          <w:sz w:val="24"/>
+          <w:szCs w:val="24"/>
+        </w:rPr>
+        <w:t xml:space="preserve"> </w:t>
+      </w:r>
+      <w:r>
+        <w:rPr>
+          <w:rFonts w:ascii="Times New Roman" w:eastAsia="Times New Roman" w:hAnsi="Times New Roman" w:cs="Times New Roman"/>
+          <w:strike/>
+          <w:color w:val="FF0000"/>
+          <w:sz w:val="24"/>
+          <w:szCs w:val="24"/>
+        </w:rPr>
+        <w:t>computer vision in a non-experimental realm will lead to this device being more robust and intelligent than most small-scale autonomous systems.</w:t>
+      </w:r>
+      <w:r>
+        <w:rPr>
+          <w:rFonts w:ascii="Times New Roman" w:eastAsia="Times New Roman" w:hAnsi="Times New Roman" w:cs="Times New Roman"/>
+          <w:color w:val="FF0000"/>
+          <w:sz w:val="24"/>
+          <w:szCs w:val="24"/>
+        </w:rPr>
+        <w:t xml:space="preserve"> Removed 3/15/2025 due to pivot away for computer vision</w:t>
       </w:r>
     </w:p>
     <w:p>
@@ -1404,43 +1666,16 @@
           <w:sz w:val="24"/>
           <w:szCs w:val="24"/>
         </w:rPr>
-        <w:t xml:space="preserve">this may very well become integrated with future iterations of rovers and space vehicles. Technology inspired by </w:t>
-      </w:r>
-      <w:proofErr w:type="spellStart"/>
-      <w:r>
-        <w:rPr>
-          <w:rFonts w:ascii="Times New Roman" w:eastAsia="Times New Roman" w:hAnsi="Times New Roman" w:cs="Times New Roman"/>
-          <w:sz w:val="24"/>
-          <w:szCs w:val="24"/>
-        </w:rPr>
-        <w:t>SoilSpirit</w:t>
-      </w:r>
-      <w:proofErr w:type="spellEnd"/>
-      <w:r>
-        <w:rPr>
-          <w:rFonts w:ascii="Times New Roman" w:eastAsia="Times New Roman" w:hAnsi="Times New Roman" w:cs="Times New Roman"/>
-          <w:sz w:val="24"/>
-          <w:szCs w:val="24"/>
-        </w:rPr>
-        <w:t xml:space="preserve"> could possibly be used for farming on other planets, if we ever get there, or as small-scale versions of the Mars rovers that are more accessible for smaller companies. </w:t>
-      </w:r>
-      <w:proofErr w:type="spellStart"/>
-      <w:r>
-        <w:rPr>
-          <w:rFonts w:ascii="Times New Roman" w:eastAsia="Times New Roman" w:hAnsi="Times New Roman" w:cs="Times New Roman"/>
-          <w:sz w:val="24"/>
-          <w:szCs w:val="24"/>
-        </w:rPr>
-        <w:t>SoilSpirit</w:t>
-      </w:r>
-      <w:proofErr w:type="spellEnd"/>
-      <w:r>
-        <w:rPr>
-          <w:rFonts w:ascii="Times New Roman" w:eastAsia="Times New Roman" w:hAnsi="Times New Roman" w:cs="Times New Roman"/>
-          <w:sz w:val="24"/>
-          <w:szCs w:val="24"/>
-        </w:rPr>
-        <w:t xml:space="preserve"> could also extend into disaster recovery and reconnaissance. A scaled-up version of this rover could be used for search and rescue, area mapping, and debris clearing.</w:t>
+        <w:t>this may very well become integrated with future iterations of rovers and space vehicles. Technology inspired by SoilSpirit could possibly be used for farming on other planets, if we ever get there, or as small-</w:t>
+      </w:r>
+      <w:r>
+        <w:rPr>
+          <w:rFonts w:ascii="Times New Roman" w:eastAsia="Times New Roman" w:hAnsi="Times New Roman" w:cs="Times New Roman"/>
+          <w:sz w:val="24"/>
+          <w:szCs w:val="24"/>
+        </w:rPr>
+        <w:lastRenderedPageBreak/>
+        <w:t>scale versions of the Mars rovers that are more accessible for smaller companies. SoilSpirit could also extend into disaster recovery and reconnaissance. A scaled-up version of this rover could be used for search and rescue, area mapping, and debris clearing.</w:t>
       </w:r>
       <w:r>
         <w:rPr>
@@ -1474,24 +1709,6 @@
         </w:rPr>
         <w:t xml:space="preserve">the education and start-up industry due to it being a starting point for various projects. </w:t>
       </w:r>
-    </w:p>
-    <w:p>
-      <w:pPr>
-        <w:rPr>
-          <w:rFonts w:ascii="Times New Roman" w:eastAsia="Times New Roman" w:hAnsi="Times New Roman" w:cs="Times New Roman"/>
-        </w:rPr>
-      </w:pPr>
-    </w:p>
-    <w:p>
-      <w:pPr>
-        <w:spacing w:before="120" w:after="120"/>
-        <w:rPr>
-          <w:rFonts w:ascii="Times New Roman" w:eastAsia="Times New Roman" w:hAnsi="Times New Roman" w:cs="Times New Roman"/>
-          <w:b/>
-          <w:sz w:val="36"/>
-          <w:szCs w:val="36"/>
-        </w:rPr>
-      </w:pPr>
     </w:p>
     <w:p>
       <w:pPr>
@@ -1667,6 +1884,23 @@
         </w:rPr>
         <w:t>Does the hopper start/stop spreading based on movement of the rover?</w:t>
       </w:r>
+      <w:r>
+        <w:rPr>
+          <w:rFonts w:ascii="Times New Roman" w:eastAsia="Times New Roman" w:hAnsi="Times New Roman" w:cs="Times New Roman"/>
+          <w:sz w:val="24"/>
+          <w:szCs w:val="24"/>
+        </w:rPr>
+        <w:t xml:space="preserve"> </w:t>
+      </w:r>
+      <w:r>
+        <w:rPr>
+          <w:rFonts w:ascii="Times New Roman" w:eastAsia="Times New Roman" w:hAnsi="Times New Roman" w:cs="Times New Roman"/>
+          <w:color w:val="FF0000"/>
+          <w:sz w:val="24"/>
+          <w:szCs w:val="24"/>
+        </w:rPr>
+        <w:t>(DONE 3/15)</w:t>
+      </w:r>
     </w:p>
     <w:p>
       <w:pPr>
@@ -1698,6 +1932,23 @@
         </w:rPr>
         <w:t xml:space="preserve"> </w:t>
       </w:r>
+      <w:r>
+        <w:rPr>
+          <w:rFonts w:ascii="Times New Roman" w:eastAsia="Times New Roman" w:hAnsi="Times New Roman" w:cs="Times New Roman"/>
+          <w:color w:val="FF0000"/>
+          <w:sz w:val="24"/>
+          <w:szCs w:val="24"/>
+        </w:rPr>
+        <w:t>(Stopping finished 3/15 avoidance dependent on TOF sensor integration)</w:t>
+      </w:r>
+      <w:r>
+        <w:rPr>
+          <w:rFonts w:ascii="Times New Roman" w:eastAsia="Times New Roman" w:hAnsi="Times New Roman" w:cs="Times New Roman"/>
+          <w:sz w:val="24"/>
+          <w:szCs w:val="24"/>
+        </w:rPr>
+        <w:t xml:space="preserve"> </w:t>
+      </w:r>
     </w:p>
     <w:p>
       <w:pPr>
@@ -1729,6 +1980,24 @@
         </w:rPr>
         <w:t xml:space="preserve"> </w:t>
       </w:r>
+      <w:r>
+        <w:rPr>
+          <w:rFonts w:ascii="Times New Roman" w:eastAsia="Times New Roman" w:hAnsi="Times New Roman" w:cs="Times New Roman"/>
+          <w:color w:val="FF0000"/>
+          <w:sz w:val="24"/>
+          <w:szCs w:val="24"/>
+        </w:rPr>
+        <w:t>(</w:t>
+      </w:r>
+      <w:r>
+        <w:rPr>
+          <w:rFonts w:ascii="Times New Roman" w:eastAsia="Times New Roman" w:hAnsi="Times New Roman" w:cs="Times New Roman"/>
+          <w:color w:val="FF0000"/>
+          <w:sz w:val="24"/>
+          <w:szCs w:val="24"/>
+        </w:rPr>
+        <w:t>DONE 3/3)</w:t>
+      </w:r>
     </w:p>
     <w:p>
       <w:pPr>
@@ -1863,6 +2132,23 @@
         </w:rPr>
         <w:t>Is there enough charge to run the motors and the servos to allow for spreading to finish?</w:t>
       </w:r>
+      <w:r>
+        <w:rPr>
+          <w:rFonts w:ascii="Times New Roman" w:eastAsia="Times New Roman" w:hAnsi="Times New Roman" w:cs="Times New Roman"/>
+          <w:sz w:val="24"/>
+          <w:szCs w:val="24"/>
+        </w:rPr>
+        <w:t xml:space="preserve"> </w:t>
+      </w:r>
+      <w:r>
+        <w:rPr>
+          <w:rFonts w:ascii="Times New Roman" w:eastAsia="Times New Roman" w:hAnsi="Times New Roman" w:cs="Times New Roman"/>
+          <w:color w:val="FF0000"/>
+          <w:sz w:val="24"/>
+          <w:szCs w:val="24"/>
+        </w:rPr>
+        <w:t>(DONE 3/10)</w:t>
+      </w:r>
     </w:p>
     <w:p>
       <w:pPr>
@@ -1905,13 +2191,17 @@
         <w:spacing w:before="120" w:after="120"/>
         <w:rPr>
           <w:rFonts w:ascii="Times New Roman" w:eastAsia="Times New Roman" w:hAnsi="Times New Roman" w:cs="Times New Roman"/>
-          <w:sz w:val="24"/>
-          <w:szCs w:val="24"/>
-        </w:rPr>
-      </w:pPr>
-      <w:r>
-        <w:rPr>
-          <w:rFonts w:ascii="Times New Roman" w:eastAsia="Times New Roman" w:hAnsi="Times New Roman" w:cs="Times New Roman"/>
+          <w:strike/>
+          <w:color w:val="FF0000"/>
+          <w:sz w:val="24"/>
+          <w:szCs w:val="24"/>
+        </w:rPr>
+      </w:pPr>
+      <w:r>
+        <w:rPr>
+          <w:rFonts w:ascii="Times New Roman" w:eastAsia="Times New Roman" w:hAnsi="Times New Roman" w:cs="Times New Roman"/>
+          <w:strike/>
+          <w:color w:val="FF0000"/>
           <w:sz w:val="24"/>
           <w:szCs w:val="24"/>
         </w:rPr>
@@ -1920,37 +2210,12 @@
       <w:r>
         <w:rPr>
           <w:rFonts w:ascii="Times New Roman" w:eastAsia="Times New Roman" w:hAnsi="Times New Roman" w:cs="Times New Roman"/>
-          <w:sz w:val="24"/>
-          <w:szCs w:val="24"/>
-        </w:rPr>
-        <w:t xml:space="preserve"> </w:t>
-      </w:r>
-      <w:r>
-        <w:rPr>
-          <w:rFonts w:ascii="Times New Roman" w:eastAsia="Times New Roman" w:hAnsi="Times New Roman" w:cs="Times New Roman"/>
-          <w:color w:val="FF0000"/>
-          <w:sz w:val="24"/>
-          <w:szCs w:val="24"/>
-        </w:rPr>
-        <w:t>(DONE 2/2</w:t>
-      </w:r>
-      <w:r>
-        <w:rPr>
-          <w:rFonts w:ascii="Times New Roman" w:eastAsia="Times New Roman" w:hAnsi="Times New Roman" w:cs="Times New Roman"/>
-          <w:color w:val="FF0000"/>
-          <w:sz w:val="24"/>
-          <w:szCs w:val="24"/>
-        </w:rPr>
-        <w:t>5</w:t>
-      </w:r>
-      <w:r>
-        <w:rPr>
-          <w:rFonts w:ascii="Times New Roman" w:eastAsia="Times New Roman" w:hAnsi="Times New Roman" w:cs="Times New Roman"/>
-          <w:color w:val="FF0000"/>
-          <w:sz w:val="24"/>
-          <w:szCs w:val="24"/>
-        </w:rPr>
-        <w:t>)</w:t>
+          <w:strike/>
+          <w:color w:val="FF0000"/>
+          <w:sz w:val="24"/>
+          <w:szCs w:val="24"/>
+        </w:rPr>
+        <w:t xml:space="preserve"> (DONE 2/25)</w:t>
       </w:r>
     </w:p>
     <w:p>
@@ -1963,13 +2228,17 @@
         <w:spacing w:before="120" w:after="120"/>
         <w:rPr>
           <w:rFonts w:ascii="Times New Roman" w:eastAsia="Times New Roman" w:hAnsi="Times New Roman" w:cs="Times New Roman"/>
-          <w:sz w:val="24"/>
-          <w:szCs w:val="24"/>
-        </w:rPr>
-      </w:pPr>
-      <w:r>
-        <w:rPr>
-          <w:rFonts w:ascii="Times New Roman" w:eastAsia="Times New Roman" w:hAnsi="Times New Roman" w:cs="Times New Roman"/>
+          <w:strike/>
+          <w:color w:val="FF0000"/>
+          <w:sz w:val="24"/>
+          <w:szCs w:val="24"/>
+        </w:rPr>
+      </w:pPr>
+      <w:r>
+        <w:rPr>
+          <w:rFonts w:ascii="Times New Roman" w:eastAsia="Times New Roman" w:hAnsi="Times New Roman" w:cs="Times New Roman"/>
+          <w:strike/>
+          <w:color w:val="FF0000"/>
           <w:sz w:val="24"/>
           <w:szCs w:val="24"/>
         </w:rPr>
@@ -1978,37 +2247,21 @@
       <w:r>
         <w:rPr>
           <w:rFonts w:ascii="Times New Roman" w:eastAsia="Times New Roman" w:hAnsi="Times New Roman" w:cs="Times New Roman"/>
-          <w:sz w:val="24"/>
-          <w:szCs w:val="24"/>
-        </w:rPr>
-        <w:t xml:space="preserve"> </w:t>
-      </w:r>
-      <w:r>
-        <w:rPr>
-          <w:rFonts w:ascii="Times New Roman" w:eastAsia="Times New Roman" w:hAnsi="Times New Roman" w:cs="Times New Roman"/>
-          <w:color w:val="FF0000"/>
-          <w:sz w:val="24"/>
-          <w:szCs w:val="24"/>
-        </w:rPr>
-        <w:t>(DONE 2/2</w:t>
-      </w:r>
-      <w:r>
-        <w:rPr>
-          <w:rFonts w:ascii="Times New Roman" w:eastAsia="Times New Roman" w:hAnsi="Times New Roman" w:cs="Times New Roman"/>
-          <w:color w:val="FF0000"/>
-          <w:sz w:val="24"/>
-          <w:szCs w:val="24"/>
-        </w:rPr>
-        <w:t>5</w:t>
-      </w:r>
-      <w:r>
-        <w:rPr>
-          <w:rFonts w:ascii="Times New Roman" w:eastAsia="Times New Roman" w:hAnsi="Times New Roman" w:cs="Times New Roman"/>
-          <w:color w:val="FF0000"/>
-          <w:sz w:val="24"/>
-          <w:szCs w:val="24"/>
-        </w:rPr>
-        <w:t>)</w:t>
+          <w:strike/>
+          <w:color w:val="FF0000"/>
+          <w:sz w:val="24"/>
+          <w:szCs w:val="24"/>
+        </w:rPr>
+        <w:t xml:space="preserve"> (DONE 2/25)</w:t>
+      </w:r>
+      <w:r>
+        <w:rPr>
+          <w:rFonts w:ascii="Times New Roman" w:eastAsia="Times New Roman" w:hAnsi="Times New Roman" w:cs="Times New Roman"/>
+          <w:color w:val="FF0000"/>
+          <w:sz w:val="24"/>
+          <w:szCs w:val="24"/>
+        </w:rPr>
+        <w:t xml:space="preserve"> Removed due to pivot on 3/15/2025</w:t>
       </w:r>
     </w:p>
     <w:p>
@@ -2031,7 +2284,24 @@
           <w:sz w:val="24"/>
           <w:szCs w:val="24"/>
         </w:rPr>
-        <w:t>Do the emergency stop ultrasonic sensors detect obstacles missed by the camera?</w:t>
+        <w:t>Do the emergency stop ultrasonic sensors detect obstacles?</w:t>
+      </w:r>
+      <w:r>
+        <w:rPr>
+          <w:rFonts w:ascii="Times New Roman" w:eastAsia="Times New Roman" w:hAnsi="Times New Roman" w:cs="Times New Roman"/>
+          <w:sz w:val="24"/>
+          <w:szCs w:val="24"/>
+        </w:rPr>
+        <w:t xml:space="preserve"> </w:t>
+      </w:r>
+      <w:r>
+        <w:rPr>
+          <w:rFonts w:ascii="Times New Roman" w:eastAsia="Times New Roman" w:hAnsi="Times New Roman" w:cs="Times New Roman"/>
+          <w:color w:val="FF0000"/>
+          <w:sz w:val="24"/>
+          <w:szCs w:val="24"/>
+        </w:rPr>
+        <w:t>(DONE 3/14)</w:t>
       </w:r>
     </w:p>
     <w:p>
@@ -2084,13 +2354,58 @@
         <w:spacing w:before="120" w:after="120"/>
         <w:rPr>
           <w:rFonts w:ascii="Times New Roman" w:eastAsia="Times New Roman" w:hAnsi="Times New Roman" w:cs="Times New Roman"/>
-          <w:sz w:val="24"/>
-          <w:szCs w:val="24"/>
-        </w:rPr>
-      </w:pPr>
-      <w:r>
-        <w:rPr>
-          <w:rFonts w:ascii="Times New Roman" w:eastAsia="Times New Roman" w:hAnsi="Times New Roman" w:cs="Times New Roman"/>
+          <w:color w:val="000000" w:themeColor="text1"/>
+          <w:sz w:val="24"/>
+          <w:szCs w:val="24"/>
+        </w:rPr>
+      </w:pPr>
+      <w:r>
+        <w:rPr>
+          <w:rFonts w:ascii="Times New Roman" w:eastAsia="Times New Roman" w:hAnsi="Times New Roman" w:cs="Times New Roman"/>
+          <w:color w:val="000000" w:themeColor="text1"/>
+          <w:sz w:val="24"/>
+          <w:szCs w:val="24"/>
+        </w:rPr>
+        <w:t>Does TOF sensor detect objects in different regions</w:t>
+      </w:r>
+      <w:r>
+        <w:rPr>
+          <w:rFonts w:ascii="Times New Roman" w:eastAsia="Times New Roman" w:hAnsi="Times New Roman" w:cs="Times New Roman"/>
+          <w:color w:val="000000" w:themeColor="text1"/>
+          <w:sz w:val="24"/>
+          <w:szCs w:val="24"/>
+        </w:rPr>
+        <w:t xml:space="preserve"> </w:t>
+      </w:r>
+      <w:r>
+        <w:rPr>
+          <w:rFonts w:ascii="Times New Roman" w:eastAsia="Times New Roman" w:hAnsi="Times New Roman" w:cs="Times New Roman"/>
+          <w:color w:val="FF0000"/>
+          <w:sz w:val="24"/>
+          <w:szCs w:val="24"/>
+        </w:rPr>
+        <w:t>(Added 3/15)</w:t>
+      </w:r>
+    </w:p>
+    <w:p>
+      <w:pPr>
+        <w:pStyle w:val="ListParagraph"/>
+        <w:numPr>
+          <w:ilvl w:val="1"/>
+          <w:numId w:val="4"/>
+        </w:numPr>
+        <w:spacing w:before="120" w:after="120"/>
+        <w:rPr>
+          <w:rFonts w:ascii="Times New Roman" w:eastAsia="Times New Roman" w:hAnsi="Times New Roman" w:cs="Times New Roman"/>
+          <w:color w:val="000000" w:themeColor="text1"/>
+          <w:sz w:val="24"/>
+          <w:szCs w:val="24"/>
+        </w:rPr>
+      </w:pPr>
+      <w:r>
+        <w:rPr>
+          <w:rFonts w:ascii="Times New Roman" w:eastAsia="Times New Roman" w:hAnsi="Times New Roman" w:cs="Times New Roman"/>
+          <w:color w:val="000000" w:themeColor="text1"/>
           <w:sz w:val="24"/>
           <w:szCs w:val="24"/>
         </w:rPr>
@@ -2107,13 +2422,17 @@
         <w:spacing w:before="120" w:after="120"/>
         <w:rPr>
           <w:rFonts w:ascii="Times New Roman" w:eastAsia="Times New Roman" w:hAnsi="Times New Roman" w:cs="Times New Roman"/>
-          <w:sz w:val="24"/>
-          <w:szCs w:val="24"/>
-        </w:rPr>
-      </w:pPr>
-      <w:r>
-        <w:rPr>
-          <w:rFonts w:ascii="Times New Roman" w:eastAsia="Times New Roman" w:hAnsi="Times New Roman" w:cs="Times New Roman"/>
+          <w:strike/>
+          <w:color w:val="FF0000"/>
+          <w:sz w:val="24"/>
+          <w:szCs w:val="24"/>
+        </w:rPr>
+      </w:pPr>
+      <w:r>
+        <w:rPr>
+          <w:rFonts w:ascii="Times New Roman" w:eastAsia="Times New Roman" w:hAnsi="Times New Roman" w:cs="Times New Roman"/>
+          <w:strike/>
+          <w:color w:val="FF0000"/>
           <w:sz w:val="24"/>
           <w:szCs w:val="24"/>
         </w:rPr>
@@ -2130,13 +2449,17 @@
         <w:spacing w:before="120" w:after="120"/>
         <w:rPr>
           <w:rFonts w:ascii="Times New Roman" w:eastAsia="Times New Roman" w:hAnsi="Times New Roman" w:cs="Times New Roman"/>
-          <w:sz w:val="24"/>
-          <w:szCs w:val="24"/>
-        </w:rPr>
-      </w:pPr>
-      <w:r>
-        <w:rPr>
-          <w:rFonts w:ascii="Times New Roman" w:eastAsia="Times New Roman" w:hAnsi="Times New Roman" w:cs="Times New Roman"/>
+          <w:strike/>
+          <w:color w:val="FF0000"/>
+          <w:sz w:val="24"/>
+          <w:szCs w:val="24"/>
+        </w:rPr>
+      </w:pPr>
+      <w:r>
+        <w:rPr>
+          <w:rFonts w:ascii="Times New Roman" w:eastAsia="Times New Roman" w:hAnsi="Times New Roman" w:cs="Times New Roman"/>
+          <w:strike/>
+          <w:color w:val="FF0000"/>
           <w:sz w:val="24"/>
           <w:szCs w:val="24"/>
         </w:rPr>
@@ -2153,13 +2476,17 @@
         <w:spacing w:before="120" w:after="120"/>
         <w:rPr>
           <w:rFonts w:ascii="Times New Roman" w:eastAsia="Times New Roman" w:hAnsi="Times New Roman" w:cs="Times New Roman"/>
-          <w:sz w:val="24"/>
-          <w:szCs w:val="24"/>
-        </w:rPr>
-      </w:pPr>
-      <w:r>
-        <w:rPr>
-          <w:rFonts w:ascii="Times New Roman" w:eastAsia="Times New Roman" w:hAnsi="Times New Roman" w:cs="Times New Roman"/>
+          <w:strike/>
+          <w:color w:val="FF0000"/>
+          <w:sz w:val="24"/>
+          <w:szCs w:val="24"/>
+        </w:rPr>
+      </w:pPr>
+      <w:r>
+        <w:rPr>
+          <w:rFonts w:ascii="Times New Roman" w:eastAsia="Times New Roman" w:hAnsi="Times New Roman" w:cs="Times New Roman"/>
+          <w:strike/>
+          <w:color w:val="FF0000"/>
           <w:sz w:val="24"/>
           <w:szCs w:val="24"/>
         </w:rPr>
@@ -2176,18 +2503,41 @@
         <w:spacing w:before="120" w:after="120"/>
         <w:rPr>
           <w:rFonts w:ascii="Times New Roman" w:eastAsia="Times New Roman" w:hAnsi="Times New Roman" w:cs="Times New Roman"/>
-          <w:sz w:val="24"/>
-          <w:szCs w:val="24"/>
-        </w:rPr>
-      </w:pPr>
-      <w:r>
-        <w:rPr>
-          <w:rFonts w:ascii="Times New Roman" w:eastAsia="Times New Roman" w:hAnsi="Times New Roman" w:cs="Times New Roman"/>
+          <w:strike/>
+          <w:color w:val="FF0000"/>
+          <w:sz w:val="24"/>
+          <w:szCs w:val="24"/>
+        </w:rPr>
+      </w:pPr>
+      <w:r>
+        <w:rPr>
+          <w:rFonts w:ascii="Times New Roman" w:eastAsia="Times New Roman" w:hAnsi="Times New Roman" w:cs="Times New Roman"/>
+          <w:strike/>
+          <w:color w:val="FF0000"/>
           <w:sz w:val="24"/>
           <w:szCs w:val="24"/>
         </w:rPr>
         <w:t>Is there a troubleshooting guide?</w:t>
       </w:r>
+      <w:r>
+        <w:rPr>
+          <w:rFonts w:ascii="Times New Roman" w:eastAsia="Times New Roman" w:hAnsi="Times New Roman" w:cs="Times New Roman"/>
+          <w:color w:val="FF0000"/>
+          <w:sz w:val="24"/>
+          <w:szCs w:val="24"/>
+        </w:rPr>
+        <w:t xml:space="preserve"> (Removed 3/15 due to not being necessary for innovation)</w:t>
+      </w:r>
+    </w:p>
+    <w:p>
+      <w:pPr>
+        <w:spacing w:before="120" w:after="120"/>
+        <w:rPr>
+          <w:rFonts w:ascii="Times New Roman" w:eastAsia="Times New Roman" w:hAnsi="Times New Roman" w:cs="Times New Roman"/>
+          <w:sz w:val="24"/>
+          <w:szCs w:val="24"/>
+        </w:rPr>
+      </w:pPr>
     </w:p>
     <w:p>
       <w:pPr>
@@ -2329,29 +2679,13 @@
       <w:r>
         <w:rPr>
           <w:rFonts w:ascii="Times New Roman" w:eastAsia="Times New Roman" w:hAnsi="Times New Roman" w:cs="Times New Roman"/>
-          <w:color w:val="FF0000"/>
-          <w:sz w:val="24"/>
-          <w:szCs w:val="24"/>
-        </w:rPr>
-        <w:t>(DONE 2/2</w:t>
-      </w:r>
-      <w:r>
-        <w:rPr>
-          <w:rFonts w:ascii="Times New Roman" w:eastAsia="Times New Roman" w:hAnsi="Times New Roman" w:cs="Times New Roman"/>
-          <w:color w:val="FF0000"/>
-          <w:sz w:val="24"/>
-          <w:szCs w:val="24"/>
-        </w:rPr>
-        <w:t>2</w:t>
-      </w:r>
-      <w:r>
-        <w:rPr>
-          <w:rFonts w:ascii="Times New Roman" w:eastAsia="Times New Roman" w:hAnsi="Times New Roman" w:cs="Times New Roman"/>
-          <w:color w:val="FF0000"/>
-          <w:sz w:val="24"/>
-          <w:szCs w:val="24"/>
-        </w:rPr>
-        <w:t>)</w:t>
+          <w:b/>
+          <w:bCs/>
+          <w:color w:val="00B050"/>
+          <w:sz w:val="24"/>
+          <w:szCs w:val="24"/>
+        </w:rPr>
+        <w:t>(DONE 2/22)</w:t>
       </w:r>
     </w:p>
     <w:p>
@@ -2387,29 +2721,13 @@
       <w:r>
         <w:rPr>
           <w:rFonts w:ascii="Times New Roman" w:eastAsia="Times New Roman" w:hAnsi="Times New Roman" w:cs="Times New Roman"/>
-          <w:color w:val="FF0000"/>
-          <w:sz w:val="24"/>
-          <w:szCs w:val="24"/>
-        </w:rPr>
-        <w:t>(DONE 2/2</w:t>
-      </w:r>
-      <w:r>
-        <w:rPr>
-          <w:rFonts w:ascii="Times New Roman" w:eastAsia="Times New Roman" w:hAnsi="Times New Roman" w:cs="Times New Roman"/>
-          <w:color w:val="FF0000"/>
-          <w:sz w:val="24"/>
-          <w:szCs w:val="24"/>
-        </w:rPr>
-        <w:t>4</w:t>
-      </w:r>
-      <w:r>
-        <w:rPr>
-          <w:rFonts w:ascii="Times New Roman" w:eastAsia="Times New Roman" w:hAnsi="Times New Roman" w:cs="Times New Roman"/>
-          <w:color w:val="FF0000"/>
-          <w:sz w:val="24"/>
-          <w:szCs w:val="24"/>
-        </w:rPr>
-        <w:t>)</w:t>
+          <w:b/>
+          <w:bCs/>
+          <w:color w:val="00B050"/>
+          <w:sz w:val="24"/>
+          <w:szCs w:val="24"/>
+        </w:rPr>
+        <w:t>(DONE 2/24)</w:t>
       </w:r>
     </w:p>
     <w:p>
@@ -2422,17 +2740,19 @@
         <w:spacing w:before="120" w:after="120"/>
         <w:rPr>
           <w:rFonts w:ascii="Times New Roman" w:eastAsia="Times New Roman" w:hAnsi="Times New Roman" w:cs="Times New Roman"/>
-          <w:sz w:val="24"/>
-          <w:szCs w:val="24"/>
-        </w:rPr>
-      </w:pPr>
-      <w:r>
-        <w:rPr>
-          <w:rFonts w:ascii="Times New Roman" w:eastAsia="Times New Roman" w:hAnsi="Times New Roman" w:cs="Times New Roman"/>
-          <w:sz w:val="24"/>
-          <w:szCs w:val="24"/>
-        </w:rPr>
-        <w:lastRenderedPageBreak/>
+          <w:b/>
+          <w:bCs/>
+          <w:color w:val="00B050"/>
+          <w:sz w:val="24"/>
+          <w:szCs w:val="24"/>
+        </w:rPr>
+      </w:pPr>
+      <w:r>
+        <w:rPr>
+          <w:rFonts w:ascii="Times New Roman" w:eastAsia="Times New Roman" w:hAnsi="Times New Roman" w:cs="Times New Roman"/>
+          <w:sz w:val="24"/>
+          <w:szCs w:val="24"/>
+        </w:rPr>
         <w:t>Test DC motors, servos, and full suspensions systems individually then as a system</w:t>
       </w:r>
       <w:r>
@@ -2446,29 +2766,13 @@
       <w:r>
         <w:rPr>
           <w:rFonts w:ascii="Times New Roman" w:eastAsia="Times New Roman" w:hAnsi="Times New Roman" w:cs="Times New Roman"/>
-          <w:color w:val="FF0000"/>
-          <w:sz w:val="24"/>
-          <w:szCs w:val="24"/>
-        </w:rPr>
-        <w:t>(DONE 2/2</w:t>
-      </w:r>
-      <w:r>
-        <w:rPr>
-          <w:rFonts w:ascii="Times New Roman" w:eastAsia="Times New Roman" w:hAnsi="Times New Roman" w:cs="Times New Roman"/>
-          <w:color w:val="FF0000"/>
-          <w:sz w:val="24"/>
-          <w:szCs w:val="24"/>
-        </w:rPr>
-        <w:t>2-2/24</w:t>
-      </w:r>
-      <w:r>
-        <w:rPr>
-          <w:rFonts w:ascii="Times New Roman" w:eastAsia="Times New Roman" w:hAnsi="Times New Roman" w:cs="Times New Roman"/>
-          <w:color w:val="FF0000"/>
-          <w:sz w:val="24"/>
-          <w:szCs w:val="24"/>
-        </w:rPr>
-        <w:t>)</w:t>
+          <w:b/>
+          <w:bCs/>
+          <w:color w:val="00B050"/>
+          <w:sz w:val="24"/>
+          <w:szCs w:val="24"/>
+        </w:rPr>
+        <w:t>(DONE 2/22-2/24)</w:t>
       </w:r>
     </w:p>
     <w:p>
@@ -2491,7 +2795,17 @@
           <w:sz w:val="24"/>
           <w:szCs w:val="24"/>
         </w:rPr>
-        <w:t>Setup interface to drive motors based on shared commands from ESP32 S3 Camera</w:t>
+        <w:t xml:space="preserve">Setup interface to drive motors based on shared commands </w:t>
+      </w:r>
+      <w:r>
+        <w:rPr>
+          <w:rFonts w:ascii="Times New Roman" w:eastAsia="Times New Roman" w:hAnsi="Times New Roman" w:cs="Times New Roman"/>
+          <w:strike/>
+          <w:color w:val="FF0000"/>
+          <w:sz w:val="24"/>
+          <w:szCs w:val="24"/>
+        </w:rPr>
+        <w:t>from ESP32 S3 Camera</w:t>
       </w:r>
       <w:r>
         <w:rPr>
@@ -2504,11 +2818,22 @@
       <w:r>
         <w:rPr>
           <w:rFonts w:ascii="Times New Roman" w:eastAsia="Times New Roman" w:hAnsi="Times New Roman" w:cs="Times New Roman"/>
-          <w:color w:val="FF0000"/>
+          <w:b/>
+          <w:bCs/>
+          <w:color w:val="00B050"/>
           <w:sz w:val="24"/>
           <w:szCs w:val="24"/>
         </w:rPr>
         <w:t>(DONE 2/28)</w:t>
+      </w:r>
+      <w:r>
+        <w:rPr>
+          <w:rFonts w:ascii="Times New Roman" w:eastAsia="Times New Roman" w:hAnsi="Times New Roman" w:cs="Times New Roman"/>
+          <w:color w:val="00B050"/>
+          <w:sz w:val="24"/>
+          <w:szCs w:val="24"/>
+        </w:rPr>
+        <w:t xml:space="preserve"> </w:t>
       </w:r>
     </w:p>
     <w:p>
@@ -2544,13 +2869,17 @@
         <w:spacing w:before="120" w:after="120"/>
         <w:rPr>
           <w:rFonts w:ascii="Times New Roman" w:eastAsia="Times New Roman" w:hAnsi="Times New Roman" w:cs="Times New Roman"/>
-          <w:sz w:val="24"/>
-          <w:szCs w:val="24"/>
-        </w:rPr>
-      </w:pPr>
-      <w:r>
-        <w:rPr>
-          <w:rFonts w:ascii="Times New Roman" w:eastAsia="Times New Roman" w:hAnsi="Times New Roman" w:cs="Times New Roman"/>
+          <w:strike/>
+          <w:color w:val="FF0000"/>
+          <w:sz w:val="24"/>
+          <w:szCs w:val="24"/>
+        </w:rPr>
+      </w:pPr>
+      <w:r>
+        <w:rPr>
+          <w:rFonts w:ascii="Times New Roman" w:eastAsia="Times New Roman" w:hAnsi="Times New Roman" w:cs="Times New Roman"/>
+          <w:strike/>
+          <w:color w:val="FF0000"/>
           <w:sz w:val="24"/>
           <w:szCs w:val="24"/>
         </w:rPr>
@@ -2559,55 +2888,12 @@
       <w:r>
         <w:rPr>
           <w:rFonts w:ascii="Times New Roman" w:eastAsia="Times New Roman" w:hAnsi="Times New Roman" w:cs="Times New Roman"/>
-          <w:sz w:val="24"/>
-          <w:szCs w:val="24"/>
-        </w:rPr>
-        <w:t xml:space="preserve"> </w:t>
-      </w:r>
-      <w:r>
-        <w:rPr>
-          <w:rFonts w:ascii="Times New Roman" w:eastAsia="Times New Roman" w:hAnsi="Times New Roman" w:cs="Times New Roman"/>
-          <w:color w:val="FF0000"/>
-          <w:sz w:val="24"/>
-          <w:szCs w:val="24"/>
-        </w:rPr>
-        <w:t xml:space="preserve">(DONE </w:t>
-      </w:r>
-      <w:r>
-        <w:rPr>
-          <w:rFonts w:ascii="Times New Roman" w:eastAsia="Times New Roman" w:hAnsi="Times New Roman" w:cs="Times New Roman"/>
-          <w:color w:val="FF0000"/>
-          <w:sz w:val="24"/>
-          <w:szCs w:val="24"/>
-        </w:rPr>
-        <w:t>2/22-</w:t>
-      </w:r>
-      <w:r>
-        <w:rPr>
-          <w:rFonts w:ascii="Times New Roman" w:eastAsia="Times New Roman" w:hAnsi="Times New Roman" w:cs="Times New Roman"/>
-          <w:color w:val="FF0000"/>
-          <w:sz w:val="24"/>
-          <w:szCs w:val="24"/>
-        </w:rPr>
-        <w:t>2/2</w:t>
-      </w:r>
-      <w:r>
-        <w:rPr>
-          <w:rFonts w:ascii="Times New Roman" w:eastAsia="Times New Roman" w:hAnsi="Times New Roman" w:cs="Times New Roman"/>
-          <w:color w:val="FF0000"/>
-          <w:sz w:val="24"/>
-          <w:szCs w:val="24"/>
-        </w:rPr>
-        <w:t>6</w:t>
-      </w:r>
-      <w:r>
-        <w:rPr>
-          <w:rFonts w:ascii="Times New Roman" w:eastAsia="Times New Roman" w:hAnsi="Times New Roman" w:cs="Times New Roman"/>
-          <w:color w:val="FF0000"/>
-          <w:sz w:val="24"/>
-          <w:szCs w:val="24"/>
-        </w:rPr>
-        <w:t>)</w:t>
+          <w:strike/>
+          <w:color w:val="FF0000"/>
+          <w:sz w:val="24"/>
+          <w:szCs w:val="24"/>
+        </w:rPr>
+        <w:t xml:space="preserve"> (DONE 2/22-2/26)</w:t>
       </w:r>
     </w:p>
     <w:p>
@@ -2620,13 +2906,17 @@
         <w:spacing w:before="120" w:after="120"/>
         <w:rPr>
           <w:rFonts w:ascii="Times New Roman" w:eastAsia="Times New Roman" w:hAnsi="Times New Roman" w:cs="Times New Roman"/>
-          <w:sz w:val="24"/>
-          <w:szCs w:val="24"/>
-        </w:rPr>
-      </w:pPr>
-      <w:r>
-        <w:rPr>
-          <w:rFonts w:ascii="Times New Roman" w:eastAsia="Times New Roman" w:hAnsi="Times New Roman" w:cs="Times New Roman"/>
+          <w:strike/>
+          <w:color w:val="FF0000"/>
+          <w:sz w:val="24"/>
+          <w:szCs w:val="24"/>
+        </w:rPr>
+      </w:pPr>
+      <w:r>
+        <w:rPr>
+          <w:rFonts w:ascii="Times New Roman" w:eastAsia="Times New Roman" w:hAnsi="Times New Roman" w:cs="Times New Roman"/>
+          <w:strike/>
+          <w:color w:val="FF0000"/>
           <w:sz w:val="24"/>
           <w:szCs w:val="24"/>
         </w:rPr>
@@ -2635,6 +2925,8 @@
       <w:r>
         <w:rPr>
           <w:rFonts w:ascii="Times New Roman" w:eastAsia="Times New Roman" w:hAnsi="Times New Roman" w:cs="Times New Roman"/>
+          <w:strike/>
+          <w:color w:val="FF0000"/>
           <w:sz w:val="24"/>
           <w:szCs w:val="24"/>
         </w:rPr>
@@ -2643,6 +2935,8 @@
       <w:r>
         <w:rPr>
           <w:rFonts w:ascii="Times New Roman" w:eastAsia="Times New Roman" w:hAnsi="Times New Roman" w:cs="Times New Roman"/>
+          <w:strike/>
+          <w:color w:val="FF0000"/>
           <w:sz w:val="24"/>
           <w:szCs w:val="24"/>
         </w:rPr>
@@ -2651,6 +2945,8 @@
       <w:r>
         <w:rPr>
           <w:rFonts w:ascii="Times New Roman" w:eastAsia="Times New Roman" w:hAnsi="Times New Roman" w:cs="Times New Roman"/>
+          <w:strike/>
+          <w:color w:val="FF0000"/>
           <w:sz w:val="24"/>
           <w:szCs w:val="24"/>
         </w:rPr>
@@ -2659,6 +2955,8 @@
       <w:r>
         <w:rPr>
           <w:rFonts w:ascii="Times New Roman" w:eastAsia="Times New Roman" w:hAnsi="Times New Roman" w:cs="Times New Roman"/>
+          <w:strike/>
+          <w:color w:val="FF0000"/>
           <w:sz w:val="24"/>
           <w:szCs w:val="24"/>
         </w:rPr>
@@ -2667,6 +2965,8 @@
       <w:r>
         <w:rPr>
           <w:rFonts w:ascii="Times New Roman" w:eastAsia="Times New Roman" w:hAnsi="Times New Roman" w:cs="Times New Roman"/>
+          <w:strike/>
+          <w:color w:val="FF0000"/>
           <w:sz w:val="24"/>
           <w:szCs w:val="24"/>
         </w:rPr>
@@ -2675,6 +2975,8 @@
       <w:r>
         <w:rPr>
           <w:rFonts w:ascii="Times New Roman" w:eastAsia="Times New Roman" w:hAnsi="Times New Roman" w:cs="Times New Roman"/>
+          <w:strike/>
+          <w:color w:val="FF0000"/>
           <w:sz w:val="24"/>
           <w:szCs w:val="24"/>
         </w:rPr>
@@ -2683,6 +2985,8 @@
       <w:r>
         <w:rPr>
           <w:rFonts w:ascii="Times New Roman" w:eastAsia="Times New Roman" w:hAnsi="Times New Roman" w:cs="Times New Roman"/>
+          <w:strike/>
+          <w:color w:val="FF0000"/>
           <w:sz w:val="24"/>
           <w:szCs w:val="24"/>
         </w:rPr>
@@ -2691,6 +2995,8 @@
       <w:r>
         <w:rPr>
           <w:rFonts w:ascii="Times New Roman" w:eastAsia="Times New Roman" w:hAnsi="Times New Roman" w:cs="Times New Roman"/>
+          <w:strike/>
+          <w:color w:val="FF0000"/>
           <w:sz w:val="24"/>
           <w:szCs w:val="24"/>
         </w:rPr>
@@ -2699,38 +3005,42 @@
       <w:r>
         <w:rPr>
           <w:rFonts w:ascii="Times New Roman" w:eastAsia="Times New Roman" w:hAnsi="Times New Roman" w:cs="Times New Roman"/>
-          <w:color w:val="FF0000"/>
-          <w:sz w:val="24"/>
-          <w:szCs w:val="24"/>
-        </w:rPr>
-        <w:t xml:space="preserve">Changed from </w:t>
-      </w:r>
-      <w:r>
-        <w:rPr>
-          <w:rFonts w:ascii="Times New Roman" w:eastAsia="Times New Roman" w:hAnsi="Times New Roman" w:cs="Times New Roman"/>
-          <w:color w:val="FF0000"/>
-          <w:sz w:val="24"/>
-          <w:szCs w:val="24"/>
-        </w:rPr>
-        <w:t>Teensy4.1 Microcontroller</w:t>
-      </w:r>
-      <w:r>
-        <w:rPr>
-          <w:rFonts w:ascii="Times New Roman" w:eastAsia="Times New Roman" w:hAnsi="Times New Roman" w:cs="Times New Roman"/>
-          <w:color w:val="FF0000"/>
-          <w:sz w:val="24"/>
-          <w:szCs w:val="24"/>
-        </w:rPr>
-        <w:t xml:space="preserve"> on 2/22/25</w:t>
-      </w:r>
-      <w:r>
-        <w:rPr>
-          <w:rFonts w:ascii="Times New Roman" w:eastAsia="Times New Roman" w:hAnsi="Times New Roman" w:cs="Times New Roman"/>
+          <w:strike/>
+          <w:color w:val="FF0000"/>
+          <w:sz w:val="24"/>
+          <w:szCs w:val="24"/>
+        </w:rPr>
+        <w:t>Changed from Teensy4.1 Microcontroller on 2/22/25</w:t>
+      </w:r>
+      <w:r>
+        <w:rPr>
+          <w:rFonts w:ascii="Times New Roman" w:eastAsia="Times New Roman" w:hAnsi="Times New Roman" w:cs="Times New Roman"/>
+          <w:strike/>
           <w:color w:val="FF0000"/>
           <w:sz w:val="24"/>
           <w:szCs w:val="24"/>
         </w:rPr>
         <w:t>, Changed from USART to wireless due to camera already calling LLM API(2/26/25)</w:t>
+      </w:r>
+      <w:r>
+        <w:rPr>
+          <w:rFonts w:ascii="Times New Roman" w:eastAsia="Times New Roman" w:hAnsi="Times New Roman" w:cs="Times New Roman"/>
+          <w:color w:val="FF0000"/>
+          <w:sz w:val="24"/>
+          <w:szCs w:val="24"/>
+        </w:rPr>
+        <w:t xml:space="preserve"> </w:t>
+      </w:r>
+      <w:r>
+        <w:rPr>
+          <w:rFonts w:ascii="Times New Roman" w:eastAsia="Times New Roman" w:hAnsi="Times New Roman" w:cs="Times New Roman"/>
+          <w:b/>
+          <w:bCs/>
+          <w:color w:val="FF0000"/>
+          <w:sz w:val="24"/>
+          <w:szCs w:val="24"/>
+        </w:rPr>
+        <w:t>Removed 3/15 due to pivot</w:t>
       </w:r>
     </w:p>
     <w:p>
@@ -2743,6 +3053,43 @@
         <w:spacing w:before="120" w:after="120"/>
         <w:rPr>
           <w:rFonts w:ascii="Times New Roman" w:eastAsia="Times New Roman" w:hAnsi="Times New Roman" w:cs="Times New Roman"/>
+          <w:b/>
+          <w:bCs/>
+          <w:color w:val="00B050"/>
+          <w:sz w:val="24"/>
+          <w:szCs w:val="24"/>
+        </w:rPr>
+      </w:pPr>
+      <w:r>
+        <w:rPr>
+          <w:rFonts w:ascii="Times New Roman" w:eastAsia="Times New Roman" w:hAnsi="Times New Roman" w:cs="Times New Roman"/>
+          <w:sz w:val="24"/>
+          <w:szCs w:val="24"/>
+        </w:rPr>
+        <w:t xml:space="preserve">Test Ultrasonic sensor object detection and determine correct ranges </w:t>
+      </w:r>
+      <w:r>
+        <w:rPr>
+          <w:rFonts w:ascii="Times New Roman" w:eastAsia="Times New Roman" w:hAnsi="Times New Roman" w:cs="Times New Roman"/>
+          <w:b/>
+          <w:bCs/>
+          <w:color w:val="00B050"/>
+          <w:sz w:val="24"/>
+          <w:szCs w:val="24"/>
+        </w:rPr>
+        <w:t>(DONE 3/10)</w:t>
+      </w:r>
+    </w:p>
+    <w:p>
+      <w:pPr>
+        <w:pStyle w:val="ListParagraph"/>
+        <w:numPr>
+          <w:ilvl w:val="1"/>
+          <w:numId w:val="5"/>
+        </w:numPr>
+        <w:spacing w:before="120" w:after="120"/>
+        <w:rPr>
+          <w:rFonts w:ascii="Times New Roman" w:eastAsia="Times New Roman" w:hAnsi="Times New Roman" w:cs="Times New Roman"/>
           <w:sz w:val="24"/>
           <w:szCs w:val="24"/>
         </w:rPr>
@@ -2766,29 +3113,77 @@
       <w:r>
         <w:rPr>
           <w:rFonts w:ascii="Times New Roman" w:eastAsia="Times New Roman" w:hAnsi="Times New Roman" w:cs="Times New Roman"/>
-          <w:color w:val="FF0000"/>
-          <w:sz w:val="24"/>
-          <w:szCs w:val="24"/>
-        </w:rPr>
-        <w:t>(DONE 2/2</w:t>
-      </w:r>
-      <w:r>
-        <w:rPr>
-          <w:rFonts w:ascii="Times New Roman" w:eastAsia="Times New Roman" w:hAnsi="Times New Roman" w:cs="Times New Roman"/>
-          <w:color w:val="FF0000"/>
-          <w:sz w:val="24"/>
-          <w:szCs w:val="24"/>
-        </w:rPr>
-        <w:t>6</w:t>
-      </w:r>
-      <w:r>
-        <w:rPr>
-          <w:rFonts w:ascii="Times New Roman" w:eastAsia="Times New Roman" w:hAnsi="Times New Roman" w:cs="Times New Roman"/>
-          <w:color w:val="FF0000"/>
+          <w:b/>
+          <w:bCs/>
+          <w:color w:val="00B050"/>
+          <w:sz w:val="24"/>
+          <w:szCs w:val="24"/>
+        </w:rPr>
+        <w:t xml:space="preserve">(DONE </w:t>
+      </w:r>
+      <w:r>
+        <w:rPr>
+          <w:rFonts w:ascii="Times New Roman" w:eastAsia="Times New Roman" w:hAnsi="Times New Roman" w:cs="Times New Roman"/>
+          <w:b/>
+          <w:bCs/>
+          <w:color w:val="00B050"/>
+          <w:sz w:val="24"/>
+          <w:szCs w:val="24"/>
+        </w:rPr>
+        <w:t>3/10</w:t>
+      </w:r>
+      <w:r>
+        <w:rPr>
+          <w:rFonts w:ascii="Times New Roman" w:eastAsia="Times New Roman" w:hAnsi="Times New Roman" w:cs="Times New Roman"/>
+          <w:b/>
+          <w:bCs/>
+          <w:color w:val="00B050"/>
           <w:sz w:val="24"/>
           <w:szCs w:val="24"/>
         </w:rPr>
         <w:t>)</w:t>
+      </w:r>
+    </w:p>
+    <w:p>
+      <w:pPr>
+        <w:pStyle w:val="ListParagraph"/>
+        <w:numPr>
+          <w:ilvl w:val="1"/>
+          <w:numId w:val="5"/>
+        </w:numPr>
+        <w:spacing w:before="120" w:after="120"/>
+        <w:rPr>
+          <w:rFonts w:ascii="Times New Roman" w:eastAsia="Times New Roman" w:hAnsi="Times New Roman" w:cs="Times New Roman"/>
+          <w:sz w:val="24"/>
+          <w:szCs w:val="24"/>
+        </w:rPr>
+      </w:pPr>
+      <w:r>
+        <w:rPr>
+          <w:rFonts w:ascii="Times New Roman" w:eastAsia="Times New Roman" w:hAnsi="Times New Roman" w:cs="Times New Roman"/>
+          <w:sz w:val="24"/>
+          <w:szCs w:val="24"/>
+        </w:rPr>
+        <w:t xml:space="preserve">Test TOF object region detection and </w:t>
+      </w:r>
+      <w:r>
+        <w:rPr>
+          <w:rFonts w:ascii="Times New Roman" w:eastAsia="Times New Roman" w:hAnsi="Times New Roman" w:cs="Times New Roman"/>
+          <w:sz w:val="24"/>
+          <w:szCs w:val="24"/>
+        </w:rPr>
+        <w:t xml:space="preserve">obstacle cache </w:t>
+      </w:r>
+      <w:r>
+        <w:rPr>
+          <w:rFonts w:ascii="Times New Roman" w:eastAsia="Times New Roman" w:hAnsi="Times New Roman" w:cs="Times New Roman"/>
+          <w:b/>
+          <w:bCs/>
+          <w:color w:val="4BACC6" w:themeColor="accent5"/>
+          <w:sz w:val="24"/>
+          <w:szCs w:val="24"/>
+        </w:rPr>
+        <w:t>Added 3/15</w:t>
       </w:r>
     </w:p>
     <w:p>
@@ -2862,7 +3257,9 @@
       <w:r>
         <w:rPr>
           <w:rFonts w:ascii="Times New Roman" w:eastAsia="Times New Roman" w:hAnsi="Times New Roman" w:cs="Times New Roman"/>
-          <w:color w:val="FF0000"/>
+          <w:b/>
+          <w:bCs/>
+          <w:color w:val="00B050"/>
           <w:sz w:val="24"/>
           <w:szCs w:val="24"/>
         </w:rPr>
@@ -2889,16 +3286,35 @@
           <w:sz w:val="24"/>
           <w:szCs w:val="24"/>
         </w:rPr>
-        <w:t>Setup start/stop commands from ESP32 camera that a user can send to start autonomous control</w:t>
-      </w:r>
-      <w:r>
-        <w:rPr>
-          <w:rFonts w:ascii="Times New Roman" w:eastAsia="Times New Roman" w:hAnsi="Times New Roman" w:cs="Times New Roman"/>
-          <w:color w:val="FF0000"/>
-          <w:sz w:val="24"/>
-          <w:szCs w:val="24"/>
-        </w:rPr>
-        <w:t>(DONE 2/28)</w:t>
+        <w:t>Setup start/stop/left/right/backwards commands user can send to rover from command system</w:t>
+      </w:r>
+      <w:r>
+        <w:rPr>
+          <w:rFonts w:ascii="Times New Roman" w:eastAsia="Times New Roman" w:hAnsi="Times New Roman" w:cs="Times New Roman"/>
+          <w:sz w:val="24"/>
+          <w:szCs w:val="24"/>
+        </w:rPr>
+        <w:t xml:space="preserve"> </w:t>
+      </w:r>
+      <w:r>
+        <w:rPr>
+          <w:rFonts w:ascii="Times New Roman" w:eastAsia="Times New Roman" w:hAnsi="Times New Roman" w:cs="Times New Roman"/>
+          <w:b/>
+          <w:bCs/>
+          <w:color w:val="00B050"/>
+          <w:sz w:val="24"/>
+          <w:szCs w:val="24"/>
+        </w:rPr>
+        <w:t>(DONE 3/10)</w:t>
+      </w:r>
+      <w:r>
+        <w:rPr>
+          <w:rFonts w:ascii="Times New Roman" w:eastAsia="Times New Roman" w:hAnsi="Times New Roman" w:cs="Times New Roman"/>
+          <w:color w:val="00B050"/>
+          <w:sz w:val="24"/>
+          <w:szCs w:val="24"/>
+        </w:rPr>
+        <w:t xml:space="preserve"> </w:t>
       </w:r>
     </w:p>
     <w:p>
@@ -2911,6 +3327,52 @@
         <w:spacing w:before="120" w:after="120"/>
         <w:rPr>
           <w:rFonts w:ascii="Times New Roman" w:eastAsia="Times New Roman" w:hAnsi="Times New Roman" w:cs="Times New Roman"/>
+          <w:strike/>
+          <w:color w:val="FF0000"/>
+          <w:sz w:val="24"/>
+          <w:szCs w:val="24"/>
+        </w:rPr>
+      </w:pPr>
+      <w:r>
+        <w:rPr>
+          <w:rFonts w:ascii="Times New Roman" w:eastAsia="Times New Roman" w:hAnsi="Times New Roman" w:cs="Times New Roman"/>
+          <w:strike/>
+          <w:color w:val="FF0000"/>
+          <w:sz w:val="24"/>
+          <w:szCs w:val="24"/>
+        </w:rPr>
+        <w:t>Setup start/stop commands from ESP32 camera that a user can send to start autonomous control</w:t>
+      </w:r>
+      <w:r>
+        <w:rPr>
+          <w:rFonts w:ascii="Times New Roman" w:eastAsia="Times New Roman" w:hAnsi="Times New Roman" w:cs="Times New Roman"/>
+          <w:strike/>
+          <w:color w:val="FF0000"/>
+          <w:sz w:val="24"/>
+          <w:szCs w:val="24"/>
+        </w:rPr>
+        <w:t>(DONE 2/28)</w:t>
+      </w:r>
+      <w:r>
+        <w:rPr>
+          <w:rFonts w:ascii="Times New Roman" w:eastAsia="Times New Roman" w:hAnsi="Times New Roman" w:cs="Times New Roman"/>
+          <w:color w:val="FF0000"/>
+          <w:sz w:val="24"/>
+          <w:szCs w:val="24"/>
+        </w:rPr>
+        <w:t xml:space="preserve"> Removed 3/15 due to pivot</w:t>
+      </w:r>
+    </w:p>
+    <w:p>
+      <w:pPr>
+        <w:pStyle w:val="ListParagraph"/>
+        <w:numPr>
+          <w:ilvl w:val="1"/>
+          <w:numId w:val="5"/>
+        </w:numPr>
+        <w:spacing w:before="120" w:after="120"/>
+        <w:rPr>
+          <w:rFonts w:ascii="Times New Roman" w:eastAsia="Times New Roman" w:hAnsi="Times New Roman" w:cs="Times New Roman"/>
           <w:sz w:val="24"/>
           <w:szCs w:val="24"/>
         </w:rPr>
@@ -2922,6 +3384,25 @@
           <w:szCs w:val="24"/>
         </w:rPr>
         <w:t>Setup ultrasonic sensors as an emergency stop</w:t>
+      </w:r>
+      <w:r>
+        <w:rPr>
+          <w:rFonts w:ascii="Times New Roman" w:eastAsia="Times New Roman" w:hAnsi="Times New Roman" w:cs="Times New Roman"/>
+          <w:sz w:val="24"/>
+          <w:szCs w:val="24"/>
+        </w:rPr>
+        <w:t xml:space="preserve"> </w:t>
+      </w:r>
+      <w:r>
+        <w:rPr>
+          <w:rFonts w:ascii="Times New Roman" w:eastAsia="Times New Roman" w:hAnsi="Times New Roman" w:cs="Times New Roman"/>
+          <w:b/>
+          <w:bCs/>
+          <w:color w:val="00B050"/>
+          <w:sz w:val="24"/>
+          <w:szCs w:val="24"/>
+        </w:rPr>
+        <w:t>(DONE 3/10)</w:t>
       </w:r>
     </w:p>
     <w:p>
@@ -2967,7 +3448,48 @@
           <w:sz w:val="24"/>
           <w:szCs w:val="24"/>
         </w:rPr>
-        <w:t>Create sensor fusion between ESP32 S3 Camera output and ultrasonic sensors.</w:t>
+        <w:t xml:space="preserve">Create sensor fusion between </w:t>
+      </w:r>
+      <w:r>
+        <w:rPr>
+          <w:rFonts w:ascii="Times New Roman" w:eastAsia="Times New Roman" w:hAnsi="Times New Roman" w:cs="Times New Roman"/>
+          <w:strike/>
+          <w:sz w:val="24"/>
+          <w:szCs w:val="24"/>
+        </w:rPr>
+        <w:t>ESP32 S3 Camera</w:t>
+      </w:r>
+      <w:r>
+        <w:rPr>
+          <w:rFonts w:ascii="Times New Roman" w:eastAsia="Times New Roman" w:hAnsi="Times New Roman" w:cs="Times New Roman"/>
+          <w:sz w:val="24"/>
+          <w:szCs w:val="24"/>
+        </w:rPr>
+        <w:t xml:space="preserve"> </w:t>
+      </w:r>
+      <w:r>
+        <w:rPr>
+          <w:rFonts w:ascii="Times New Roman" w:eastAsia="Times New Roman" w:hAnsi="Times New Roman" w:cs="Times New Roman"/>
+          <w:sz w:val="24"/>
+          <w:szCs w:val="24"/>
+        </w:rPr>
+        <w:t xml:space="preserve">TOF </w:t>
+      </w:r>
+      <w:r>
+        <w:rPr>
+          <w:rFonts w:ascii="Times New Roman" w:eastAsia="Times New Roman" w:hAnsi="Times New Roman" w:cs="Times New Roman"/>
+          <w:sz w:val="24"/>
+          <w:szCs w:val="24"/>
+        </w:rPr>
+        <w:t>output and ultrasonic sensors.</w:t>
+      </w:r>
+      <w:r>
+        <w:rPr>
+          <w:rFonts w:ascii="Times New Roman" w:eastAsia="Times New Roman" w:hAnsi="Times New Roman" w:cs="Times New Roman"/>
+          <w:sz w:val="24"/>
+          <w:szCs w:val="24"/>
+        </w:rPr>
+        <w:t xml:space="preserve"> </w:t>
       </w:r>
     </w:p>
     <w:p>
@@ -3026,7 +3548,9 @@
       <w:r>
         <w:rPr>
           <w:rFonts w:ascii="Times New Roman" w:eastAsia="Times New Roman" w:hAnsi="Times New Roman" w:cs="Times New Roman"/>
-          <w:color w:val="FF0000"/>
+          <w:b/>
+          <w:bCs/>
+          <w:color w:val="00B050"/>
           <w:sz w:val="24"/>
           <w:szCs w:val="24"/>
         </w:rPr>
@@ -3066,7 +3590,9 @@
       <w:r>
         <w:rPr>
           <w:rFonts w:ascii="Times New Roman" w:eastAsia="Times New Roman" w:hAnsi="Times New Roman" w:cs="Times New Roman"/>
-          <w:color w:val="FF0000"/>
+          <w:b/>
+          <w:bCs/>
+          <w:color w:val="00B050"/>
           <w:sz w:val="24"/>
           <w:szCs w:val="24"/>
         </w:rPr>
@@ -3095,6 +3621,25 @@
         </w:rPr>
         <w:t>Setup trap door for material spreading</w:t>
       </w:r>
+      <w:r>
+        <w:rPr>
+          <w:rFonts w:ascii="Times New Roman" w:eastAsia="Times New Roman" w:hAnsi="Times New Roman" w:cs="Times New Roman"/>
+          <w:sz w:val="24"/>
+          <w:szCs w:val="24"/>
+        </w:rPr>
+        <w:t xml:space="preserve"> </w:t>
+      </w:r>
+      <w:r>
+        <w:rPr>
+          <w:rFonts w:ascii="Times New Roman" w:eastAsia="Times New Roman" w:hAnsi="Times New Roman" w:cs="Times New Roman"/>
+          <w:b/>
+          <w:bCs/>
+          <w:color w:val="00B050"/>
+          <w:sz w:val="24"/>
+          <w:szCs w:val="24"/>
+        </w:rPr>
+        <w:t>(DONE 3/3)</w:t>
+      </w:r>
     </w:p>
     <w:p>
       <w:pPr>
@@ -3116,7 +3661,29 @@
           <w:sz w:val="24"/>
           <w:szCs w:val="24"/>
         </w:rPr>
-        <w:t>Connect to rover</w:t>
+        <w:t xml:space="preserve">Connect to </w:t>
+      </w:r>
+      <w:r>
+        <w:rPr>
+          <w:rFonts w:ascii="Times New Roman" w:eastAsia="Times New Roman" w:hAnsi="Times New Roman" w:cs="Times New Roman"/>
+          <w:b/>
+          <w:bCs/>
+          <w:color w:val="00B050"/>
+          <w:sz w:val="24"/>
+          <w:szCs w:val="24"/>
+        </w:rPr>
+        <w:t>rover</w:t>
+      </w:r>
+      <w:r>
+        <w:rPr>
+          <w:rFonts w:ascii="Times New Roman" w:eastAsia="Times New Roman" w:hAnsi="Times New Roman" w:cs="Times New Roman"/>
+          <w:b/>
+          <w:bCs/>
+          <w:color w:val="00B050"/>
+          <w:sz w:val="24"/>
+          <w:szCs w:val="24"/>
+        </w:rPr>
+        <w:t xml:space="preserve"> (DONE 3/3)</w:t>
       </w:r>
     </w:p>
     <w:p>
@@ -3139,8 +3706,157 @@
           <w:sz w:val="24"/>
           <w:szCs w:val="24"/>
         </w:rPr>
+        <w:t>Final rover design</w:t>
+      </w:r>
+      <w:r>
+        <w:rPr>
+          <w:rFonts w:ascii="Times New Roman" w:eastAsia="Times New Roman" w:hAnsi="Times New Roman" w:cs="Times New Roman"/>
+          <w:color w:val="FF0000"/>
+          <w:sz w:val="24"/>
+          <w:szCs w:val="24"/>
+        </w:rPr>
+        <w:t xml:space="preserve"> </w:t>
+      </w:r>
+      <w:r>
+        <w:rPr>
+          <w:rFonts w:ascii="Times New Roman" w:eastAsia="Times New Roman" w:hAnsi="Times New Roman" w:cs="Times New Roman"/>
+          <w:b/>
+          <w:bCs/>
+          <w:color w:val="4BACC6" w:themeColor="accent5"/>
+          <w:sz w:val="24"/>
+          <w:szCs w:val="24"/>
+        </w:rPr>
+        <w:t>(ADDED 3/15 to account for final items before SIP309)</w:t>
+      </w:r>
+    </w:p>
+    <w:p>
+      <w:pPr>
+        <w:pStyle w:val="ListParagraph"/>
+        <w:numPr>
+          <w:ilvl w:val="1"/>
+          <w:numId w:val="5"/>
+        </w:numPr>
+        <w:spacing w:before="120" w:after="120"/>
+        <w:rPr>
+          <w:rFonts w:ascii="Times New Roman" w:eastAsia="Times New Roman" w:hAnsi="Times New Roman" w:cs="Times New Roman"/>
+          <w:sz w:val="24"/>
+          <w:szCs w:val="24"/>
+        </w:rPr>
+      </w:pPr>
+      <w:r>
+        <w:rPr>
+          <w:rFonts w:ascii="Times New Roman" w:eastAsia="Times New Roman" w:hAnsi="Times New Roman" w:cs="Times New Roman"/>
+          <w:sz w:val="24"/>
+          <w:szCs w:val="24"/>
+        </w:rPr>
+        <w:lastRenderedPageBreak/>
+        <w:t>Design modular rover chassis that fits all electronics and keeps them safe from the outside.</w:t>
+      </w:r>
+    </w:p>
+    <w:p>
+      <w:pPr>
+        <w:pStyle w:val="ListParagraph"/>
+        <w:numPr>
+          <w:ilvl w:val="1"/>
+          <w:numId w:val="5"/>
+        </w:numPr>
+        <w:spacing w:before="120" w:after="120"/>
+        <w:rPr>
+          <w:rFonts w:ascii="Times New Roman" w:eastAsia="Times New Roman" w:hAnsi="Times New Roman" w:cs="Times New Roman"/>
+          <w:sz w:val="24"/>
+          <w:szCs w:val="24"/>
+        </w:rPr>
+      </w:pPr>
+      <w:r>
+        <w:rPr>
+          <w:rFonts w:ascii="Times New Roman" w:eastAsia="Times New Roman" w:hAnsi="Times New Roman" w:cs="Times New Roman"/>
+          <w:sz w:val="24"/>
+          <w:szCs w:val="24"/>
+        </w:rPr>
+        <w:t xml:space="preserve">Design planetary gear system to turn the wheels from DC motor output </w:t>
+      </w:r>
+    </w:p>
+    <w:p>
+      <w:pPr>
+        <w:pStyle w:val="ListParagraph"/>
+        <w:spacing w:before="120" w:after="120"/>
+        <w:ind w:left="1440"/>
+        <w:rPr>
+          <w:rFonts w:ascii="Times New Roman" w:eastAsia="Times New Roman" w:hAnsi="Times New Roman" w:cs="Times New Roman"/>
+          <w:b/>
+          <w:bCs/>
+          <w:color w:val="4BACC6" w:themeColor="accent5"/>
+          <w:sz w:val="24"/>
+          <w:szCs w:val="24"/>
+        </w:rPr>
+      </w:pPr>
+      <w:r>
+        <w:rPr>
+          <w:rFonts w:ascii="Times New Roman" w:eastAsia="Times New Roman" w:hAnsi="Times New Roman" w:cs="Times New Roman"/>
+          <w:b/>
+          <w:bCs/>
+          <w:color w:val="4BACC6" w:themeColor="accent5"/>
+          <w:sz w:val="24"/>
+          <w:szCs w:val="24"/>
+        </w:rPr>
+        <w:t>(ADDED due to issues with wheel design I got from the instructables website, gears are stripping and the system as a whole is too fragile for extended usage)</w:t>
+      </w:r>
+    </w:p>
+    <w:p>
+      <w:pPr>
+        <w:pStyle w:val="ListParagraph"/>
+        <w:numPr>
+          <w:ilvl w:val="1"/>
+          <w:numId w:val="5"/>
+        </w:numPr>
+        <w:spacing w:before="120" w:after="120"/>
+        <w:rPr>
+          <w:rFonts w:ascii="Times New Roman" w:eastAsia="Times New Roman" w:hAnsi="Times New Roman" w:cs="Times New Roman"/>
+          <w:sz w:val="24"/>
+          <w:szCs w:val="24"/>
+        </w:rPr>
+      </w:pPr>
+      <w:r>
+        <w:rPr>
+          <w:rFonts w:ascii="Times New Roman" w:eastAsia="Times New Roman" w:hAnsi="Times New Roman" w:cs="Times New Roman"/>
+          <w:sz w:val="24"/>
+          <w:szCs w:val="24"/>
+        </w:rPr>
+        <w:t>Integrate TOF sensor into obstacle detection for rover</w:t>
+      </w:r>
+    </w:p>
+    <w:p>
+      <w:pPr>
+        <w:pStyle w:val="ListParagraph"/>
+        <w:numPr>
+          <w:ilvl w:val="0"/>
+          <w:numId w:val="5"/>
+        </w:numPr>
+        <w:spacing w:before="120" w:after="120"/>
+        <w:rPr>
+          <w:rFonts w:ascii="Times New Roman" w:eastAsia="Times New Roman" w:hAnsi="Times New Roman" w:cs="Times New Roman"/>
+          <w:sz w:val="24"/>
+          <w:szCs w:val="24"/>
+        </w:rPr>
+      </w:pPr>
+      <w:r>
+        <w:rPr>
+          <w:rFonts w:ascii="Times New Roman" w:eastAsia="Times New Roman" w:hAnsi="Times New Roman" w:cs="Times New Roman"/>
+          <w:sz w:val="24"/>
+          <w:szCs w:val="24"/>
+        </w:rPr>
         <w:t>Test full system integration</w:t>
       </w:r>
+    </w:p>
+    <w:p>
+      <w:pPr>
+        <w:spacing w:before="120" w:after="120"/>
+        <w:rPr>
+          <w:rFonts w:ascii="Times New Roman" w:eastAsia="Times New Roman" w:hAnsi="Times New Roman" w:cs="Times New Roman"/>
+          <w:sz w:val="24"/>
+          <w:szCs w:val="24"/>
+        </w:rPr>
+      </w:pPr>
     </w:p>
     <w:p>
       <w:pPr>
@@ -3191,7 +3907,7 @@
           <w:sz w:val="24"/>
           <w:szCs w:val="24"/>
         </w:rPr>
-        <w:t xml:space="preserve">of the XIAOS3 Cam by connecting it to an LLM and feeding the image captured to the LLM by sending the base64 encoded version to an API. I plan on starting with Claude, and then moving over to a local open-source LLM I want to setup on my local router network, if time permits. </w:t>
+        <w:t xml:space="preserve">using an Ultrasonic sensor as the base which will be used to detect if the rover needs to stop and then a TOF sensor to determine whether or not the rover can try to navigate around the obstacle. </w:t>
       </w:r>
       <w:r>
         <w:rPr>
@@ -3201,6 +3917,46 @@
           <w:sz w:val="24"/>
           <w:szCs w:val="24"/>
         </w:rPr>
+        <w:t>of the XIAOS3 Cam by connecting it to an LLM and feeding the image captured to the LLM by sending the base64 encoded version to an API. I plan on starting with Claude, and then moving over to a local open-source LLM I want to setup on my local router network, if time permits.</w:t>
+      </w:r>
+      <w:r>
+        <w:rPr>
+          <w:rFonts w:ascii="Times New Roman" w:eastAsia="Times New Roman" w:hAnsi="Times New Roman" w:cs="Times New Roman"/>
+          <w:color w:val="FF0000"/>
+          <w:sz w:val="24"/>
+          <w:szCs w:val="24"/>
+        </w:rPr>
+        <w:t xml:space="preserve"> </w:t>
+      </w:r>
+      <w:r>
+        <w:rPr>
+          <w:rFonts w:ascii="Times New Roman" w:eastAsia="Times New Roman" w:hAnsi="Times New Roman" w:cs="Times New Roman"/>
+          <w:b/>
+          <w:bCs/>
+          <w:color w:val="FF0000"/>
+          <w:sz w:val="24"/>
+          <w:szCs w:val="24"/>
+        </w:rPr>
+        <w:t>(REMOVED 3/15 due to pivot)</w:t>
+      </w:r>
+      <w:r>
+        <w:rPr>
+          <w:rFonts w:ascii="Times New Roman" w:eastAsia="Times New Roman" w:hAnsi="Times New Roman" w:cs="Times New Roman"/>
+          <w:strike/>
+          <w:color w:val="FF0000"/>
+          <w:sz w:val="24"/>
+          <w:szCs w:val="24"/>
+        </w:rPr>
+        <w:t xml:space="preserve"> </w:t>
+      </w:r>
+      <w:r>
+        <w:rPr>
+          <w:rFonts w:ascii="Times New Roman" w:eastAsia="Times New Roman" w:hAnsi="Times New Roman" w:cs="Times New Roman"/>
+          <w:strike/>
+          <w:color w:val="FF0000"/>
+          <w:sz w:val="24"/>
+          <w:szCs w:val="24"/>
+        </w:rPr>
         <w:t xml:space="preserve">ESP32 cam </w:t>
       </w:r>
       <w:r>
@@ -3224,7 +3980,9 @@
       <w:r>
         <w:rPr>
           <w:rFonts w:ascii="Times New Roman" w:eastAsia="Times New Roman" w:hAnsi="Times New Roman" w:cs="Times New Roman"/>
-          <w:color w:val="FF0000"/>
+          <w:b/>
+          <w:bCs/>
+          <w:color w:val="4BACC6" w:themeColor="accent5"/>
           <w:sz w:val="24"/>
           <w:szCs w:val="24"/>
         </w:rPr>
@@ -3233,10 +3991,19 @@
       <w:r>
         <w:rPr>
           <w:rFonts w:ascii="Times New Roman" w:eastAsia="Times New Roman" w:hAnsi="Times New Roman" w:cs="Times New Roman"/>
-          <w:sz w:val="24"/>
-          <w:szCs w:val="24"/>
-        </w:rPr>
-        <w:t xml:space="preserve"> I want to first test these systems by themselves and integrate them together with the </w:t>
+          <w:color w:val="4BACC6" w:themeColor="accent5"/>
+          <w:sz w:val="24"/>
+          <w:szCs w:val="24"/>
+        </w:rPr>
+        <w:t xml:space="preserve"> </w:t>
+      </w:r>
+      <w:r>
+        <w:rPr>
+          <w:rFonts w:ascii="Times New Roman" w:eastAsia="Times New Roman" w:hAnsi="Times New Roman" w:cs="Times New Roman"/>
+          <w:sz w:val="24"/>
+          <w:szCs w:val="24"/>
+        </w:rPr>
+        <w:t xml:space="preserve">I want to first test these systems by themselves and integrate them together with the </w:t>
       </w:r>
       <w:r>
         <w:rPr>
@@ -3257,38 +4024,13 @@
       <w:r>
         <w:rPr>
           <w:rFonts w:ascii="Times New Roman" w:eastAsia="Times New Roman" w:hAnsi="Times New Roman" w:cs="Times New Roman"/>
-          <w:color w:val="FF0000"/>
-          <w:sz w:val="24"/>
-          <w:szCs w:val="24"/>
-        </w:rPr>
-        <w:t>(</w:t>
-      </w:r>
-      <w:r>
-        <w:rPr>
-          <w:rFonts w:ascii="Times New Roman" w:eastAsia="Times New Roman" w:hAnsi="Times New Roman" w:cs="Times New Roman"/>
-          <w:color w:val="FF0000"/>
-          <w:sz w:val="24"/>
-          <w:szCs w:val="24"/>
-        </w:rPr>
-        <w:t xml:space="preserve">Changed from </w:t>
-      </w:r>
-      <w:r>
-        <w:rPr>
-          <w:rFonts w:ascii="Times New Roman" w:eastAsia="Times New Roman" w:hAnsi="Times New Roman" w:cs="Times New Roman"/>
-          <w:color w:val="FF0000"/>
-          <w:sz w:val="24"/>
-          <w:szCs w:val="24"/>
-        </w:rPr>
-        <w:t>Teensy4.1 Microcontroller</w:t>
-      </w:r>
-      <w:r>
-        <w:rPr>
-          <w:rFonts w:ascii="Times New Roman" w:eastAsia="Times New Roman" w:hAnsi="Times New Roman" w:cs="Times New Roman"/>
-          <w:color w:val="FF0000"/>
-          <w:sz w:val="24"/>
-          <w:szCs w:val="24"/>
-        </w:rPr>
-        <w:t xml:space="preserve"> on 2/22/25)</w:t>
+          <w:b/>
+          <w:bCs/>
+          <w:color w:val="4BACC6" w:themeColor="accent5"/>
+          <w:sz w:val="24"/>
+          <w:szCs w:val="24"/>
+        </w:rPr>
+        <w:t>(Changed from Teensy4.1 Microcontroller on 2/22/25)</w:t>
       </w:r>
       <w:r>
         <w:rPr>
@@ -3330,16 +4072,68 @@
           <w:sz w:val="24"/>
           <w:szCs w:val="24"/>
         </w:rPr>
-        <w:t xml:space="preserve">while modeling the hopper trailer. I am going to build a basic communication interface that consists of basic commands dependent on object detection results and where they are in the image. I will do various system tests and integration tests to ensure </w:t>
-      </w:r>
-      <w:r>
-        <w:rPr>
-          <w:rFonts w:ascii="Times New Roman" w:eastAsia="Times New Roman" w:hAnsi="Times New Roman" w:cs="Times New Roman"/>
-          <w:sz w:val="24"/>
-          <w:szCs w:val="24"/>
-        </w:rPr>
-        <w:lastRenderedPageBreak/>
-        <w:t xml:space="preserve">everything is working individually and together. Afterwards, I plan on integrating the ultra-sonic sensors for emergency stops and finishing up the design/build of the rover chassis. Once I finish these parts I will test out the rover on its own and attach the 3 tow hitches to connect to the hopper trailer. Then finally finish building the hopper and test out full system integration. </w:t>
+        <w:t xml:space="preserve">while modeling the hopper trailer. I am going to build a basic communication interface that consists of basic commands dependent on object detection results and </w:t>
+      </w:r>
+      <w:r>
+        <w:rPr>
+          <w:rFonts w:ascii="Times New Roman" w:eastAsia="Times New Roman" w:hAnsi="Times New Roman" w:cs="Times New Roman"/>
+          <w:sz w:val="24"/>
+          <w:szCs w:val="24"/>
+        </w:rPr>
+        <w:t xml:space="preserve">user commands from command app </w:t>
+      </w:r>
+      <w:r>
+        <w:rPr>
+          <w:rFonts w:ascii="Times New Roman" w:eastAsia="Times New Roman" w:hAnsi="Times New Roman" w:cs="Times New Roman"/>
+          <w:strike/>
+          <w:color w:val="FF0000"/>
+          <w:sz w:val="24"/>
+          <w:szCs w:val="24"/>
+        </w:rPr>
+        <w:t>where they are in the image</w:t>
+      </w:r>
+      <w:r>
+        <w:rPr>
+          <w:rFonts w:ascii="Times New Roman" w:eastAsia="Times New Roman" w:hAnsi="Times New Roman" w:cs="Times New Roman"/>
+          <w:sz w:val="24"/>
+          <w:szCs w:val="24"/>
+        </w:rPr>
+        <w:t xml:space="preserve"> </w:t>
+      </w:r>
+      <w:r>
+        <w:rPr>
+          <w:rFonts w:ascii="Times New Roman" w:eastAsia="Times New Roman" w:hAnsi="Times New Roman" w:cs="Times New Roman"/>
+          <w:b/>
+          <w:bCs/>
+          <w:color w:val="4BACC6" w:themeColor="accent5"/>
+          <w:sz w:val="24"/>
+          <w:szCs w:val="24"/>
+        </w:rPr>
+        <w:t>(Changed 3/15)</w:t>
+      </w:r>
+      <w:r>
+        <w:rPr>
+          <w:rFonts w:ascii="Times New Roman" w:eastAsia="Times New Roman" w:hAnsi="Times New Roman" w:cs="Times New Roman"/>
+          <w:sz w:val="24"/>
+          <w:szCs w:val="24"/>
+        </w:rPr>
+        <w:t>. I will do various system tests and integration tests to ensure everything is working individually and together. Afterwards, I plan on finishing up the design/build of the rover chassis</w:t>
+      </w:r>
+      <w:r>
+        <w:rPr>
+          <w:rFonts w:ascii="Times New Roman" w:eastAsia="Times New Roman" w:hAnsi="Times New Roman" w:cs="Times New Roman"/>
+          <w:sz w:val="24"/>
+          <w:szCs w:val="24"/>
+        </w:rPr>
+        <w:t xml:space="preserve"> and a better drive system for the wheels</w:t>
+      </w:r>
+      <w:r>
+        <w:rPr>
+          <w:rFonts w:ascii="Times New Roman" w:eastAsia="Times New Roman" w:hAnsi="Times New Roman" w:cs="Times New Roman"/>
+          <w:sz w:val="24"/>
+          <w:szCs w:val="24"/>
+        </w:rPr>
+        <w:t xml:space="preserve">. Once I finish these parts I will test out the rover on its own and attach the 3 tow hitches to connect to the hopper trailer. Then finally finish building the hopper and test out full system integration. </w:t>
       </w:r>
     </w:p>
     <w:p>
@@ -3537,11 +4331,59 @@
           <w:sz w:val="24"/>
           <w:szCs w:val="24"/>
         </w:rPr>
-        <w:t xml:space="preserve">which will pull commands from the </w:t>
-      </w:r>
-      <w:r>
-        <w:rPr>
-          <w:rFonts w:ascii="Times New Roman" w:eastAsia="Times New Roman" w:hAnsi="Times New Roman" w:cs="Times New Roman"/>
+        <w:t xml:space="preserve">which will pull commands from </w:t>
+      </w:r>
+      <w:r>
+        <w:rPr>
+          <w:rFonts w:ascii="Times New Roman" w:eastAsia="Times New Roman" w:hAnsi="Times New Roman" w:cs="Times New Roman"/>
+          <w:sz w:val="24"/>
+          <w:szCs w:val="24"/>
+        </w:rPr>
+        <w:t xml:space="preserve">a command server that sits on a ZimaBoard NAS which will </w:t>
+      </w:r>
+      <w:r>
+        <w:rPr>
+          <w:rFonts w:ascii="Times New Roman" w:eastAsia="Times New Roman" w:hAnsi="Times New Roman" w:cs="Times New Roman"/>
+          <w:sz w:val="24"/>
+          <w:szCs w:val="24"/>
+        </w:rPr>
+        <w:lastRenderedPageBreak/>
+        <w:t>store commands users provide such as start, stop, and directional commands to the rover. These commands will come from an app I plan on developing which for now will just be an inline HTML application so that I can easily test it out on my phone.</w:t>
+      </w:r>
+      <w:r>
+        <w:rPr>
+          <w:rFonts w:ascii="Times New Roman" w:eastAsia="Times New Roman" w:hAnsi="Times New Roman" w:cs="Times New Roman"/>
+          <w:b/>
+          <w:bCs/>
+          <w:color w:val="4BACC6" w:themeColor="accent5"/>
+          <w:sz w:val="24"/>
+          <w:szCs w:val="24"/>
+        </w:rPr>
+        <w:t xml:space="preserve">(ADDED 3/15) </w:t>
+      </w:r>
+      <w:r>
+        <w:rPr>
+          <w:rFonts w:ascii="Times New Roman" w:eastAsia="Times New Roman" w:hAnsi="Times New Roman" w:cs="Times New Roman"/>
+          <w:sz w:val="24"/>
+          <w:szCs w:val="24"/>
+        </w:rPr>
+        <w:t>t</w:t>
+      </w:r>
+      <w:r>
+        <w:rPr>
+          <w:rFonts w:ascii="Times New Roman" w:eastAsia="Times New Roman" w:hAnsi="Times New Roman" w:cs="Times New Roman"/>
+          <w:strike/>
+          <w:color w:val="FF0000"/>
+          <w:sz w:val="24"/>
+          <w:szCs w:val="24"/>
+        </w:rPr>
+        <w:t xml:space="preserve">he </w:t>
+      </w:r>
+      <w:r>
+        <w:rPr>
+          <w:rFonts w:ascii="Times New Roman" w:eastAsia="Times New Roman" w:hAnsi="Times New Roman" w:cs="Times New Roman"/>
+          <w:strike/>
+          <w:color w:val="FF0000"/>
           <w:sz w:val="24"/>
           <w:szCs w:val="24"/>
         </w:rPr>
@@ -3550,6 +4392,8 @@
       <w:r>
         <w:rPr>
           <w:rFonts w:ascii="Times New Roman" w:eastAsia="Times New Roman" w:hAnsi="Times New Roman" w:cs="Times New Roman"/>
+          <w:strike/>
+          <w:color w:val="FF0000"/>
           <w:sz w:val="24"/>
           <w:szCs w:val="24"/>
         </w:rPr>
@@ -3558,6 +4402,15 @@
       <w:r>
         <w:rPr>
           <w:rFonts w:ascii="Times New Roman" w:eastAsia="Times New Roman" w:hAnsi="Times New Roman" w:cs="Times New Roman"/>
+          <w:color w:val="FF0000"/>
+          <w:sz w:val="24"/>
+          <w:szCs w:val="24"/>
+        </w:rPr>
+        <w:t>(REMOVED 3/15)</w:t>
+      </w:r>
+      <w:r>
+        <w:rPr>
+          <w:rFonts w:ascii="Times New Roman" w:eastAsia="Times New Roman" w:hAnsi="Times New Roman" w:cs="Times New Roman"/>
           <w:sz w:val="24"/>
           <w:szCs w:val="24"/>
         </w:rPr>
@@ -3649,7 +4502,87 @@
           <w:sz w:val="24"/>
           <w:szCs w:val="24"/>
         </w:rPr>
-        <w:t xml:space="preserve">powered using pulse width modulation on Left/Right commands. The DC motors will be powered ON/OFF/Forward/Backwards depending on commands from the ESP32 Camera. As a backup object detection system there will also be an ultrasonic sensor used for emergency object detection in case that the camera goes offline or misses something. As stated earlier the mechanical design of the rovers rocker-bogie suspension system was predesigned but I only plan on using the suspension and will be using a custom chassis and slightly different electronics. </w:t>
+        <w:t xml:space="preserve">powered using pulse width modulation on Left/Right commands. The DC motors will be powered ON/OFF/Forward/Backwards depending on commands from the </w:t>
+      </w:r>
+      <w:r>
+        <w:rPr>
+          <w:rFonts w:ascii="Times New Roman" w:eastAsia="Times New Roman" w:hAnsi="Times New Roman" w:cs="Times New Roman"/>
+          <w:sz w:val="24"/>
+          <w:szCs w:val="24"/>
+        </w:rPr>
+        <w:t xml:space="preserve">server </w:t>
+      </w:r>
+      <w:r>
+        <w:rPr>
+          <w:rFonts w:ascii="Times New Roman" w:eastAsia="Times New Roman" w:hAnsi="Times New Roman" w:cs="Times New Roman"/>
+          <w:strike/>
+          <w:color w:val="FF0000"/>
+          <w:sz w:val="24"/>
+          <w:szCs w:val="24"/>
+        </w:rPr>
+        <w:t>ESP32 Camera</w:t>
+      </w:r>
+      <w:r>
+        <w:rPr>
+          <w:rFonts w:ascii="Times New Roman" w:eastAsia="Times New Roman" w:hAnsi="Times New Roman" w:cs="Times New Roman"/>
+          <w:sz w:val="24"/>
+          <w:szCs w:val="24"/>
+        </w:rPr>
+        <w:t xml:space="preserve">. As a backup object detection system there will also be an ultrasonic sensor used for emergency object detection in case that the </w:t>
+      </w:r>
+      <w:r>
+        <w:rPr>
+          <w:rFonts w:ascii="Times New Roman" w:eastAsia="Times New Roman" w:hAnsi="Times New Roman" w:cs="Times New Roman"/>
+          <w:sz w:val="24"/>
+          <w:szCs w:val="24"/>
+        </w:rPr>
+        <w:t xml:space="preserve">User tries to drive the rover into something or there is a command bug. </w:t>
+      </w:r>
+      <w:r>
+        <w:rPr>
+          <w:rFonts w:ascii="Times New Roman" w:eastAsia="Times New Roman" w:hAnsi="Times New Roman" w:cs="Times New Roman"/>
+          <w:b/>
+          <w:bCs/>
+          <w:color w:val="4BACC6" w:themeColor="accent5"/>
+          <w:sz w:val="24"/>
+          <w:szCs w:val="24"/>
+        </w:rPr>
+        <w:t>(ADDED 3/15)</w:t>
+      </w:r>
+      <w:r>
+        <w:rPr>
+          <w:rFonts w:ascii="Times New Roman" w:eastAsia="Times New Roman" w:hAnsi="Times New Roman" w:cs="Times New Roman"/>
+          <w:sz w:val="24"/>
+          <w:szCs w:val="24"/>
+        </w:rPr>
+        <w:t xml:space="preserve"> As stated earlier the mechanical design of the rovers rocker-bogie suspension system was predesigned but I only plan on using the suspension and will be using a custom chassis and slightly different electronics. </w:t>
+      </w:r>
+      <w:r>
+        <w:rPr>
+          <w:rFonts w:ascii="Times New Roman" w:eastAsia="Times New Roman" w:hAnsi="Times New Roman" w:cs="Times New Roman"/>
+          <w:sz w:val="24"/>
+          <w:szCs w:val="24"/>
+        </w:rPr>
+        <w:t xml:space="preserve">I also will need to redesign the wheel drive system due to gear stripping and not working for long usage outdoors </w:t>
+      </w:r>
+      <w:r>
+        <w:rPr>
+          <w:rFonts w:ascii="Times New Roman" w:eastAsia="Times New Roman" w:hAnsi="Times New Roman" w:cs="Times New Roman"/>
+          <w:b/>
+          <w:bCs/>
+          <w:color w:val="4BACC6" w:themeColor="accent5"/>
+          <w:sz w:val="24"/>
+          <w:szCs w:val="24"/>
+        </w:rPr>
+        <w:t>(ADDED 3/15)</w:t>
+      </w:r>
+      <w:r>
+        <w:rPr>
+          <w:rFonts w:ascii="Times New Roman" w:eastAsia="Times New Roman" w:hAnsi="Times New Roman" w:cs="Times New Roman"/>
+          <w:sz w:val="24"/>
+          <w:szCs w:val="24"/>
+        </w:rPr>
+        <w:t>.</w:t>
       </w:r>
       <w:r>
         <w:rPr>
@@ -3676,17 +4609,13 @@
       </w:pPr>
       <w:r>
         <w:rPr>
-          <w:rFonts w:ascii="Times New Roman" w:eastAsia="Times New Roman" w:hAnsi="Times New Roman" w:cs="Times New Roman"/>
           <w:noProof/>
-          <w:sz w:val="24"/>
-          <w:szCs w:val="24"/>
-        </w:rPr>
-        <w:lastRenderedPageBreak/>
+        </w:rPr>
         <w:drawing>
-          <wp:inline distT="0" distB="0" distL="0" distR="0" wp14:anchorId="27C5C2D1" wp14:editId="2A20E198">
-            <wp:extent cx="5934075" cy="4010025"/>
-            <wp:effectExtent l="0" t="0" r="9525" b="9525"/>
-            <wp:docPr id="1194298554" name="Picture 2"/>
+          <wp:inline distT="0" distB="0" distL="0" distR="0" wp14:anchorId="228BCF56" wp14:editId="6CC5F52A">
+            <wp:extent cx="5943600" cy="4018915"/>
+            <wp:effectExtent l="0" t="0" r="0" b="635"/>
+            <wp:docPr id="1421133963" name="Picture 1" descr="A diagram of a system&#10;&#10;AI-generated content may be incorrect."/>
             <wp:cNvGraphicFramePr>
               <a:graphicFrameLocks xmlns:a="http://schemas.openxmlformats.org/drawingml/2006/main" noChangeAspect="1"/>
             </wp:cNvGraphicFramePr>
@@ -3694,10 +4623,8 @@
               <a:graphicData uri="http://schemas.openxmlformats.org/drawingml/2006/picture">
                 <pic:pic xmlns:pic="http://schemas.openxmlformats.org/drawingml/2006/picture">
                   <pic:nvPicPr>
-                    <pic:cNvPr id="0" name="Picture 3"/>
-                    <pic:cNvPicPr>
-                      <a:picLocks noChangeAspect="1" noChangeArrowheads="1"/>
-                    </pic:cNvPicPr>
+                    <pic:cNvPr id="1421133963" name="Picture 1" descr="A diagram of a system&#10;&#10;AI-generated content may be incorrect."/>
+                    <pic:cNvPicPr/>
                   </pic:nvPicPr>
                   <pic:blipFill>
                     <a:blip r:embed="rId6" cstate="print">
@@ -3707,23 +4634,18 @@
                         </a:ext>
                       </a:extLst>
                     </a:blip>
-                    <a:srcRect/>
                     <a:stretch>
                       <a:fillRect/>
                     </a:stretch>
                   </pic:blipFill>
-                  <pic:spPr bwMode="auto">
+                  <pic:spPr>
                     <a:xfrm>
                       <a:off x="0" y="0"/>
-                      <a:ext cx="5934075" cy="4010025"/>
+                      <a:ext cx="5943600" cy="4018915"/>
                     </a:xfrm>
                     <a:prstGeom prst="rect">
                       <a:avLst/>
                     </a:prstGeom>
-                    <a:noFill/>
-                    <a:ln>
-                      <a:noFill/>
-                    </a:ln>
                   </pic:spPr>
                 </pic:pic>
               </a:graphicData>
@@ -3748,6 +4670,30 @@
         </w:rPr>
         <w:t>Appendix B</w:t>
       </w:r>
+      <w:r>
+        <w:rPr>
+          <w:i/>
+          <w:iCs/>
+        </w:rPr>
+        <w:t xml:space="preserve"> </w:t>
+      </w:r>
+      <w:r>
+        <w:rPr>
+          <w:b/>
+          <w:bCs/>
+          <w:i/>
+          <w:iCs/>
+          <w:color w:val="4BACC6" w:themeColor="accent5"/>
+        </w:rPr>
+        <w:t>(UPDATED 3/15)</w:t>
+      </w:r>
+      <w:r>
+        <w:rPr>
+          <w:i/>
+          <w:iCs/>
+        </w:rPr>
+        <w:t xml:space="preserve"> </w:t>
+      </w:r>
     </w:p>
     <w:p>
       <w:pPr>
@@ -3762,6 +4708,7 @@
           <w:b/>
           <w:bCs/>
         </w:rPr>
+        <w:lastRenderedPageBreak/>
         <w:t>Electronics</w:t>
       </w:r>
     </w:p>
@@ -3793,15 +4740,7 @@
         <w:spacing w:before="120"/>
       </w:pPr>
       <w:r>
-        <w:t xml:space="preserve">The command queue server is </w:t>
-      </w:r>
-      <w:proofErr w:type="spellStart"/>
-      <w:r>
-        <w:t>Zimaboard</w:t>
-      </w:r>
-      <w:proofErr w:type="spellEnd"/>
-      <w:r>
-        <w:t xml:space="preserve"> NAS that hosts the server using a docker image. This allows the rover and camera to easily communicate through the NAS which was much more stable than the communications between the devices themselves. </w:t>
+        <w:t xml:space="preserve">The command queue server is Zimaboard NAS that hosts the server using a docker image. This allows the rover and camera to easily communicate through the NAS which was much more stable than the communications between the devices themselves. </w:t>
       </w:r>
       <w:r>
         <w:rPr>
@@ -3822,22 +4761,17 @@
           <w:iCs/>
         </w:rPr>
       </w:pPr>
-    </w:p>
-    <w:p>
-      <w:pPr>
-        <w:pStyle w:val="NoSpacing"/>
-        <w:jc w:val="center"/>
-      </w:pPr>
-      <w:r>
-        <w:rPr>
+      <w:r>
+        <w:rPr>
+          <w:i/>
+          <w:iCs/>
           <w:noProof/>
         </w:rPr>
-        <w:lastRenderedPageBreak/>
         <w:drawing>
-          <wp:inline distT="0" distB="0" distL="0" distR="0" wp14:anchorId="478792E9" wp14:editId="4DA5C8C5">
-            <wp:extent cx="5934075" cy="4617720"/>
-            <wp:effectExtent l="0" t="0" r="9525" b="0"/>
-            <wp:docPr id="901696774" name="Picture 1"/>
+          <wp:inline distT="0" distB="0" distL="0" distR="0" wp14:anchorId="5D646262" wp14:editId="627CE765">
+            <wp:extent cx="5943600" cy="4203065"/>
+            <wp:effectExtent l="0" t="0" r="0" b="6985"/>
+            <wp:docPr id="375618503" name="Picture 2" descr="A white board with many different colored lines and symbols"/>
             <wp:cNvGraphicFramePr>
               <a:graphicFrameLocks xmlns:a="http://schemas.openxmlformats.org/drawingml/2006/main" noChangeAspect="1"/>
             </wp:cNvGraphicFramePr>
@@ -3845,10 +4779,8 @@
               <a:graphicData uri="http://schemas.openxmlformats.org/drawingml/2006/picture">
                 <pic:pic xmlns:pic="http://schemas.openxmlformats.org/drawingml/2006/picture">
                   <pic:nvPicPr>
-                    <pic:cNvPr id="0" name="Picture 2"/>
-                    <pic:cNvPicPr>
-                      <a:picLocks noChangeAspect="1" noChangeArrowheads="1"/>
-                    </pic:cNvPicPr>
+                    <pic:cNvPr id="375618503" name="Picture 2" descr="A white board with many different colored lines and symbols"/>
+                    <pic:cNvPicPr/>
                   </pic:nvPicPr>
                   <pic:blipFill>
                     <a:blip r:embed="rId7" cstate="print">
@@ -3858,23 +4790,18 @@
                         </a:ext>
                       </a:extLst>
                     </a:blip>
-                    <a:srcRect/>
                     <a:stretch>
                       <a:fillRect/>
                     </a:stretch>
                   </pic:blipFill>
-                  <pic:spPr bwMode="auto">
+                  <pic:spPr>
                     <a:xfrm>
                       <a:off x="0" y="0"/>
-                      <a:ext cx="5934075" cy="4617720"/>
+                      <a:ext cx="5943600" cy="4203065"/>
                     </a:xfrm>
                     <a:prstGeom prst="rect">
                       <a:avLst/>
                     </a:prstGeom>
-                    <a:noFill/>
-                    <a:ln>
-                      <a:noFill/>
-                    </a:ln>
                   </pic:spPr>
                 </pic:pic>
               </a:graphicData>
@@ -3882,14 +4809,46 @@
           </wp:inline>
         </w:drawing>
       </w:r>
+    </w:p>
+    <w:p>
+      <w:pPr>
+        <w:pStyle w:val="NoSpacing"/>
+        <w:jc w:val="center"/>
+      </w:pPr>
       <w:r>
         <w:t xml:space="preserve">Appendix C </w:t>
       </w:r>
       <w:r>
         <w:rPr>
-          <w:color w:val="FF0000"/>
-        </w:rPr>
-        <w:t>(Added on 2/22/25)</w:t>
+          <w:b/>
+          <w:bCs/>
+          <w:color w:val="4BACC6" w:themeColor="accent5"/>
+        </w:rPr>
+        <w:t>(</w:t>
+      </w:r>
+      <w:r>
+        <w:rPr>
+          <w:b/>
+          <w:bCs/>
+          <w:color w:val="4BACC6" w:themeColor="accent5"/>
+        </w:rPr>
+        <w:t>ADDED</w:t>
+      </w:r>
+      <w:r>
+        <w:rPr>
+          <w:b/>
+          <w:bCs/>
+          <w:color w:val="4BACC6" w:themeColor="accent5"/>
+        </w:rPr>
+        <w:t xml:space="preserve"> 2/22/25)</w:t>
+      </w:r>
+      <w:r>
+        <w:rPr>
+          <w:b/>
+          <w:bCs/>
+          <w:color w:val="4BACC6" w:themeColor="accent5"/>
+        </w:rPr>
+        <w:t>(UPDATED 3/15)</w:t>
       </w:r>
     </w:p>
     <w:p>
@@ -3961,17 +4920,41 @@
         <w:rPr>
           <w:i/>
           <w:iCs/>
+          <w:strike/>
+          <w:color w:val="FF0000"/>
         </w:rPr>
         <w:t>Appendix D</w:t>
       </w:r>
       <w:r>
+        <w:rPr>
+          <w:strike/>
+          <w:color w:val="FF0000"/>
+        </w:rPr>
         <w:t xml:space="preserve"> </w:t>
       </w:r>
       <w:r>
         <w:rPr>
+          <w:strike/>
           <w:color w:val="FF0000"/>
         </w:rPr>
         <w:t>(Added on 2/26/25)</w:t>
+      </w:r>
+      <w:r>
+        <w:rPr>
+          <w:b/>
+          <w:bCs/>
+          <w:strike/>
+          <w:color w:val="FF0000"/>
+        </w:rPr>
+        <w:t>(</w:t>
+      </w:r>
+      <w:r>
+        <w:rPr>
+          <w:b/>
+          <w:bCs/>
+          <w:color w:val="FF0000"/>
+        </w:rPr>
+        <w:t>REMOVED 3/15)</w:t>
       </w:r>
     </w:p>
     <w:p>
@@ -4054,17 +5037,40 @@
         <w:spacing w:before="120"/>
         <w:rPr>
           <w:rFonts w:ascii="Times New Roman" w:eastAsia="Times New Roman" w:hAnsi="Times New Roman" w:cs="Times New Roman"/>
-          <w:sz w:val="24"/>
-          <w:szCs w:val="24"/>
-        </w:rPr>
-      </w:pPr>
-      <w:r>
-        <w:rPr>
-          <w:rFonts w:ascii="Times New Roman" w:eastAsia="Times New Roman" w:hAnsi="Times New Roman" w:cs="Times New Roman"/>
+          <w:strike/>
+          <w:color w:val="FF0000"/>
+          <w:sz w:val="24"/>
+          <w:szCs w:val="24"/>
+        </w:rPr>
+      </w:pPr>
+      <w:r>
+        <w:rPr>
+          <w:rFonts w:ascii="Times New Roman" w:eastAsia="Times New Roman" w:hAnsi="Times New Roman" w:cs="Times New Roman"/>
+          <w:strike/>
+          <w:color w:val="FF0000"/>
           <w:sz w:val="24"/>
           <w:szCs w:val="24"/>
         </w:rPr>
         <w:t>XIAO Camera Object Detection Code</w:t>
+      </w:r>
+      <w:r>
+        <w:rPr>
+          <w:rFonts w:ascii="Times New Roman" w:eastAsia="Times New Roman" w:hAnsi="Times New Roman" w:cs="Times New Roman"/>
+          <w:strike/>
+          <w:color w:val="FF0000"/>
+          <w:sz w:val="24"/>
+          <w:szCs w:val="24"/>
+        </w:rPr>
+        <w:t xml:space="preserve"> </w:t>
+      </w:r>
+      <w:r>
+        <w:rPr>
+          <w:rFonts w:ascii="Times New Roman" w:eastAsia="Times New Roman" w:hAnsi="Times New Roman" w:cs="Times New Roman"/>
+          <w:color w:val="FF0000"/>
+          <w:sz w:val="24"/>
+          <w:szCs w:val="24"/>
+        </w:rPr>
+        <w:t>(REMOVED 3/15 due to pivot)</w:t>
       </w:r>
     </w:p>
     <w:p>
@@ -4077,6 +5083,98 @@
         <w:spacing w:before="120"/>
         <w:rPr>
           <w:rFonts w:ascii="Times New Roman" w:eastAsia="Times New Roman" w:hAnsi="Times New Roman" w:cs="Times New Roman"/>
+          <w:strike/>
+          <w:color w:val="000000" w:themeColor="text1"/>
+          <w:sz w:val="24"/>
+          <w:szCs w:val="24"/>
+        </w:rPr>
+      </w:pPr>
+      <w:r>
+        <w:rPr>
+          <w:rFonts w:ascii="Times New Roman" w:eastAsia="Times New Roman" w:hAnsi="Times New Roman" w:cs="Times New Roman"/>
+          <w:color w:val="000000" w:themeColor="text1"/>
+          <w:sz w:val="24"/>
+          <w:szCs w:val="24"/>
+        </w:rPr>
+        <w:t>Command Server</w:t>
+      </w:r>
+      <w:r>
+        <w:rPr>
+          <w:rFonts w:ascii="Times New Roman" w:eastAsia="Times New Roman" w:hAnsi="Times New Roman" w:cs="Times New Roman"/>
+          <w:color w:val="000000" w:themeColor="text1"/>
+          <w:sz w:val="24"/>
+          <w:szCs w:val="24"/>
+        </w:rPr>
+        <w:t xml:space="preserve"> </w:t>
+      </w:r>
+      <w:r>
+        <w:rPr>
+          <w:rFonts w:ascii="Times New Roman" w:eastAsia="Times New Roman" w:hAnsi="Times New Roman" w:cs="Times New Roman"/>
+          <w:b/>
+          <w:bCs/>
+          <w:color w:val="4BACC6" w:themeColor="accent5"/>
+          <w:sz w:val="24"/>
+          <w:szCs w:val="24"/>
+        </w:rPr>
+        <w:t>(ADDED 3/15)</w:t>
+      </w:r>
+    </w:p>
+    <w:p>
+      <w:pPr>
+        <w:pStyle w:val="ListParagraph"/>
+        <w:numPr>
+          <w:ilvl w:val="0"/>
+          <w:numId w:val="19"/>
+        </w:numPr>
+        <w:spacing w:before="120"/>
+        <w:rPr>
+          <w:rFonts w:ascii="Times New Roman" w:eastAsia="Times New Roman" w:hAnsi="Times New Roman" w:cs="Times New Roman"/>
+          <w:strike/>
+          <w:color w:val="000000" w:themeColor="text1"/>
+          <w:sz w:val="24"/>
+          <w:szCs w:val="24"/>
+        </w:rPr>
+      </w:pPr>
+      <w:r>
+        <w:rPr>
+          <w:rFonts w:ascii="Times New Roman" w:eastAsia="Times New Roman" w:hAnsi="Times New Roman" w:cs="Times New Roman"/>
+          <w:color w:val="000000" w:themeColor="text1"/>
+          <w:sz w:val="24"/>
+          <w:szCs w:val="24"/>
+        </w:rPr>
+        <w:t>Controller APP</w:t>
+      </w:r>
+      <w:r>
+        <w:rPr>
+          <w:rFonts w:ascii="Times New Roman" w:eastAsia="Times New Roman" w:hAnsi="Times New Roman" w:cs="Times New Roman"/>
+          <w:color w:val="000000" w:themeColor="text1"/>
+          <w:sz w:val="24"/>
+          <w:szCs w:val="24"/>
+        </w:rPr>
+        <w:t xml:space="preserve"> </w:t>
+      </w:r>
+      <w:r>
+        <w:rPr>
+          <w:rFonts w:ascii="Times New Roman" w:eastAsia="Times New Roman" w:hAnsi="Times New Roman" w:cs="Times New Roman"/>
+          <w:b/>
+          <w:bCs/>
+          <w:color w:val="4BACC6" w:themeColor="accent5"/>
+          <w:sz w:val="24"/>
+          <w:szCs w:val="24"/>
+        </w:rPr>
+        <w:t>(ADDED 3/15)</w:t>
+      </w:r>
+    </w:p>
+    <w:p>
+      <w:pPr>
+        <w:pStyle w:val="ListParagraph"/>
+        <w:numPr>
+          <w:ilvl w:val="0"/>
+          <w:numId w:val="19"/>
+        </w:numPr>
+        <w:spacing w:before="120"/>
+        <w:rPr>
+          <w:rFonts w:ascii="Times New Roman" w:eastAsia="Times New Roman" w:hAnsi="Times New Roman" w:cs="Times New Roman"/>
           <w:sz w:val="24"/>
           <w:szCs w:val="24"/>
         </w:rPr>
@@ -4106,7 +5204,25 @@
           <w:sz w:val="24"/>
           <w:szCs w:val="24"/>
         </w:rPr>
-        <w:t xml:space="preserve">And have sub directories consisting of test programs and the overall final logic for the camera and rover. </w:t>
+        <w:t xml:space="preserve">And have sub directories consisting of test programs and the overall final logic for the </w:t>
+      </w:r>
+      <w:r>
+        <w:rPr>
+          <w:rFonts w:ascii="Times New Roman" w:eastAsia="Times New Roman" w:hAnsi="Times New Roman" w:cs="Times New Roman"/>
+          <w:strike/>
+          <w:color w:val="FF0000"/>
+          <w:sz w:val="24"/>
+          <w:szCs w:val="24"/>
+        </w:rPr>
+        <w:t xml:space="preserve">camera </w:t>
+      </w:r>
+      <w:r>
+        <w:rPr>
+          <w:rFonts w:ascii="Times New Roman" w:eastAsia="Times New Roman" w:hAnsi="Times New Roman" w:cs="Times New Roman"/>
+          <w:sz w:val="24"/>
+          <w:szCs w:val="24"/>
+        </w:rPr>
+        <w:t xml:space="preserve">and rover. </w:t>
       </w:r>
       <w:r>
         <w:rPr>
@@ -4157,7 +5273,6 @@
           <w:sz w:val="24"/>
           <w:szCs w:val="24"/>
         </w:rPr>
-        <w:lastRenderedPageBreak/>
         <w:t>Body</w:t>
       </w:r>
     </w:p>
@@ -4177,25 +5292,7 @@
           <w:sz w:val="24"/>
           <w:szCs w:val="24"/>
         </w:rPr>
-        <w:t xml:space="preserve">I have also made some design modifications to the original rover design I got from the </w:t>
-      </w:r>
-      <w:proofErr w:type="spellStart"/>
-      <w:r>
-        <w:rPr>
-          <w:rFonts w:ascii="Times New Roman" w:eastAsia="Times New Roman" w:hAnsi="Times New Roman" w:cs="Times New Roman"/>
-          <w:sz w:val="24"/>
-          <w:szCs w:val="24"/>
-        </w:rPr>
-        <w:t>instructables</w:t>
-      </w:r>
-      <w:proofErr w:type="spellEnd"/>
-      <w:r>
-        <w:rPr>
-          <w:rFonts w:ascii="Times New Roman" w:eastAsia="Times New Roman" w:hAnsi="Times New Roman" w:cs="Times New Roman"/>
-          <w:sz w:val="24"/>
-          <w:szCs w:val="24"/>
-        </w:rPr>
-        <w:t xml:space="preserve"> in the Appendix C. The frame initially did not work well with a soft rover body. I tested this with cardboard and found that the suspension bowed and would not allow the wheels to turn. </w:t>
+        <w:t xml:space="preserve">I have also made some design modifications to the original rover design I got from the instructables in the Appendix C. The frame initially did not work well with a soft rover body. I tested this with cardboard and found that the suspension bowed and would not allow the wheels to turn. </w:t>
       </w:r>
     </w:p>
     <w:p>
@@ -4203,6 +5300,7 @@
         <w:spacing w:before="120"/>
         <w:rPr>
           <w:rFonts w:ascii="Times New Roman" w:eastAsia="Times New Roman" w:hAnsi="Times New Roman" w:cs="Times New Roman"/>
+          <w:color w:val="FF0000"/>
           <w:sz w:val="24"/>
           <w:szCs w:val="24"/>
         </w:rPr>
@@ -4245,25 +5343,7 @@
           <w:sz w:val="24"/>
           <w:szCs w:val="24"/>
         </w:rPr>
-        <w:t xml:space="preserve"> to try and build a smaller frame that is more ergonomic and easier to replace, but that is a major stretch goal </w:t>
-      </w:r>
-      <w:proofErr w:type="spellStart"/>
-      <w:r>
-        <w:rPr>
-          <w:rFonts w:ascii="Times New Roman" w:eastAsia="Times New Roman" w:hAnsi="Times New Roman" w:cs="Times New Roman"/>
-          <w:sz w:val="24"/>
-          <w:szCs w:val="24"/>
-        </w:rPr>
-        <w:t>abit</w:t>
-      </w:r>
-      <w:proofErr w:type="spellEnd"/>
-      <w:r>
-        <w:rPr>
-          <w:rFonts w:ascii="Times New Roman" w:eastAsia="Times New Roman" w:hAnsi="Times New Roman" w:cs="Times New Roman"/>
-          <w:sz w:val="24"/>
-          <w:szCs w:val="24"/>
-        </w:rPr>
-        <w:t xml:space="preserve"> outside of the scope of the innovation on this project. If I get to this </w:t>
+        <w:t xml:space="preserve"> to try and build a smaller frame that is more ergonomic and easier to replace, but that is a major stretch goal abit outside of the scope of the innovation on this project. If I get to this </w:t>
       </w:r>
       <w:r>
         <w:rPr>
@@ -4279,17 +5359,61 @@
           <w:sz w:val="24"/>
           <w:szCs w:val="24"/>
         </w:rPr>
-        <w:t xml:space="preserve"> I plan on using some of the 3d printed NASA hexagon fabric to cover the chassis and allow it to have a soft body which is easy to replace while still being really strong. </w:t>
-      </w:r>
-      <w:r>
-        <w:rPr>
-          <w:rFonts w:ascii="Times New Roman" w:eastAsia="Times New Roman" w:hAnsi="Times New Roman" w:cs="Times New Roman"/>
-          <w:color w:val="FF0000"/>
-          <w:sz w:val="24"/>
-          <w:szCs w:val="24"/>
-        </w:rPr>
-        <w:t>(Added 2/26/2025)</w:t>
-      </w:r>
+        <w:t xml:space="preserve"> I plan on using some of the 3d printed NASA hexagon fabric to cover the chassis and allow it to have a soft body which is easy to replace while still being really strong</w:t>
+      </w:r>
+      <w:r>
+        <w:rPr>
+          <w:rFonts w:ascii="Times New Roman" w:eastAsia="Times New Roman" w:hAnsi="Times New Roman" w:cs="Times New Roman"/>
+          <w:b/>
+          <w:bCs/>
+          <w:sz w:val="24"/>
+          <w:szCs w:val="24"/>
+        </w:rPr>
+        <w:t>.</w:t>
+      </w:r>
+      <w:r>
+        <w:rPr>
+          <w:rFonts w:ascii="Times New Roman" w:eastAsia="Times New Roman" w:hAnsi="Times New Roman" w:cs="Times New Roman"/>
+          <w:b/>
+          <w:bCs/>
+          <w:color w:val="4BACC6" w:themeColor="accent5"/>
+          <w:sz w:val="24"/>
+          <w:szCs w:val="24"/>
+        </w:rPr>
+        <w:t xml:space="preserve"> (A</w:t>
+      </w:r>
+      <w:r>
+        <w:rPr>
+          <w:rFonts w:ascii="Times New Roman" w:eastAsia="Times New Roman" w:hAnsi="Times New Roman" w:cs="Times New Roman"/>
+          <w:b/>
+          <w:bCs/>
+          <w:color w:val="4BACC6" w:themeColor="accent5"/>
+          <w:sz w:val="24"/>
+          <w:szCs w:val="24"/>
+        </w:rPr>
+        <w:t>DDED</w:t>
+      </w:r>
+      <w:r>
+        <w:rPr>
+          <w:rFonts w:ascii="Times New Roman" w:eastAsia="Times New Roman" w:hAnsi="Times New Roman" w:cs="Times New Roman"/>
+          <w:b/>
+          <w:bCs/>
+          <w:color w:val="4BACC6" w:themeColor="accent5"/>
+          <w:sz w:val="24"/>
+          <w:szCs w:val="24"/>
+        </w:rPr>
+        <w:t xml:space="preserve"> 2/26/2025)</w:t>
+      </w:r>
+    </w:p>
+    <w:p>
+      <w:pPr>
+        <w:spacing w:before="120"/>
+        <w:rPr>
+          <w:rFonts w:ascii="Times New Roman" w:eastAsia="Times New Roman" w:hAnsi="Times New Roman" w:cs="Times New Roman"/>
+          <w:sz w:val="24"/>
+          <w:szCs w:val="24"/>
+        </w:rPr>
+      </w:pPr>
       <w:r>
         <w:rPr>
           <w:rFonts w:ascii="Times New Roman" w:eastAsia="Times New Roman" w:hAnsi="Times New Roman" w:cs="Times New Roman"/>
@@ -4351,22 +5475,52 @@
       <w:pPr>
         <w:pStyle w:val="NoSpacing"/>
         <w:jc w:val="center"/>
+        <w:rPr>
+          <w:b/>
+          <w:bCs/>
+          <w:color w:val="4BACC6" w:themeColor="accent5"/>
+        </w:rPr>
       </w:pPr>
       <w:r>
         <w:rPr>
           <w:i/>
           <w:iCs/>
         </w:rPr>
-        <w:t>Appendix E</w:t>
+        <w:t>Appendix</w:t>
+      </w:r>
+      <w:r>
+        <w:rPr>
+          <w:i/>
+          <w:iCs/>
+        </w:rPr>
+        <w:t xml:space="preserve"> D</w:t>
       </w:r>
       <w:r>
         <w:t xml:space="preserve"> </w:t>
       </w:r>
       <w:r>
         <w:rPr>
-          <w:color w:val="FF0000"/>
-        </w:rPr>
-        <w:t>(Added on 2/26/2025)</w:t>
+          <w:b/>
+          <w:bCs/>
+          <w:color w:val="4BACC6" w:themeColor="accent5"/>
+        </w:rPr>
+        <w:t>(</w:t>
+      </w:r>
+      <w:r>
+        <w:rPr>
+          <w:b/>
+          <w:bCs/>
+          <w:color w:val="4BACC6" w:themeColor="accent5"/>
+        </w:rPr>
+        <w:t xml:space="preserve">ADDED </w:t>
+      </w:r>
+      <w:r>
+        <w:rPr>
+          <w:b/>
+          <w:bCs/>
+          <w:color w:val="4BACC6" w:themeColor="accent5"/>
+        </w:rPr>
+        <w:t>2/26/2025)</w:t>
       </w:r>
     </w:p>
     <w:p>
@@ -4443,30 +5597,341 @@
         <w:pStyle w:val="NoSpacing"/>
         <w:jc w:val="center"/>
         <w:rPr>
+          <w:b/>
+          <w:bCs/>
+          <w:color w:val="4BACC6" w:themeColor="accent5"/>
+        </w:rPr>
+      </w:pPr>
+      <w:r>
+        <w:rPr>
           <w:i/>
           <w:iCs/>
         </w:rPr>
-      </w:pPr>
+        <w:t xml:space="preserve">Appendix </w:t>
+      </w:r>
       <w:r>
         <w:rPr>
           <w:i/>
           <w:iCs/>
         </w:rPr>
-        <w:t xml:space="preserve">Appendix F </w:t>
+        <w:t>E</w:t>
       </w:r>
       <w:r>
         <w:rPr>
           <w:i/>
           <w:iCs/>
-          <w:color w:val="FF0000"/>
-        </w:rPr>
-        <w:t>(Added on 2/26/2025)</w:t>
+        </w:rPr>
+        <w:t xml:space="preserve"> </w:t>
+      </w:r>
+      <w:r>
+        <w:rPr>
+          <w:b/>
+          <w:bCs/>
+          <w:color w:val="4BACC6" w:themeColor="accent5"/>
+        </w:rPr>
+        <w:t>(</w:t>
+      </w:r>
+      <w:r>
+        <w:rPr>
+          <w:b/>
+          <w:bCs/>
+          <w:color w:val="4BACC6" w:themeColor="accent5"/>
+        </w:rPr>
+        <w:t xml:space="preserve">ADDED </w:t>
+      </w:r>
+      <w:r>
+        <w:rPr>
+          <w:b/>
+          <w:bCs/>
+          <w:color w:val="4BACC6" w:themeColor="accent5"/>
+        </w:rPr>
+        <w:t>2/26/2025)</w:t>
       </w:r>
     </w:p>
     <w:p>
       <w:pPr>
         <w:pStyle w:val="NoSpacing"/>
-      </w:pPr>
+        <w:jc w:val="center"/>
+        <w:rPr>
+          <w:b/>
+          <w:bCs/>
+          <w:color w:val="4BACC6" w:themeColor="accent5"/>
+        </w:rPr>
+      </w:pPr>
+    </w:p>
+    <w:p>
+      <w:pPr>
+        <w:pStyle w:val="NoSpacing"/>
+        <w:jc w:val="center"/>
+        <w:rPr>
+          <w:b/>
+          <w:bCs/>
+          <w:color w:val="4BACC6" w:themeColor="accent5"/>
+        </w:rPr>
+      </w:pPr>
+      <w:r>
+        <w:rPr>
+          <w:b/>
+          <w:bCs/>
+          <w:noProof/>
+          <w:color w:val="4BACC6" w:themeColor="accent5"/>
+        </w:rPr>
+        <w:lastRenderedPageBreak/>
+        <w:drawing>
+          <wp:inline distT="0" distB="0" distL="0" distR="0" wp14:anchorId="67D263A2" wp14:editId="700A84C6">
+            <wp:extent cx="5082540" cy="4168140"/>
+            <wp:effectExtent l="0" t="0" r="3810" b="3810"/>
+            <wp:docPr id="806889348" name="Picture 3" descr="A black and silver object with a square object&#10;&#10;AI-generated content may be incorrect."/>
+            <wp:cNvGraphicFramePr>
+              <a:graphicFrameLocks xmlns:a="http://schemas.openxmlformats.org/drawingml/2006/main" noChangeAspect="1"/>
+            </wp:cNvGraphicFramePr>
+            <a:graphic xmlns:a="http://schemas.openxmlformats.org/drawingml/2006/main">
+              <a:graphicData uri="http://schemas.openxmlformats.org/drawingml/2006/picture">
+                <pic:pic xmlns:pic="http://schemas.openxmlformats.org/drawingml/2006/picture">
+                  <pic:nvPicPr>
+                    <pic:cNvPr id="806889348" name="Picture 3" descr="A black and silver object with a square object&#10;&#10;AI-generated content may be incorrect."/>
+                    <pic:cNvPicPr>
+                      <a:picLocks noChangeAspect="1" noChangeArrowheads="1"/>
+                    </pic:cNvPicPr>
+                  </pic:nvPicPr>
+                  <pic:blipFill>
+                    <a:blip r:embed="rId12">
+                      <a:extLst>
+                        <a:ext uri="{28A0092B-C50C-407E-A947-70E740481C1C}">
+                          <a14:useLocalDpi xmlns:a14="http://schemas.microsoft.com/office/drawing/2010/main" val="0"/>
+                        </a:ext>
+                      </a:extLst>
+                    </a:blip>
+                    <a:srcRect/>
+                    <a:stretch>
+                      <a:fillRect/>
+                    </a:stretch>
+                  </pic:blipFill>
+                  <pic:spPr bwMode="auto">
+                    <a:xfrm>
+                      <a:off x="0" y="0"/>
+                      <a:ext cx="5082540" cy="4168140"/>
+                    </a:xfrm>
+                    <a:prstGeom prst="rect">
+                      <a:avLst/>
+                    </a:prstGeom>
+                    <a:noFill/>
+                    <a:ln>
+                      <a:noFill/>
+                    </a:ln>
+                  </pic:spPr>
+                </pic:pic>
+              </a:graphicData>
+            </a:graphic>
+          </wp:inline>
+        </w:drawing>
+      </w:r>
+    </w:p>
+    <w:p>
+      <w:pPr>
+        <w:pStyle w:val="NoSpacing"/>
+        <w:jc w:val="center"/>
+        <w:rPr>
+          <w:b/>
+          <w:bCs/>
+          <w:i/>
+          <w:iCs/>
+          <w:color w:val="4BACC6" w:themeColor="accent5"/>
+        </w:rPr>
+      </w:pPr>
+      <w:r>
+        <w:rPr>
+          <w:i/>
+          <w:iCs/>
+        </w:rPr>
+        <w:t>Appendix</w:t>
+      </w:r>
+      <w:r>
+        <w:rPr>
+          <w:i/>
+          <w:iCs/>
+        </w:rPr>
+        <w:t xml:space="preserve"> F </w:t>
+      </w:r>
+      <w:r>
+        <w:rPr>
+          <w:b/>
+          <w:bCs/>
+          <w:i/>
+          <w:iCs/>
+          <w:color w:val="4BACC6" w:themeColor="accent5"/>
+        </w:rPr>
+        <w:t>(ADDED 3/16/2025)</w:t>
+      </w:r>
+    </w:p>
+    <w:p>
+      <w:pPr>
+        <w:pStyle w:val="NoSpacing"/>
+        <w:jc w:val="center"/>
+        <w:rPr>
+          <w:i/>
+          <w:iCs/>
+        </w:rPr>
+      </w:pPr>
+    </w:p>
+    <w:p>
+      <w:pPr>
+        <w:pStyle w:val="NoSpacing"/>
+        <w:jc w:val="center"/>
+        <w:rPr>
+          <w:b/>
+          <w:bCs/>
+          <w:color w:val="4BACC6" w:themeColor="accent5"/>
+        </w:rPr>
+      </w:pPr>
+      <w:r>
+        <w:rPr>
+          <w:b/>
+          <w:bCs/>
+          <w:noProof/>
+          <w:color w:val="4BACC6" w:themeColor="accent5"/>
+        </w:rPr>
+        <w:drawing>
+          <wp:inline distT="0" distB="0" distL="0" distR="0" wp14:anchorId="4EBF4765" wp14:editId="08A53C11">
+            <wp:extent cx="5943600" cy="2606040"/>
+            <wp:effectExtent l="0" t="0" r="0" b="3810"/>
+            <wp:docPr id="57262966" name="Picture 4"/>
+            <wp:cNvGraphicFramePr>
+              <a:graphicFrameLocks xmlns:a="http://schemas.openxmlformats.org/drawingml/2006/main" noChangeAspect="1"/>
+            </wp:cNvGraphicFramePr>
+            <a:graphic xmlns:a="http://schemas.openxmlformats.org/drawingml/2006/main">
+              <a:graphicData uri="http://schemas.openxmlformats.org/drawingml/2006/picture">
+                <pic:pic xmlns:pic="http://schemas.openxmlformats.org/drawingml/2006/picture">
+                  <pic:nvPicPr>
+                    <pic:cNvPr id="0" name="Picture 3"/>
+                    <pic:cNvPicPr>
+                      <a:picLocks noChangeAspect="1" noChangeArrowheads="1"/>
+                    </pic:cNvPicPr>
+                  </pic:nvPicPr>
+                  <pic:blipFill>
+                    <a:blip r:embed="rId13">
+                      <a:extLst>
+                        <a:ext uri="{28A0092B-C50C-407E-A947-70E740481C1C}">
+                          <a14:useLocalDpi xmlns:a14="http://schemas.microsoft.com/office/drawing/2010/main" val="0"/>
+                        </a:ext>
+                      </a:extLst>
+                    </a:blip>
+                    <a:srcRect/>
+                    <a:stretch>
+                      <a:fillRect/>
+                    </a:stretch>
+                  </pic:blipFill>
+                  <pic:spPr bwMode="auto">
+                    <a:xfrm>
+                      <a:off x="0" y="0"/>
+                      <a:ext cx="5943600" cy="2606040"/>
+                    </a:xfrm>
+                    <a:prstGeom prst="rect">
+                      <a:avLst/>
+                    </a:prstGeom>
+                    <a:noFill/>
+                    <a:ln>
+                      <a:noFill/>
+                    </a:ln>
+                  </pic:spPr>
+                </pic:pic>
+              </a:graphicData>
+            </a:graphic>
+          </wp:inline>
+        </w:drawing>
+      </w:r>
+    </w:p>
+    <w:p>
+      <w:pPr>
+        <w:pStyle w:val="NoSpacing"/>
+        <w:jc w:val="center"/>
+        <w:rPr>
+          <w:b/>
+          <w:bCs/>
+          <w:i/>
+          <w:iCs/>
+          <w:color w:val="4BACC6" w:themeColor="accent5"/>
+        </w:rPr>
+      </w:pPr>
+      <w:r>
+        <w:rPr>
+          <w:i/>
+          <w:iCs/>
+        </w:rPr>
+        <w:t>Appendix</w:t>
+      </w:r>
+      <w:r>
+        <w:rPr>
+          <w:i/>
+          <w:iCs/>
+        </w:rPr>
+        <w:t xml:space="preserve"> </w:t>
+      </w:r>
+      <w:r>
+        <w:rPr>
+          <w:i/>
+          <w:iCs/>
+        </w:rPr>
+        <w:t>G</w:t>
+      </w:r>
+      <w:r>
+        <w:rPr>
+          <w:i/>
+          <w:iCs/>
+        </w:rPr>
+        <w:t xml:space="preserve"> </w:t>
+      </w:r>
+      <w:r>
+        <w:rPr>
+          <w:b/>
+          <w:bCs/>
+          <w:i/>
+          <w:iCs/>
+          <w:color w:val="4BACC6" w:themeColor="accent5"/>
+        </w:rPr>
+        <w:t>(ADDED 3/16/2025)</w:t>
+      </w:r>
+    </w:p>
+    <w:p>
+      <w:pPr>
+        <w:pStyle w:val="NoSpacing"/>
+        <w:jc w:val="center"/>
+        <w:rPr>
+          <w:b/>
+          <w:bCs/>
+          <w:color w:val="4BACC6" w:themeColor="accent5"/>
+        </w:rPr>
+      </w:pPr>
+    </w:p>
+    <w:p>
+      <w:pPr>
+        <w:pStyle w:val="NoSpacing"/>
+      </w:pPr>
+    </w:p>
+    <w:p>
+      <w:pPr>
+        <w:pStyle w:val="NoSpacing"/>
+      </w:pPr>
+      <w:r>
+        <w:t xml:space="preserve">On top of the body </w:t>
+      </w:r>
+      <w:r>
+        <w:t>redesign,</w:t>
+      </w:r>
+      <w:r>
+        <w:t xml:space="preserve"> I found that the wheel drive system which consists of 2 gears strips rather easily so I had to redesign the wheel system. I plan on adding more info here as I get that done, and am thinking of looking into a planetary gearbox system instead. </w:t>
+      </w:r>
+      <w:r>
+        <w:rPr>
+          <w:b/>
+          <w:bCs/>
+          <w:color w:val="4BACC6" w:themeColor="accent5"/>
+        </w:rPr>
+        <w:t>(ADDED 3/15)</w:t>
+      </w:r>
+      <w:r>
+        <w:t>.</w:t>
+      </w:r>
     </w:p>
     <w:p>
       <w:pPr>
@@ -4485,6 +5950,7 @@
           <w:sz w:val="36"/>
           <w:szCs w:val="36"/>
         </w:rPr>
+        <w:lastRenderedPageBreak/>
         <w:t>Evaluation Plan</w:t>
       </w:r>
     </w:p>
@@ -4503,7 +5969,23 @@
           <w:sz w:val="24"/>
           <w:szCs w:val="24"/>
         </w:rPr>
-        <w:t xml:space="preserve">This project will go through testing and evaluation across many different levels. Each system will be broken up into modular parts and tested independently (unit tests) and in junction with other systems (integration tests). Each section of the evaluation criteria represents one system and will be tested as such. </w:t>
+        <w:t xml:space="preserve">This project will go through testing and evaluation across many different levels. Each system will be </w:t>
+      </w:r>
+      <w:r>
+        <w:rPr>
+          <w:rFonts w:ascii="Times New Roman" w:eastAsia="Times New Roman" w:hAnsi="Times New Roman" w:cs="Times New Roman"/>
+          <w:sz w:val="24"/>
+          <w:szCs w:val="24"/>
+        </w:rPr>
+        <w:t>broken</w:t>
+      </w:r>
+      <w:r>
+        <w:rPr>
+          <w:rFonts w:ascii="Times New Roman" w:eastAsia="Times New Roman" w:hAnsi="Times New Roman" w:cs="Times New Roman"/>
+          <w:sz w:val="24"/>
+          <w:szCs w:val="24"/>
+        </w:rPr>
+        <w:t xml:space="preserve"> into modular parts and tested independently (unit tests) and in junction with other systems (integration tests). Each section of the evaluation criteria represents one system and will be tested as such. </w:t>
       </w:r>
       <w:r>
         <w:rPr>
@@ -5058,61 +6540,146 @@
       <w:r>
         <w:rPr>
           <w:rFonts w:ascii="Times New Roman" w:eastAsia="Times New Roman" w:hAnsi="Times New Roman" w:cs="Times New Roman"/>
+          <w:strike/>
+          <w:color w:val="FF0000"/>
           <w:sz w:val="24"/>
           <w:szCs w:val="24"/>
         </w:rPr>
         <w:t>Appendix D: LLM Object Detection Block diagram– LLMOBJBd.png</w:t>
       </w:r>
-    </w:p>
-    <w:p>
-      <w:pPr>
-        <w:rPr>
-          <w:rFonts w:ascii="Times New Roman" w:eastAsia="Times New Roman" w:hAnsi="Times New Roman" w:cs="Times New Roman"/>
-          <w:sz w:val="24"/>
-          <w:szCs w:val="24"/>
-        </w:rPr>
-      </w:pPr>
-      <w:r>
-        <w:rPr>
-          <w:rFonts w:ascii="Times New Roman" w:eastAsia="Times New Roman" w:hAnsi="Times New Roman" w:cs="Times New Roman"/>
-          <w:sz w:val="24"/>
-          <w:szCs w:val="24"/>
-        </w:rPr>
-        <w:t>Appendix E: Rover Body Support CAD model – RoverBodySupportCAD.png</w:t>
-      </w:r>
-    </w:p>
-    <w:p>
-      <w:pPr>
-        <w:rPr>
-          <w:rFonts w:ascii="Times New Roman" w:eastAsia="Times New Roman" w:hAnsi="Times New Roman" w:cs="Times New Roman"/>
-          <w:sz w:val="24"/>
-          <w:szCs w:val="24"/>
-        </w:rPr>
-      </w:pPr>
-      <w:r>
-        <w:rPr>
-          <w:rFonts w:ascii="Times New Roman" w:eastAsia="Times New Roman" w:hAnsi="Times New Roman" w:cs="Times New Roman"/>
-          <w:sz w:val="24"/>
-          <w:szCs w:val="24"/>
-        </w:rPr>
-        <w:t>Appendix F: RoverBodyV3 CAD model – RoverBodyV3CAD.png</w:t>
-      </w:r>
-    </w:p>
-    <w:p>
-      <w:pPr>
-        <w:rPr>
-          <w:rFonts w:ascii="Times New Roman" w:eastAsia="Times New Roman" w:hAnsi="Times New Roman" w:cs="Times New Roman"/>
-          <w:sz w:val="24"/>
-          <w:szCs w:val="24"/>
-        </w:rPr>
-      </w:pPr>
+      <w:r>
+        <w:rPr>
+          <w:rFonts w:ascii="Times New Roman" w:eastAsia="Times New Roman" w:hAnsi="Times New Roman" w:cs="Times New Roman"/>
+          <w:color w:val="FF0000"/>
+          <w:sz w:val="24"/>
+          <w:szCs w:val="24"/>
+        </w:rPr>
+        <w:t xml:space="preserve"> (REMOVED 3/15 due to pivot)</w:t>
+      </w:r>
+    </w:p>
+    <w:p>
+      <w:pPr>
+        <w:rPr>
+          <w:rFonts w:ascii="Times New Roman" w:eastAsia="Times New Roman" w:hAnsi="Times New Roman" w:cs="Times New Roman"/>
+          <w:sz w:val="24"/>
+          <w:szCs w:val="24"/>
+        </w:rPr>
+      </w:pPr>
+      <w:r>
+        <w:rPr>
+          <w:rFonts w:ascii="Times New Roman" w:eastAsia="Times New Roman" w:hAnsi="Times New Roman" w:cs="Times New Roman"/>
+          <w:sz w:val="24"/>
+          <w:szCs w:val="24"/>
+        </w:rPr>
+        <w:t xml:space="preserve">Appendix </w:t>
+      </w:r>
+      <w:r>
+        <w:rPr>
+          <w:rFonts w:ascii="Times New Roman" w:eastAsia="Times New Roman" w:hAnsi="Times New Roman" w:cs="Times New Roman"/>
+          <w:sz w:val="24"/>
+          <w:szCs w:val="24"/>
+        </w:rPr>
+        <w:t>D</w:t>
+      </w:r>
+      <w:r>
+        <w:rPr>
+          <w:rFonts w:ascii="Times New Roman" w:eastAsia="Times New Roman" w:hAnsi="Times New Roman" w:cs="Times New Roman"/>
+          <w:sz w:val="24"/>
+          <w:szCs w:val="24"/>
+        </w:rPr>
+        <w:t>: Rover Body Support CAD model – RoverBodySupportCAD.png</w:t>
+      </w:r>
+    </w:p>
+    <w:p>
+      <w:pPr>
+        <w:rPr>
+          <w:rFonts w:ascii="Times New Roman" w:eastAsia="Times New Roman" w:hAnsi="Times New Roman" w:cs="Times New Roman"/>
+          <w:sz w:val="24"/>
+          <w:szCs w:val="24"/>
+        </w:rPr>
+      </w:pPr>
+      <w:r>
+        <w:rPr>
+          <w:rFonts w:ascii="Times New Roman" w:eastAsia="Times New Roman" w:hAnsi="Times New Roman" w:cs="Times New Roman"/>
+          <w:sz w:val="24"/>
+          <w:szCs w:val="24"/>
+        </w:rPr>
+        <w:lastRenderedPageBreak/>
+        <w:t xml:space="preserve">Appendix </w:t>
+      </w:r>
+      <w:r>
+        <w:rPr>
+          <w:rFonts w:ascii="Times New Roman" w:eastAsia="Times New Roman" w:hAnsi="Times New Roman" w:cs="Times New Roman"/>
+          <w:sz w:val="24"/>
+          <w:szCs w:val="24"/>
+        </w:rPr>
+        <w:t>E</w:t>
+      </w:r>
+      <w:r>
+        <w:rPr>
+          <w:rFonts w:ascii="Times New Roman" w:eastAsia="Times New Roman" w:hAnsi="Times New Roman" w:cs="Times New Roman"/>
+          <w:sz w:val="24"/>
+          <w:szCs w:val="24"/>
+        </w:rPr>
+        <w:t>: RoverBodyV3 CAD model – RoverBodyV3CAD.png</w:t>
+      </w:r>
+    </w:p>
+    <w:p>
+      <w:pPr>
+        <w:rPr>
+          <w:rFonts w:ascii="Times New Roman" w:eastAsia="Times New Roman" w:hAnsi="Times New Roman" w:cs="Times New Roman"/>
+          <w:sz w:val="24"/>
+          <w:szCs w:val="24"/>
+        </w:rPr>
+      </w:pPr>
+      <w:r>
+        <w:rPr>
+          <w:rFonts w:ascii="Times New Roman" w:eastAsia="Times New Roman" w:hAnsi="Times New Roman" w:cs="Times New Roman"/>
+          <w:sz w:val="24"/>
+          <w:szCs w:val="24"/>
+        </w:rPr>
+        <w:t xml:space="preserve">Appendix F: </w:t>
+      </w:r>
+      <w:r>
+        <w:rPr>
+          <w:rFonts w:ascii="Times New Roman" w:eastAsia="Times New Roman" w:hAnsi="Times New Roman" w:cs="Times New Roman"/>
+          <w:sz w:val="24"/>
+          <w:szCs w:val="24"/>
+        </w:rPr>
+        <w:t>Hopper Trailer V1 CAD model – TrailerModelV1.png</w:t>
+      </w:r>
+    </w:p>
+    <w:p>
+      <w:pPr>
+        <w:rPr>
+          <w:rFonts w:ascii="Times New Roman" w:eastAsia="Times New Roman" w:hAnsi="Times New Roman" w:cs="Times New Roman"/>
+          <w:sz w:val="24"/>
+          <w:szCs w:val="24"/>
+        </w:rPr>
+      </w:pPr>
+      <w:r>
+        <w:rPr>
+          <w:rFonts w:ascii="Times New Roman" w:eastAsia="Times New Roman" w:hAnsi="Times New Roman" w:cs="Times New Roman"/>
+          <w:sz w:val="24"/>
+          <w:szCs w:val="24"/>
+        </w:rPr>
+        <w:t>Appendix G:</w:t>
+      </w:r>
+      <w:r>
+        <w:rPr>
+          <w:rFonts w:ascii="Times New Roman" w:eastAsia="Times New Roman" w:hAnsi="Times New Roman" w:cs="Times New Roman"/>
+          <w:sz w:val="24"/>
+          <w:szCs w:val="24"/>
+        </w:rPr>
+        <w:t xml:space="preserve"> Hopper Trailer Final CAD model – HopperTrailerSide.png</w:t>
+      </w:r>
     </w:p>
     <w:p>
       <w:pPr>
         <w:pStyle w:val="Heading2"/>
       </w:pPr>
-      <w:bookmarkStart w:id="5" w:name="_tlai8eqlrjxf" w:colFirst="0" w:colLast="0"/>
-      <w:bookmarkEnd w:id="5"/>
+      <w:bookmarkStart w:id="6" w:name="_tlai8eqlrjxf" w:colFirst="0" w:colLast="0"/>
+      <w:bookmarkEnd w:id="6"/>
       <w:r>
         <w:t>Appendix C: References</w:t>
       </w:r>
@@ -5152,7 +6719,7 @@
         </w:rPr>
         <w:t xml:space="preserve">. Charles Dowding. Retrieved February 18, 2025, from </w:t>
       </w:r>
-      <w:hyperlink r:id="rId12" w:tgtFrame="_new" w:history="1">
+      <w:hyperlink r:id="rId14" w:tgtFrame="_new" w:history="1">
         <w:r>
           <w:rPr>
             <w:rStyle w:val="Hyperlink"/>
@@ -5173,43 +6740,15 @@
           <w:szCs w:val="24"/>
         </w:rPr>
       </w:pPr>
-      <w:proofErr w:type="spellStart"/>
       <w:r>
         <w:rPr>
           <w:rFonts w:ascii="Times New Roman" w:hAnsi="Times New Roman" w:cs="Times New Roman"/>
           <w:sz w:val="24"/>
           <w:szCs w:val="24"/>
         </w:rPr>
-        <w:t>FarmBot</w:t>
-      </w:r>
-      <w:proofErr w:type="spellEnd"/>
-      <w:r>
-        <w:rPr>
-          <w:rFonts w:ascii="Times New Roman" w:hAnsi="Times New Roman" w:cs="Times New Roman"/>
-          <w:sz w:val="24"/>
-          <w:szCs w:val="24"/>
-        </w:rPr>
-        <w:t xml:space="preserve">. (n.d.). </w:t>
-      </w:r>
-      <w:proofErr w:type="spellStart"/>
-      <w:r>
-        <w:rPr>
-          <w:rFonts w:ascii="Times New Roman" w:hAnsi="Times New Roman" w:cs="Times New Roman"/>
-          <w:sz w:val="24"/>
-          <w:szCs w:val="24"/>
-        </w:rPr>
-        <w:t>FarmBot</w:t>
-      </w:r>
-      <w:proofErr w:type="spellEnd"/>
-      <w:r>
-        <w:rPr>
-          <w:rFonts w:ascii="Times New Roman" w:hAnsi="Times New Roman" w:cs="Times New Roman"/>
-          <w:sz w:val="24"/>
-          <w:szCs w:val="24"/>
-        </w:rPr>
-        <w:t xml:space="preserve">: Open-source CNC farming. Retrieved February 18, 2025, from </w:t>
-      </w:r>
-      <w:hyperlink r:id="rId13" w:history="1">
+        <w:t xml:space="preserve">FarmBot. (n.d.). FarmBot: Open-source CNC farming. Retrieved February 18, 2025, from </w:t>
+      </w:r>
+      <w:hyperlink r:id="rId15" w:history="1">
         <w:r>
           <w:rPr>
             <w:rStyle w:val="Hyperlink"/>
@@ -5225,23 +6764,13 @@
       <w:pPr>
         <w:ind w:left="720" w:hanging="720"/>
       </w:pPr>
-      <w:proofErr w:type="spellStart"/>
       <w:r>
         <w:rPr>
           <w:rFonts w:ascii="Times New Roman" w:hAnsi="Times New Roman" w:cs="Times New Roman"/>
           <w:sz w:val="24"/>
           <w:szCs w:val="24"/>
         </w:rPr>
-        <w:t>Instructables</w:t>
-      </w:r>
-      <w:proofErr w:type="spellEnd"/>
-      <w:r>
-        <w:rPr>
-          <w:rFonts w:ascii="Times New Roman" w:hAnsi="Times New Roman" w:cs="Times New Roman"/>
-          <w:sz w:val="24"/>
-          <w:szCs w:val="24"/>
-        </w:rPr>
-        <w:t xml:space="preserve">. (n.d.). </w:t>
+        <w:t xml:space="preserve">Instructables. (n.d.). </w:t>
       </w:r>
       <w:r>
         <w:rPr>
@@ -5259,27 +6788,9 @@
           <w:sz w:val="24"/>
           <w:szCs w:val="24"/>
         </w:rPr>
-        <w:t xml:space="preserve">. </w:t>
-      </w:r>
-      <w:proofErr w:type="spellStart"/>
-      <w:r>
-        <w:rPr>
-          <w:rFonts w:ascii="Times New Roman" w:hAnsi="Times New Roman" w:cs="Times New Roman"/>
-          <w:sz w:val="24"/>
-          <w:szCs w:val="24"/>
-        </w:rPr>
-        <w:t>Instructables</w:t>
-      </w:r>
-      <w:proofErr w:type="spellEnd"/>
-      <w:r>
-        <w:rPr>
-          <w:rFonts w:ascii="Times New Roman" w:hAnsi="Times New Roman" w:cs="Times New Roman"/>
-          <w:sz w:val="24"/>
-          <w:szCs w:val="24"/>
-        </w:rPr>
-        <w:t xml:space="preserve">. Retrieved [date], from </w:t>
-      </w:r>
-      <w:hyperlink r:id="rId14" w:tgtFrame="_new" w:history="1">
+        <w:t xml:space="preserve">. Instructables. Retrieved [date], from </w:t>
+      </w:r>
+      <w:hyperlink r:id="rId16" w:tgtFrame="_new" w:history="1">
         <w:r>
           <w:rPr>
             <w:rStyle w:val="Hyperlink"/>
@@ -5306,27 +6817,9 @@
           <w:sz w:val="24"/>
           <w:szCs w:val="24"/>
         </w:rPr>
-        <w:t xml:space="preserve">Printables. (n.d.). XIAO Sense Case - </w:t>
-      </w:r>
-      <w:proofErr w:type="spellStart"/>
-      <w:r>
-        <w:rPr>
-          <w:rFonts w:ascii="Times New Roman" w:hAnsi="Times New Roman" w:cs="Times New Roman"/>
-          <w:sz w:val="24"/>
-          <w:szCs w:val="24"/>
-        </w:rPr>
-        <w:t>Seeed</w:t>
-      </w:r>
-      <w:proofErr w:type="spellEnd"/>
-      <w:r>
-        <w:rPr>
-          <w:rFonts w:ascii="Times New Roman" w:hAnsi="Times New Roman" w:cs="Times New Roman"/>
-          <w:sz w:val="24"/>
-          <w:szCs w:val="24"/>
-        </w:rPr>
-        <w:t xml:space="preserve"> Studio XIAO ESP32S3 Sense Case. Retrieved March 4, 2025, from </w:t>
-      </w:r>
-      <w:hyperlink r:id="rId15" w:history="1">
+        <w:t xml:space="preserve">Printables. (n.d.). XIAO Sense Case - Seeed Studio XIAO ESP32S3 Sense Case. Retrieved March 4, 2025, from </w:t>
+      </w:r>
+      <w:hyperlink r:id="rId17" w:history="1">
         <w:r>
           <w:rPr>
             <w:rStyle w:val="Hyperlink"/>
@@ -5361,10 +6854,9 @@
           <w:sz w:val="24"/>
           <w:szCs w:val="24"/>
         </w:rPr>
-        <w:lastRenderedPageBreak/>
         <w:t xml:space="preserve">Raven Industries. (n.d.). Case IH Trident 5550 applicator with Raven autonomy. Retrieved February 18, 2025, from </w:t>
       </w:r>
-      <w:hyperlink r:id="rId16" w:history="1">
+      <w:hyperlink r:id="rId18" w:history="1">
         <w:r>
           <w:rPr>
             <w:rStyle w:val="Hyperlink"/>
@@ -5393,7 +6885,7 @@
         </w:rPr>
         <w:t xml:space="preserve">Shekhar, C., &amp; Singh, S. (2017). Design of rocker-bogie mechanism. International Journal of Innovative Science and Research Technology. Retrieved from </w:t>
       </w:r>
-      <w:hyperlink r:id="rId17" w:history="1">
+      <w:hyperlink r:id="rId19" w:history="1">
         <w:r>
           <w:rPr>
             <w:rStyle w:val="Hyperlink"/>
@@ -5414,23 +6906,13 @@
           <w:szCs w:val="24"/>
         </w:rPr>
       </w:pPr>
-      <w:proofErr w:type="spellStart"/>
       <w:r>
         <w:rPr>
           <w:rFonts w:ascii="Times New Roman" w:hAnsi="Times New Roman" w:cs="Times New Roman"/>
           <w:sz w:val="24"/>
           <w:szCs w:val="24"/>
         </w:rPr>
-        <w:t>techiesms</w:t>
-      </w:r>
-      <w:proofErr w:type="spellEnd"/>
-      <w:r>
-        <w:rPr>
-          <w:rFonts w:ascii="Times New Roman" w:hAnsi="Times New Roman" w:cs="Times New Roman"/>
-          <w:sz w:val="24"/>
-          <w:szCs w:val="24"/>
-        </w:rPr>
-        <w:t>. (2025, January 20). AI vision project using ESP32Cam &amp; GPT-4o [Video]. YouTube. https://youtu.be/gZp9B_IiKCo</w:t>
+        <w:t>techiesms. (2025, January 20). AI vision project using ESP32Cam &amp; GPT-4o [Video]. YouTube. https://youtu.be/gZp9B_IiKCo</w:t>
       </w:r>
     </w:p>
     <w:sectPr>
@@ -7878,6 +9360,7 @@
   <w:style w:type="character" w:default="1" w:styleId="DefaultParagraphFont">
     <w:name w:val="Default Paragraph Font"/>
     <w:uiPriority w:val="1"/>
+    <w:semiHidden/>
     <w:unhideWhenUsed/>
   </w:style>
   <w:style w:type="table" w:default="1" w:styleId="TableNormal">

</xml_diff>